<commit_message>
Публикация прототипа из Flumos1/MLO@b2b4c5c2793b8392a32e8f97cbb0561f7ba2c0e6
</commit_message>
<xml_diff>
--- a/docs/08_Combat_models_and_novelty_EN.docx
+++ b/docs/08_Combat_models_and_novelty_EN.docx
@@ -466,14 +466,15 @@
         </w:p>
         <w:p>
           <w:pPr>
-            <w:pStyle w:val="TOC1"/>
+            <w:pStyle w:val="TOC2"/>
             <w:tabs>
               <w:tab w:val="right" w:pos="9638" w:leader="dot"/>
             </w:tabs>
+            <w:ind w:left="220"/>
           </w:pPr>
           <w:hyperlink w:history="1" w:anchor="_Toc203">
             <w:r>
-              <w:t xml:space="preserve">5. Analysis of common claims</w:t>
+              <w:t xml:space="preserve">4.4. Potential × effectiveness: what explains the outcome (branch A)</w:t>
             </w:r>
             <w:r>
               <w:tab/>
@@ -481,28 +482,6 @@
             <w:r>
               <w:fldChar w:fldCharType="begin" w:dirty="true"/>
               <w:instrText xml:space="preserve">PAGEREF _Toc203 \h</w:instrText>
-              <w:fldChar w:fldCharType="separate"/>
-              <w:fldChar w:fldCharType="end"/>
-            </w:r>
-          </w:hyperlink>
-        </w:p>
-        <w:p>
-          <w:pPr>
-            <w:pStyle w:val="TOC1"/>
-            <w:tabs>
-              <w:tab w:val="right" w:pos="9638" w:leader="dot"/>
-            </w:tabs>
-          </w:pPr>
-          <w:hyperlink w:history="1" w:anchor="_Toc204">
-            <w:r>
-              <w:t xml:space="preserve">6. Scientific novelty</w:t>
-            </w:r>
-            <w:r>
-              <w:tab/>
-            </w:r>
-            <w:r>
-              <w:fldChar w:fldCharType="begin" w:dirty="true"/>
-              <w:instrText xml:space="preserve">PAGEREF _Toc204 \h</w:instrText>
               <w:fldChar w:fldCharType="separate"/>
               <w:fldChar w:fldCharType="end"/>
             </w:r>
@@ -516,9 +495,31 @@
             </w:tabs>
             <w:ind w:left="220"/>
           </w:pPr>
+          <w:hyperlink w:history="1" w:anchor="_Toc204">
+            <w:r>
+              <w:t xml:space="preserve">4.5. Order of the index and the balance of forces (branch G)</w:t>
+            </w:r>
+            <w:r>
+              <w:tab/>
+            </w:r>
+            <w:r>
+              <w:fldChar w:fldCharType="begin" w:dirty="true"/>
+              <w:instrText xml:space="preserve">PAGEREF _Toc204 \h</w:instrText>
+              <w:fldChar w:fldCharType="separate"/>
+              <w:fldChar w:fldCharType="end"/>
+            </w:r>
+          </w:hyperlink>
+        </w:p>
+        <w:p>
+          <w:pPr>
+            <w:pStyle w:val="TOC1"/>
+            <w:tabs>
+              <w:tab w:val="right" w:pos="9638" w:leader="dot"/>
+            </w:tabs>
+          </w:pPr>
           <w:hyperlink w:history="1" w:anchor="_Toc205">
             <w:r>
-              <w:t xml:space="preserve">6.1. Not new</w:t>
+              <w:t xml:space="preserve">5. Analysis of common claims</w:t>
             </w:r>
             <w:r>
               <w:tab/>
@@ -533,15 +534,14 @@
         </w:p>
         <w:p>
           <w:pPr>
-            <w:pStyle w:val="TOC2"/>
+            <w:pStyle w:val="TOC1"/>
             <w:tabs>
               <w:tab w:val="right" w:pos="9638" w:leader="dot"/>
             </w:tabs>
-            <w:ind w:left="220"/>
           </w:pPr>
           <w:hyperlink w:history="1" w:anchor="_Toc206">
             <w:r>
-              <w:t xml:space="preserve">6.2. Possibly new (priority must be confirmed by a literature review)</w:t>
+              <w:t xml:space="preserve">6. Scientific novelty</w:t>
             </w:r>
             <w:r>
               <w:tab/>
@@ -564,7 +564,7 @@
           </w:pPr>
           <w:hyperlink w:history="1" w:anchor="_Toc207">
             <w:r>
-              <w:t xml:space="preserve">6.3. Where the gap is</w:t>
+              <w:t xml:space="preserve">6.1. Not new</w:t>
             </w:r>
             <w:r>
               <w:tab/>
@@ -579,14 +579,15 @@
         </w:p>
         <w:p>
           <w:pPr>
-            <w:pStyle w:val="TOC1"/>
+            <w:pStyle w:val="TOC2"/>
             <w:tabs>
               <w:tab w:val="right" w:pos="9638" w:leader="dot"/>
             </w:tabs>
+            <w:ind w:left="220"/>
           </w:pPr>
           <w:hyperlink w:history="1" w:anchor="_Toc208">
             <w:r>
-              <w:t xml:space="preserve">7. Competitor: TENET Intelligence MCI</w:t>
+              <w:t xml:space="preserve">6.2. Possibly new (priority must be confirmed by a literature review)</w:t>
             </w:r>
             <w:r>
               <w:tab/>
@@ -601,14 +602,15 @@
         </w:p>
         <w:p>
           <w:pPr>
-            <w:pStyle w:val="TOC1"/>
+            <w:pStyle w:val="TOC2"/>
             <w:tabs>
               <w:tab w:val="right" w:pos="9638" w:leader="dot"/>
             </w:tabs>
+            <w:ind w:left="220"/>
           </w:pPr>
           <w:hyperlink w:history="1" w:anchor="_Toc209">
             <w:r>
-              <w:t xml:space="preserve">8. Plan</w:t>
+              <w:t xml:space="preserve">6.3. Where the gap is</w:t>
             </w:r>
             <w:r>
               <w:tab/>
@@ -630,7 +632,7 @@
           </w:pPr>
           <w:hyperlink w:history="1" w:anchor="_Toc210">
             <w:r>
-              <w:t xml:space="preserve">References</w:t>
+              <w:t xml:space="preserve">7. Competitor: TENET Intelligence MCI</w:t>
             </w:r>
             <w:r>
               <w:tab/>
@@ -638,6 +640,50 @@
             <w:r>
               <w:fldChar w:fldCharType="begin" w:dirty="true"/>
               <w:instrText xml:space="preserve">PAGEREF _Toc210 \h</w:instrText>
+              <w:fldChar w:fldCharType="separate"/>
+              <w:fldChar w:fldCharType="end"/>
+            </w:r>
+          </w:hyperlink>
+        </w:p>
+        <w:p>
+          <w:pPr>
+            <w:pStyle w:val="TOC1"/>
+            <w:tabs>
+              <w:tab w:val="right" w:pos="9638" w:leader="dot"/>
+            </w:tabs>
+          </w:pPr>
+          <w:hyperlink w:history="1" w:anchor="_Toc211">
+            <w:r>
+              <w:t xml:space="preserve">8. Plan</w:t>
+            </w:r>
+            <w:r>
+              <w:tab/>
+            </w:r>
+            <w:r>
+              <w:fldChar w:fldCharType="begin" w:dirty="true"/>
+              <w:instrText xml:space="preserve">PAGEREF _Toc211 \h</w:instrText>
+              <w:fldChar w:fldCharType="separate"/>
+              <w:fldChar w:fldCharType="end"/>
+            </w:r>
+          </w:hyperlink>
+        </w:p>
+        <w:p>
+          <w:pPr>
+            <w:pStyle w:val="TOC1"/>
+            <w:tabs>
+              <w:tab w:val="right" w:pos="9638" w:leader="dot"/>
+            </w:tabs>
+          </w:pPr>
+          <w:hyperlink w:history="1" w:anchor="_Toc212">
+            <w:r>
+              <w:t xml:space="preserve">References</w:t>
+            </w:r>
+            <w:r>
+              <w:tab/>
+            </w:r>
+            <w:r>
+              <w:fldChar w:fldCharType="begin" w:dirty="true"/>
+              <w:instrText xml:space="preserve">PAGEREF _Toc212 \h</w:instrText>
               <w:fldChar w:fldCharType="separate"/>
               <w:fldChar w:fldCharType="end"/>
             </w:r>
@@ -771,6 +817,26 @@
       </w:r>
       <w:r>
         <w:t xml:space="preserve"> The median threshold is 16% losses [14%; 18%]; one step of morale raises the threshold by a factor of 1.29. In the combat model the threshold has become a scenario parameter: 16% for a battle, 40% for a campaign.</w:t>
+      </w:r>
+    </w:p>
+    <w:p>
+      <w:pPr>
+        <w:pStyle w:val="ListParagraph"/>
+        <w:numPr>
+          <w:ilvl w:val="0"/>
+          <w:numId w:val="2"/>
+        </w:numPr>
+        <w:spacing w:after="60" w:line="276"/>
+      </w:pPr>
+      <w:r>
+        <w:rPr>
+          <w:b/>
+          <w:bCs/>
+        </w:rPr>
+        <w:t xml:space="preserve">Potential versus effectiveness.</w:t>
+      </w:r>
+      <w:r>
+        <w:t xml:space="preserve"> Out of sample, numbers add +0.009 per battle to predicting the outcome of a battle, while the seven effectiveness factors add +0.180 (95% of the total gain). Moreover, across the 10 wars of 2018–2025 the order of the index not only fails to predict whether the advantage will suffice (AUC 0.13) but runs opposite to the outcome: the index measures resources, not effectiveness.</w:t>
       </w:r>
     </w:p>
     <w:p>
@@ -7980,14 +8046,2467 @@
     </w:p>
     <w:p>
       <w:pPr>
+        <w:pStyle w:val="Heading2"/>
+      </w:pPr>
+      <w:bookmarkStart w:name="_Toc203" w:id="203"/>
+      <w:r>
+        <w:t xml:space="preserve">4.4. Potential × effectiveness: what explains the outcome (branch A)</w:t>
+      </w:r>
+      <w:bookmarkEnd w:id="203"/>
+    </w:p>
+    <w:p>
+      <w:pPr>
+        <w:spacing w:after="120" w:line="288"/>
+        <w:jc w:val="both"/>
+      </w:pPr>
+      <w:r>
+        <w:t xml:space="preserve">Hypothesis: the strength of a side is the product of its potential (numbers) and its effectiveness. The test is cross-validation (5 folds × 40 repeats) on 343 battles with no gaps in the factors; the measure is the out-of-sample logarithmic score per battle (higher is better); the rule of protocol ddf406d was fixed before the calculation: the gain from the factors over numbers must be at least 0.10 and the confidence interval must lie above zero.</w:t>
+      </w:r>
+    </w:p>
+    <w:tbl>
+      <w:tblPr>
+        <w:tblW w:type="dxa" w:w="9638"/>
+        <w:tblBorders>
+          <w:top w:val="single" w:color="auto" w:sz="4"/>
+          <w:left w:val="single" w:color="auto" w:sz="4"/>
+          <w:bottom w:val="single" w:color="auto" w:sz="4"/>
+          <w:right w:val="single" w:color="auto" w:sz="4"/>
+          <w:insideH w:val="single" w:color="auto" w:sz="4"/>
+          <w:insideV w:val="single" w:color="auto" w:sz="4"/>
+        </w:tblBorders>
+      </w:tblPr>
+      <w:tblGrid>
+        <w:gridCol w:w="963"/>
+        <w:gridCol w:w="4433"/>
+        <w:gridCol w:w="1927"/>
+        <w:gridCol w:w="2315"/>
+      </w:tblGrid>
+      <w:tr>
+        <w:trPr>
+          <w:tblHeader/>
+        </w:trPr>
+        <w:tc>
+          <w:tcPr>
+            <w:tcW w:type="dxa" w:w="963"/>
+            <w:tcBorders>
+              <w:top w:val="single" w:color="C9CEC5" w:sz="4"/>
+              <w:left w:val="single" w:color="C9CEC5" w:sz="4"/>
+              <w:bottom w:val="single" w:color="C9CEC5" w:sz="4"/>
+              <w:right w:val="single" w:color="C9CEC5" w:sz="4"/>
+            </w:tcBorders>
+            <w:shd w:fill="1F2A24" w:color="auto" w:val="clear"/>
+            <w:tcMar>
+              <w:top w:type="dxa" w:w="60"/>
+              <w:left w:type="dxa" w:w="90"/>
+              <w:bottom w:type="dxa" w:w="60"/>
+              <w:right w:type="dxa" w:w="90"/>
+            </w:tcMar>
+            <w:vAlign w:val="top"/>
+          </w:tcPr>
+          <w:p>
+            <w:pPr>
+              <w:spacing w:after="20"/>
+              <w:jc w:val="left"/>
+            </w:pPr>
+            <w:r>
+              <w:rPr>
+                <w:b/>
+                <w:bCs/>
+                <w:color w:val="FFFFFF"/>
+                <w:sz w:val="16"/>
+                <w:szCs w:val="16"/>
+              </w:rPr>
+              <w:t xml:space="preserve">Model</w:t>
+            </w:r>
+          </w:p>
+        </w:tc>
+        <w:tc>
+          <w:tcPr>
+            <w:tcW w:type="dxa" w:w="4433"/>
+            <w:tcBorders>
+              <w:top w:val="single" w:color="C9CEC5" w:sz="4"/>
+              <w:left w:val="single" w:color="C9CEC5" w:sz="4"/>
+              <w:bottom w:val="single" w:color="C9CEC5" w:sz="4"/>
+              <w:right w:val="single" w:color="C9CEC5" w:sz="4"/>
+            </w:tcBorders>
+            <w:shd w:fill="1F2A24" w:color="auto" w:val="clear"/>
+            <w:tcMar>
+              <w:top w:type="dxa" w:w="60"/>
+              <w:left w:type="dxa" w:w="90"/>
+              <w:bottom w:type="dxa" w:w="60"/>
+              <w:right w:type="dxa" w:w="90"/>
+            </w:tcMar>
+            <w:vAlign w:val="top"/>
+          </w:tcPr>
+          <w:p>
+            <w:pPr>
+              <w:spacing w:after="20"/>
+              <w:jc w:val="left"/>
+            </w:pPr>
+            <w:r>
+              <w:rPr>
+                <w:b/>
+                <w:bCs/>
+                <w:color w:val="FFFFFF"/>
+                <w:sz w:val="16"/>
+                <w:szCs w:val="16"/>
+              </w:rPr>
+              <w:t xml:space="preserve">Features</w:t>
+            </w:r>
+          </w:p>
+        </w:tc>
+        <w:tc>
+          <w:tcPr>
+            <w:tcW w:type="dxa" w:w="1927"/>
+            <w:tcBorders>
+              <w:top w:val="single" w:color="C9CEC5" w:sz="4"/>
+              <w:left w:val="single" w:color="C9CEC5" w:sz="4"/>
+              <w:bottom w:val="single" w:color="C9CEC5" w:sz="4"/>
+              <w:right w:val="single" w:color="C9CEC5" w:sz="4"/>
+            </w:tcBorders>
+            <w:shd w:fill="1F2A24" w:color="auto" w:val="clear"/>
+            <w:tcMar>
+              <w:top w:type="dxa" w:w="60"/>
+              <w:left w:type="dxa" w:w="90"/>
+              <w:bottom w:type="dxa" w:w="60"/>
+              <w:right w:type="dxa" w:w="90"/>
+            </w:tcMar>
+            <w:vAlign w:val="top"/>
+          </w:tcPr>
+          <w:p>
+            <w:pPr>
+              <w:spacing w:after="20"/>
+              <w:jc w:val="left"/>
+            </w:pPr>
+            <w:r>
+              <w:rPr>
+                <w:b/>
+                <w:bCs/>
+                <w:color w:val="FFFFFF"/>
+                <w:sz w:val="16"/>
+                <w:szCs w:val="16"/>
+              </w:rPr>
+              <w:t xml:space="preserve">Out-of-sample score</w:t>
+            </w:r>
+          </w:p>
+        </w:tc>
+        <w:tc>
+          <w:tcPr>
+            <w:tcW w:type="dxa" w:w="2315"/>
+            <w:tcBorders>
+              <w:top w:val="single" w:color="C9CEC5" w:sz="4"/>
+              <w:left w:val="single" w:color="C9CEC5" w:sz="4"/>
+              <w:bottom w:val="single" w:color="C9CEC5" w:sz="4"/>
+              <w:right w:val="single" w:color="C9CEC5" w:sz="4"/>
+            </w:tcBorders>
+            <w:shd w:fill="1F2A24" w:color="auto" w:val="clear"/>
+            <w:tcMar>
+              <w:top w:type="dxa" w:w="60"/>
+              <w:left w:type="dxa" w:w="90"/>
+              <w:bottom w:type="dxa" w:w="60"/>
+              <w:right w:type="dxa" w:w="90"/>
+            </w:tcMar>
+            <w:vAlign w:val="top"/>
+          </w:tcPr>
+          <w:p>
+            <w:pPr>
+              <w:spacing w:after="20"/>
+              <w:jc w:val="left"/>
+            </w:pPr>
+            <w:r>
+              <w:rPr>
+                <w:b/>
+                <w:bCs/>
+                <w:color w:val="FFFFFF"/>
+                <w:sz w:val="16"/>
+                <w:szCs w:val="16"/>
+              </w:rPr>
+              <w:t xml:space="preserve">Gain over the previous model</w:t>
+            </w:r>
+          </w:p>
+        </w:tc>
+      </w:tr>
+      <w:tr>
+        <w:trPr>
+          <w:cantSplit/>
+        </w:trPr>
+        <w:tc>
+          <w:tcPr>
+            <w:tcW w:type="dxa" w:w="963"/>
+            <w:tcBorders>
+              <w:top w:val="single" w:color="C9CEC5" w:sz="4"/>
+              <w:left w:val="single" w:color="C9CEC5" w:sz="4"/>
+              <w:bottom w:val="single" w:color="C9CEC5" w:sz="4"/>
+              <w:right w:val="single" w:color="C9CEC5" w:sz="4"/>
+            </w:tcBorders>
+            <w:tcMar>
+              <w:top w:type="dxa" w:w="60"/>
+              <w:left w:type="dxa" w:w="90"/>
+              <w:bottom w:type="dxa" w:w="60"/>
+              <w:right w:type="dxa" w:w="90"/>
+            </w:tcMar>
+            <w:vAlign w:val="top"/>
+          </w:tcPr>
+          <w:p>
+            <w:pPr>
+              <w:spacing w:after="20"/>
+              <w:jc w:val="left"/>
+            </w:pPr>
+            <w:r>
+              <w:rPr>
+                <w:b w:val="false"/>
+                <w:bCs w:val="false"/>
+                <w:color w:val="1A1F1B"/>
+                <w:sz w:val="16"/>
+                <w:szCs w:val="16"/>
+              </w:rPr>
+              <w:t xml:space="preserve">A0</w:t>
+            </w:r>
+          </w:p>
+        </w:tc>
+        <w:tc>
+          <w:tcPr>
+            <w:tcW w:type="dxa" w:w="4433"/>
+            <w:tcBorders>
+              <w:top w:val="single" w:color="C9CEC5" w:sz="4"/>
+              <w:left w:val="single" w:color="C9CEC5" w:sz="4"/>
+              <w:bottom w:val="single" w:color="C9CEC5" w:sz="4"/>
+              <w:right w:val="single" w:color="C9CEC5" w:sz="4"/>
+            </w:tcBorders>
+            <w:tcMar>
+              <w:top w:type="dxa" w:w="60"/>
+              <w:left w:type="dxa" w:w="90"/>
+              <w:bottom w:type="dxa" w:w="60"/>
+              <w:right w:type="dxa" w:w="90"/>
+            </w:tcMar>
+            <w:vAlign w:val="top"/>
+          </w:tcPr>
+          <w:p>
+            <w:pPr>
+              <w:spacing w:after="20"/>
+              <w:jc w:val="left"/>
+            </w:pPr>
+            <w:r>
+              <w:rPr>
+                <w:b w:val="false"/>
+                <w:bCs w:val="false"/>
+                <w:color w:val="1A1F1B"/>
+                <w:sz w:val="16"/>
+                <w:szCs w:val="16"/>
+              </w:rPr>
+              <w:t xml:space="preserve">type of defence</w:t>
+            </w:r>
+          </w:p>
+        </w:tc>
+        <w:tc>
+          <w:tcPr>
+            <w:tcW w:type="dxa" w:w="1927"/>
+            <w:tcBorders>
+              <w:top w:val="single" w:color="C9CEC5" w:sz="4"/>
+              <w:left w:val="single" w:color="C9CEC5" w:sz="4"/>
+              <w:bottom w:val="single" w:color="C9CEC5" w:sz="4"/>
+              <w:right w:val="single" w:color="C9CEC5" w:sz="4"/>
+            </w:tcBorders>
+            <w:tcMar>
+              <w:top w:type="dxa" w:w="60"/>
+              <w:left w:type="dxa" w:w="90"/>
+              <w:bottom w:type="dxa" w:w="60"/>
+              <w:right w:type="dxa" w:w="90"/>
+            </w:tcMar>
+            <w:vAlign w:val="top"/>
+          </w:tcPr>
+          <w:p>
+            <w:pPr>
+              <w:spacing w:after="20"/>
+              <w:jc w:val="left"/>
+            </w:pPr>
+            <w:r>
+              <w:rPr>
+                <w:b w:val="false"/>
+                <w:bCs w:val="false"/>
+                <w:color w:val="1A1F1B"/>
+                <w:sz w:val="16"/>
+                <w:szCs w:val="16"/>
+              </w:rPr>
+              <w:t xml:space="preserve">−0,641</w:t>
+            </w:r>
+          </w:p>
+        </w:tc>
+        <w:tc>
+          <w:tcPr>
+            <w:tcW w:type="dxa" w:w="2315"/>
+            <w:tcBorders>
+              <w:top w:val="single" w:color="C9CEC5" w:sz="4"/>
+              <w:left w:val="single" w:color="C9CEC5" w:sz="4"/>
+              <w:bottom w:val="single" w:color="C9CEC5" w:sz="4"/>
+              <w:right w:val="single" w:color="C9CEC5" w:sz="4"/>
+            </w:tcBorders>
+            <w:tcMar>
+              <w:top w:type="dxa" w:w="60"/>
+              <w:left w:type="dxa" w:w="90"/>
+              <w:bottom w:type="dxa" w:w="60"/>
+              <w:right w:type="dxa" w:w="90"/>
+            </w:tcMar>
+            <w:vAlign w:val="top"/>
+          </w:tcPr>
+          <w:p>
+            <w:pPr>
+              <w:spacing w:after="20"/>
+              <w:jc w:val="left"/>
+            </w:pPr>
+            <w:r>
+              <w:rPr>
+                <w:b w:val="false"/>
+                <w:bCs w:val="false"/>
+                <w:color w:val="1A1F1B"/>
+                <w:sz w:val="16"/>
+                <w:szCs w:val="16"/>
+              </w:rPr>
+              <w:t xml:space="preserve">—</w:t>
+            </w:r>
+          </w:p>
+        </w:tc>
+      </w:tr>
+      <w:tr>
+        <w:trPr>
+          <w:cantSplit/>
+        </w:trPr>
+        <w:tc>
+          <w:tcPr>
+            <w:tcW w:type="dxa" w:w="963"/>
+            <w:tcBorders>
+              <w:top w:val="single" w:color="C9CEC5" w:sz="4"/>
+              <w:left w:val="single" w:color="C9CEC5" w:sz="4"/>
+              <w:bottom w:val="single" w:color="C9CEC5" w:sz="4"/>
+              <w:right w:val="single" w:color="C9CEC5" w:sz="4"/>
+            </w:tcBorders>
+            <w:shd w:fill="F1F3EF" w:color="auto" w:val="clear"/>
+            <w:tcMar>
+              <w:top w:type="dxa" w:w="60"/>
+              <w:left w:type="dxa" w:w="90"/>
+              <w:bottom w:type="dxa" w:w="60"/>
+              <w:right w:type="dxa" w:w="90"/>
+            </w:tcMar>
+            <w:vAlign w:val="top"/>
+          </w:tcPr>
+          <w:p>
+            <w:pPr>
+              <w:spacing w:after="20"/>
+              <w:jc w:val="left"/>
+            </w:pPr>
+            <w:r>
+              <w:rPr>
+                <w:b w:val="false"/>
+                <w:bCs w:val="false"/>
+                <w:color w:val="1A1F1B"/>
+                <w:sz w:val="16"/>
+                <w:szCs w:val="16"/>
+              </w:rPr>
+              <w:t xml:space="preserve">A1</w:t>
+            </w:r>
+          </w:p>
+        </w:tc>
+        <w:tc>
+          <w:tcPr>
+            <w:tcW w:type="dxa" w:w="4433"/>
+            <w:tcBorders>
+              <w:top w:val="single" w:color="C9CEC5" w:sz="4"/>
+              <w:left w:val="single" w:color="C9CEC5" w:sz="4"/>
+              <w:bottom w:val="single" w:color="C9CEC5" w:sz="4"/>
+              <w:right w:val="single" w:color="C9CEC5" w:sz="4"/>
+            </w:tcBorders>
+            <w:shd w:fill="F1F3EF" w:color="auto" w:val="clear"/>
+            <w:tcMar>
+              <w:top w:type="dxa" w:w="60"/>
+              <w:left w:type="dxa" w:w="90"/>
+              <w:bottom w:type="dxa" w:w="60"/>
+              <w:right w:type="dxa" w:w="90"/>
+            </w:tcMar>
+            <w:vAlign w:val="top"/>
+          </w:tcPr>
+          <w:p>
+            <w:pPr>
+              <w:spacing w:after="20"/>
+              <w:jc w:val="left"/>
+            </w:pPr>
+            <w:r>
+              <w:rPr>
+                <w:b w:val="false"/>
+                <w:bCs w:val="false"/>
+                <w:color w:val="1A1F1B"/>
+                <w:sz w:val="16"/>
+                <w:szCs w:val="16"/>
+              </w:rPr>
+              <w:t xml:space="preserve">+ numbers (ln N attacker / N defender)</w:t>
+            </w:r>
+          </w:p>
+        </w:tc>
+        <w:tc>
+          <w:tcPr>
+            <w:tcW w:type="dxa" w:w="1927"/>
+            <w:tcBorders>
+              <w:top w:val="single" w:color="C9CEC5" w:sz="4"/>
+              <w:left w:val="single" w:color="C9CEC5" w:sz="4"/>
+              <w:bottom w:val="single" w:color="C9CEC5" w:sz="4"/>
+              <w:right w:val="single" w:color="C9CEC5" w:sz="4"/>
+            </w:tcBorders>
+            <w:shd w:fill="F1F3EF" w:color="auto" w:val="clear"/>
+            <w:tcMar>
+              <w:top w:type="dxa" w:w="60"/>
+              <w:left w:type="dxa" w:w="90"/>
+              <w:bottom w:type="dxa" w:w="60"/>
+              <w:right w:type="dxa" w:w="90"/>
+            </w:tcMar>
+            <w:vAlign w:val="top"/>
+          </w:tcPr>
+          <w:p>
+            <w:pPr>
+              <w:spacing w:after="20"/>
+              <w:jc w:val="left"/>
+            </w:pPr>
+            <w:r>
+              <w:rPr>
+                <w:b w:val="false"/>
+                <w:bCs w:val="false"/>
+                <w:color w:val="1A1F1B"/>
+                <w:sz w:val="16"/>
+                <w:szCs w:val="16"/>
+              </w:rPr>
+              <w:t xml:space="preserve">−0,632</w:t>
+            </w:r>
+          </w:p>
+        </w:tc>
+        <w:tc>
+          <w:tcPr>
+            <w:tcW w:type="dxa" w:w="2315"/>
+            <w:tcBorders>
+              <w:top w:val="single" w:color="C9CEC5" w:sz="4"/>
+              <w:left w:val="single" w:color="C9CEC5" w:sz="4"/>
+              <w:bottom w:val="single" w:color="C9CEC5" w:sz="4"/>
+              <w:right w:val="single" w:color="C9CEC5" w:sz="4"/>
+            </w:tcBorders>
+            <w:shd w:fill="F1F3EF" w:color="auto" w:val="clear"/>
+            <w:tcMar>
+              <w:top w:type="dxa" w:w="60"/>
+              <w:left w:type="dxa" w:w="90"/>
+              <w:bottom w:type="dxa" w:w="60"/>
+              <w:right w:type="dxa" w:w="90"/>
+            </w:tcMar>
+            <w:vAlign w:val="top"/>
+          </w:tcPr>
+          <w:p>
+            <w:pPr>
+              <w:spacing w:after="20"/>
+              <w:jc w:val="left"/>
+            </w:pPr>
+            <w:r>
+              <w:rPr>
+                <w:b w:val="false"/>
+                <w:bCs w:val="false"/>
+                <w:color w:val="1A1F1B"/>
+                <w:sz w:val="16"/>
+                <w:szCs w:val="16"/>
+              </w:rPr>
+              <w:t xml:space="preserve">+0,009 [+0,003; +0,012]</w:t>
+            </w:r>
+          </w:p>
+        </w:tc>
+      </w:tr>
+      <w:tr>
+        <w:trPr>
+          <w:cantSplit/>
+        </w:trPr>
+        <w:tc>
+          <w:tcPr>
+            <w:tcW w:type="dxa" w:w="963"/>
+            <w:tcBorders>
+              <w:top w:val="single" w:color="C9CEC5" w:sz="4"/>
+              <w:left w:val="single" w:color="C9CEC5" w:sz="4"/>
+              <w:bottom w:val="single" w:color="C9CEC5" w:sz="4"/>
+              <w:right w:val="single" w:color="C9CEC5" w:sz="4"/>
+            </w:tcBorders>
+            <w:tcMar>
+              <w:top w:type="dxa" w:w="60"/>
+              <w:left w:type="dxa" w:w="90"/>
+              <w:bottom w:type="dxa" w:w="60"/>
+              <w:right w:type="dxa" w:w="90"/>
+            </w:tcMar>
+            <w:vAlign w:val="top"/>
+          </w:tcPr>
+          <w:p>
+            <w:pPr>
+              <w:spacing w:after="20"/>
+              <w:jc w:val="left"/>
+            </w:pPr>
+            <w:r>
+              <w:rPr>
+                <w:b w:val="false"/>
+                <w:bCs w:val="false"/>
+                <w:color w:val="1A1F1B"/>
+                <w:sz w:val="16"/>
+                <w:szCs w:val="16"/>
+              </w:rPr>
+              <w:t xml:space="preserve">A2</w:t>
+            </w:r>
+          </w:p>
+        </w:tc>
+        <w:tc>
+          <w:tcPr>
+            <w:tcW w:type="dxa" w:w="4433"/>
+            <w:tcBorders>
+              <w:top w:val="single" w:color="C9CEC5" w:sz="4"/>
+              <w:left w:val="single" w:color="C9CEC5" w:sz="4"/>
+              <w:bottom w:val="single" w:color="C9CEC5" w:sz="4"/>
+              <w:right w:val="single" w:color="C9CEC5" w:sz="4"/>
+            </w:tcBorders>
+            <w:tcMar>
+              <w:top w:type="dxa" w:w="60"/>
+              <w:left w:type="dxa" w:w="90"/>
+              <w:bottom w:type="dxa" w:w="60"/>
+              <w:right w:type="dxa" w:w="90"/>
+            </w:tcMar>
+            <w:vAlign w:val="top"/>
+          </w:tcPr>
+          <w:p>
+            <w:pPr>
+              <w:spacing w:after="20"/>
+              <w:jc w:val="left"/>
+            </w:pPr>
+            <w:r>
+              <w:rPr>
+                <w:b w:val="false"/>
+                <w:bCs w:val="false"/>
+                <w:color w:val="1A1F1B"/>
+                <w:sz w:val="16"/>
+                <w:szCs w:val="16"/>
+              </w:rPr>
+              <w:t xml:space="preserve">+ seven factors (intelligence, morale, leadership, training, technology, supply, surprise)</w:t>
+            </w:r>
+          </w:p>
+        </w:tc>
+        <w:tc>
+          <w:tcPr>
+            <w:tcW w:type="dxa" w:w="1927"/>
+            <w:tcBorders>
+              <w:top w:val="single" w:color="C9CEC5" w:sz="4"/>
+              <w:left w:val="single" w:color="C9CEC5" w:sz="4"/>
+              <w:bottom w:val="single" w:color="C9CEC5" w:sz="4"/>
+              <w:right w:val="single" w:color="C9CEC5" w:sz="4"/>
+            </w:tcBorders>
+            <w:tcMar>
+              <w:top w:type="dxa" w:w="60"/>
+              <w:left w:type="dxa" w:w="90"/>
+              <w:bottom w:type="dxa" w:w="60"/>
+              <w:right w:type="dxa" w:w="90"/>
+            </w:tcMar>
+            <w:vAlign w:val="top"/>
+          </w:tcPr>
+          <w:p>
+            <w:pPr>
+              <w:spacing w:after="20"/>
+              <w:jc w:val="left"/>
+            </w:pPr>
+            <w:r>
+              <w:rPr>
+                <w:b w:val="false"/>
+                <w:bCs w:val="false"/>
+                <w:color w:val="1A1F1B"/>
+                <w:sz w:val="16"/>
+                <w:szCs w:val="16"/>
+              </w:rPr>
+              <w:t xml:space="preserve">−0,452</w:t>
+            </w:r>
+          </w:p>
+        </w:tc>
+        <w:tc>
+          <w:tcPr>
+            <w:tcW w:type="dxa" w:w="2315"/>
+            <w:tcBorders>
+              <w:top w:val="single" w:color="C9CEC5" w:sz="4"/>
+              <w:left w:val="single" w:color="C9CEC5" w:sz="4"/>
+              <w:bottom w:val="single" w:color="C9CEC5" w:sz="4"/>
+              <w:right w:val="single" w:color="C9CEC5" w:sz="4"/>
+            </w:tcBorders>
+            <w:tcMar>
+              <w:top w:type="dxa" w:w="60"/>
+              <w:left w:type="dxa" w:w="90"/>
+              <w:bottom w:type="dxa" w:w="60"/>
+              <w:right w:type="dxa" w:w="90"/>
+            </w:tcMar>
+            <w:vAlign w:val="top"/>
+          </w:tcPr>
+          <w:p>
+            <w:pPr>
+              <w:spacing w:after="20"/>
+              <w:jc w:val="left"/>
+            </w:pPr>
+            <w:r>
+              <w:rPr>
+                <w:b w:val="false"/>
+                <w:bCs w:val="false"/>
+                <w:color w:val="1A1F1B"/>
+                <w:sz w:val="16"/>
+                <w:szCs w:val="16"/>
+              </w:rPr>
+              <w:t xml:space="preserve">+0,180 [+0,149; +0,193]</w:t>
+            </w:r>
+          </w:p>
+        </w:tc>
+      </w:tr>
+      <w:tr>
+        <w:trPr>
+          <w:cantSplit/>
+        </w:trPr>
+        <w:tc>
+          <w:tcPr>
+            <w:tcW w:type="dxa" w:w="963"/>
+            <w:tcBorders>
+              <w:top w:val="single" w:color="C9CEC5" w:sz="4"/>
+              <w:left w:val="single" w:color="C9CEC5" w:sz="4"/>
+              <w:bottom w:val="single" w:color="C9CEC5" w:sz="4"/>
+              <w:right w:val="single" w:color="C9CEC5" w:sz="4"/>
+            </w:tcBorders>
+            <w:shd w:fill="F1F3EF" w:color="auto" w:val="clear"/>
+            <w:tcMar>
+              <w:top w:type="dxa" w:w="60"/>
+              <w:left w:type="dxa" w:w="90"/>
+              <w:bottom w:type="dxa" w:w="60"/>
+              <w:right w:type="dxa" w:w="90"/>
+            </w:tcMar>
+            <w:vAlign w:val="top"/>
+          </w:tcPr>
+          <w:p>
+            <w:pPr>
+              <w:spacing w:after="20"/>
+              <w:jc w:val="left"/>
+            </w:pPr>
+            <w:r>
+              <w:rPr>
+                <w:b w:val="false"/>
+                <w:bCs w:val="false"/>
+                <w:color w:val="1A1F1B"/>
+                <w:sz w:val="16"/>
+                <w:szCs w:val="16"/>
+              </w:rPr>
+              <w:t xml:space="preserve">A3</w:t>
+            </w:r>
+          </w:p>
+        </w:tc>
+        <w:tc>
+          <w:tcPr>
+            <w:tcW w:type="dxa" w:w="4433"/>
+            <w:tcBorders>
+              <w:top w:val="single" w:color="C9CEC5" w:sz="4"/>
+              <w:left w:val="single" w:color="C9CEC5" w:sz="4"/>
+              <w:bottom w:val="single" w:color="C9CEC5" w:sz="4"/>
+              <w:right w:val="single" w:color="C9CEC5" w:sz="4"/>
+            </w:tcBorders>
+            <w:shd w:fill="F1F3EF" w:color="auto" w:val="clear"/>
+            <w:tcMar>
+              <w:top w:type="dxa" w:w="60"/>
+              <w:left w:type="dxa" w:w="90"/>
+              <w:bottom w:type="dxa" w:w="60"/>
+              <w:right w:type="dxa" w:w="90"/>
+            </w:tcMar>
+            <w:vAlign w:val="top"/>
+          </w:tcPr>
+          <w:p>
+            <w:pPr>
+              <w:spacing w:after="20"/>
+              <w:jc w:val="left"/>
+            </w:pPr>
+            <w:r>
+              <w:rPr>
+                <w:b w:val="false"/>
+                <w:bCs w:val="false"/>
+                <w:color w:val="1A1F1B"/>
+                <w:sz w:val="16"/>
+                <w:szCs w:val="16"/>
+              </w:rPr>
+              <w:t xml:space="preserve">factors without numbers</w:t>
+            </w:r>
+          </w:p>
+        </w:tc>
+        <w:tc>
+          <w:tcPr>
+            <w:tcW w:type="dxa" w:w="1927"/>
+            <w:tcBorders>
+              <w:top w:val="single" w:color="C9CEC5" w:sz="4"/>
+              <w:left w:val="single" w:color="C9CEC5" w:sz="4"/>
+              <w:bottom w:val="single" w:color="C9CEC5" w:sz="4"/>
+              <w:right w:val="single" w:color="C9CEC5" w:sz="4"/>
+            </w:tcBorders>
+            <w:shd w:fill="F1F3EF" w:color="auto" w:val="clear"/>
+            <w:tcMar>
+              <w:top w:type="dxa" w:w="60"/>
+              <w:left w:type="dxa" w:w="90"/>
+              <w:bottom w:type="dxa" w:w="60"/>
+              <w:right w:type="dxa" w:w="90"/>
+            </w:tcMar>
+            <w:vAlign w:val="top"/>
+          </w:tcPr>
+          <w:p>
+            <w:pPr>
+              <w:spacing w:after="20"/>
+              <w:jc w:val="left"/>
+            </w:pPr>
+            <w:r>
+              <w:rPr>
+                <w:b w:val="false"/>
+                <w:bCs w:val="false"/>
+                <w:color w:val="1A1F1B"/>
+                <w:sz w:val="16"/>
+                <w:szCs w:val="16"/>
+              </w:rPr>
+              <w:t xml:space="preserve">−0,474</w:t>
+            </w:r>
+          </w:p>
+        </w:tc>
+        <w:tc>
+          <w:tcPr>
+            <w:tcW w:type="dxa" w:w="2315"/>
+            <w:tcBorders>
+              <w:top w:val="single" w:color="C9CEC5" w:sz="4"/>
+              <w:left w:val="single" w:color="C9CEC5" w:sz="4"/>
+              <w:bottom w:val="single" w:color="C9CEC5" w:sz="4"/>
+              <w:right w:val="single" w:color="C9CEC5" w:sz="4"/>
+            </w:tcBorders>
+            <w:shd w:fill="F1F3EF" w:color="auto" w:val="clear"/>
+            <w:tcMar>
+              <w:top w:type="dxa" w:w="60"/>
+              <w:left w:type="dxa" w:w="90"/>
+              <w:bottom w:type="dxa" w:w="60"/>
+              <w:right w:type="dxa" w:w="90"/>
+            </w:tcMar>
+            <w:vAlign w:val="top"/>
+          </w:tcPr>
+          <w:p>
+            <w:pPr>
+              <w:spacing w:after="20"/>
+              <w:jc w:val="left"/>
+            </w:pPr>
+            <w:r>
+              <w:rPr>
+                <w:b w:val="false"/>
+                <w:bCs w:val="false"/>
+                <w:color w:val="1A1F1B"/>
+                <w:sz w:val="16"/>
+                <w:szCs w:val="16"/>
+              </w:rPr>
+              <w:t xml:space="preserve">+0.167 over A0 [+0.144; +0.180]</w:t>
+            </w:r>
+          </w:p>
+        </w:tc>
+      </w:tr>
+    </w:tbl>
+    <w:p>
+      <w:pPr>
+        <w:spacing w:after="120"/>
+      </w:pPr>
+    </w:p>
+    <w:p>
+      <w:pPr>
+        <w:spacing w:after="120" w:line="288"/>
+        <w:jc w:val="both"/>
+      </w:pPr>
+      <w:r>
+        <w:t xml:space="preserve">Numbers add almost nothing to predicting the outcome (+0.009 per battle); the effectiveness factors add roughly 20 times more (+0.180); the factors account for 95% of the entire gain over the type of defence. For the loss exchange ln(Latt / Ldef) the share of variance explained out of sample is 0.00 for numbers and 0.23 with the factors. The protocol rule is met, with a caveat: the factor codes were assigned by the compilers after the battles, so the contribution of the factors is an upper bound; the contribution of numbers cannot be overstated.</w:t>
+      </w:r>
+    </w:p>
+    <w:p>
+      <w:pPr>
+        <w:shd w:fill="F2F4F0" w:color="auto" w:val="clear"/>
+        <w:spacing w:after="160" w:before="60"/>
+        <w:ind w:left="200" w:right="200"/>
+        <w:jc w:val="left"/>
+      </w:pPr>
+      <w:r>
+        <w:rPr>
+          <w:rFonts w:ascii="Consolas" w:cs="Consolas" w:eastAsia="Consolas" w:hAnsi="Consolas"/>
+          <w:color w:val="1A1F1B"/>
+          <w:sz w:val="19"/>
+          <w:szCs w:val="19"/>
+        </w:rPr>
+        <w:t xml:space="preserve">F = M · E,   M — potential (numbers × equipment quality),   E = Π kf ^ (step of f) — effectiveness (section 4.2)</w:t>
+      </w:r>
+    </w:p>
+    <w:p>
+      <w:pPr>
+        <w:spacing w:after="120" w:line="288"/>
+        <w:jc w:val="both"/>
+      </w:pPr>
+      <w:r>
+        <w:t xml:space="preserve">Implication for the MPI: the index mainly measures M. To predict outcomes it needs the multiplier E, and the sources for E in modern wars are exactly what open data do not provide (training, leadership, morale). This justifies the expert panel (document 7, modules M5–M6) as a necessary part of the method rather than an ornament.</w:t>
+      </w:r>
+    </w:p>
+    <w:p>
+      <w:pPr>
+        <w:pStyle w:val="Heading2"/>
+      </w:pPr>
+      <w:bookmarkStart w:name="_Toc204" w:id="204"/>
+      <w:r>
+        <w:t xml:space="preserve">4.5. Order of the index and the balance of forces (branch G)</w:t>
+      </w:r>
+      <w:bookmarkEnd w:id="204"/>
+    </w:p>
+    <w:p>
+      <w:pPr>
+        <w:spacing w:after="120" w:line="288"/>
+        <w:jc w:val="both"/>
+      </w:pPr>
+      <w:r>
+        <w:t xml:space="preserve">If κ is not identifiable (section 1.2), can the order of the index at least be trusted? The area under the ROC curve (AUC) does not depend on κ: the test is whether ln(ratio) is higher in the cases where the advantage sufficed than in those where it did not. Ten wars of 2018–2025, candidate θC.</w:t>
+      </w:r>
+    </w:p>
+    <w:tbl>
+      <w:tblPr>
+        <w:tblW w:type="dxa" w:w="9638"/>
+        <w:tblBorders>
+          <w:top w:val="single" w:color="auto" w:sz="4"/>
+          <w:left w:val="single" w:color="auto" w:sz="4"/>
+          <w:bottom w:val="single" w:color="auto" w:sz="4"/>
+          <w:right w:val="single" w:color="auto" w:sz="4"/>
+          <w:insideH w:val="single" w:color="auto" w:sz="4"/>
+          <w:insideV w:val="single" w:color="auto" w:sz="4"/>
+        </w:tblBorders>
+      </w:tblPr>
+      <w:tblGrid>
+        <w:gridCol w:w="4626"/>
+        <w:gridCol w:w="1734"/>
+        <w:gridCol w:w="1349"/>
+        <w:gridCol w:w="1929"/>
+      </w:tblGrid>
+      <w:tr>
+        <w:trPr>
+          <w:tblHeader/>
+        </w:trPr>
+        <w:tc>
+          <w:tcPr>
+            <w:tcW w:type="dxa" w:w="4626"/>
+            <w:tcBorders>
+              <w:top w:val="single" w:color="C9CEC5" w:sz="4"/>
+              <w:left w:val="single" w:color="C9CEC5" w:sz="4"/>
+              <w:bottom w:val="single" w:color="C9CEC5" w:sz="4"/>
+              <w:right w:val="single" w:color="C9CEC5" w:sz="4"/>
+            </w:tcBorders>
+            <w:shd w:fill="1F2A24" w:color="auto" w:val="clear"/>
+            <w:tcMar>
+              <w:top w:type="dxa" w:w="60"/>
+              <w:left w:type="dxa" w:w="90"/>
+              <w:bottom w:type="dxa" w:w="60"/>
+              <w:right w:type="dxa" w:w="90"/>
+            </w:tcMar>
+            <w:vAlign w:val="top"/>
+          </w:tcPr>
+          <w:p>
+            <w:pPr>
+              <w:spacing w:after="20"/>
+              <w:jc w:val="left"/>
+            </w:pPr>
+            <w:r>
+              <w:rPr>
+                <w:b/>
+                <w:bCs/>
+                <w:color w:val="FFFFFF"/>
+                <w:sz w:val="16"/>
+                <w:szCs w:val="16"/>
+              </w:rPr>
+              <w:t xml:space="preserve">Case</w:t>
+            </w:r>
+          </w:p>
+        </w:tc>
+        <w:tc>
+          <w:tcPr>
+            <w:tcW w:type="dxa" w:w="1734"/>
+            <w:tcBorders>
+              <w:top w:val="single" w:color="C9CEC5" w:sz="4"/>
+              <w:left w:val="single" w:color="C9CEC5" w:sz="4"/>
+              <w:bottom w:val="single" w:color="C9CEC5" w:sz="4"/>
+              <w:right w:val="single" w:color="C9CEC5" w:sz="4"/>
+            </w:tcBorders>
+            <w:shd w:fill="1F2A24" w:color="auto" w:val="clear"/>
+            <w:tcMar>
+              <w:top w:type="dxa" w:w="60"/>
+              <w:left w:type="dxa" w:w="90"/>
+              <w:bottom w:type="dxa" w:w="60"/>
+              <w:right w:type="dxa" w:w="90"/>
+            </w:tcMar>
+            <w:vAlign w:val="top"/>
+          </w:tcPr>
+          <w:p>
+            <w:pPr>
+              <w:spacing w:after="20"/>
+              <w:jc w:val="left"/>
+            </w:pPr>
+            <w:r>
+              <w:rPr>
+                <w:b/>
+                <w:bCs/>
+                <w:color w:val="FFFFFF"/>
+                <w:sz w:val="16"/>
+                <w:szCs w:val="16"/>
+              </w:rPr>
+              <w:t xml:space="preserve">Advantage by the index</w:t>
+            </w:r>
+          </w:p>
+        </w:tc>
+        <w:tc>
+          <w:tcPr>
+            <w:tcW w:type="dxa" w:w="1349"/>
+            <w:tcBorders>
+              <w:top w:val="single" w:color="C9CEC5" w:sz="4"/>
+              <w:left w:val="single" w:color="C9CEC5" w:sz="4"/>
+              <w:bottom w:val="single" w:color="C9CEC5" w:sz="4"/>
+              <w:right w:val="single" w:color="C9CEC5" w:sz="4"/>
+            </w:tcBorders>
+            <w:shd w:fill="1F2A24" w:color="auto" w:val="clear"/>
+            <w:tcMar>
+              <w:top w:type="dxa" w:w="60"/>
+              <w:left w:type="dxa" w:w="90"/>
+              <w:bottom w:type="dxa" w:w="60"/>
+              <w:right w:type="dxa" w:w="90"/>
+            </w:tcMar>
+            <w:vAlign w:val="top"/>
+          </w:tcPr>
+          <w:p>
+            <w:pPr>
+              <w:spacing w:after="20"/>
+              <w:jc w:val="left"/>
+            </w:pPr>
+            <w:r>
+              <w:rPr>
+                <w:b/>
+                <w:bCs/>
+                <w:color w:val="FFFFFF"/>
+                <w:sz w:val="16"/>
+                <w:szCs w:val="16"/>
+              </w:rPr>
+              <w:t xml:space="preserve">Required</w:t>
+            </w:r>
+          </w:p>
+        </w:tc>
+        <w:tc>
+          <w:tcPr>
+            <w:tcW w:type="dxa" w:w="1929"/>
+            <w:tcBorders>
+              <w:top w:val="single" w:color="C9CEC5" w:sz="4"/>
+              <w:left w:val="single" w:color="C9CEC5" w:sz="4"/>
+              <w:bottom w:val="single" w:color="C9CEC5" w:sz="4"/>
+              <w:right w:val="single" w:color="C9CEC5" w:sz="4"/>
+            </w:tcBorders>
+            <w:shd w:fill="1F2A24" w:color="auto" w:val="clear"/>
+            <w:tcMar>
+              <w:top w:type="dxa" w:w="60"/>
+              <w:left w:type="dxa" w:w="90"/>
+              <w:bottom w:type="dxa" w:w="60"/>
+              <w:right w:type="dxa" w:w="90"/>
+            </w:tcMar>
+            <w:vAlign w:val="top"/>
+          </w:tcPr>
+          <w:p>
+            <w:pPr>
+              <w:spacing w:after="20"/>
+              <w:jc w:val="left"/>
+            </w:pPr>
+            <w:r>
+              <w:rPr>
+                <w:b/>
+                <w:bCs/>
+                <w:color w:val="FFFFFF"/>
+                <w:sz w:val="16"/>
+                <w:szCs w:val="16"/>
+              </w:rPr>
+              <w:t xml:space="preserve">Did the advantage suffice?</w:t>
+            </w:r>
+          </w:p>
+        </w:tc>
+      </w:tr>
+      <w:tr>
+        <w:trPr>
+          <w:cantSplit/>
+        </w:trPr>
+        <w:tc>
+          <w:tcPr>
+            <w:tcW w:type="dxa" w:w="4626"/>
+            <w:tcBorders>
+              <w:top w:val="single" w:color="C9CEC5" w:sz="4"/>
+              <w:left w:val="single" w:color="C9CEC5" w:sz="4"/>
+              <w:bottom w:val="single" w:color="C9CEC5" w:sz="4"/>
+              <w:right w:val="single" w:color="C9CEC5" w:sz="4"/>
+            </w:tcBorders>
+            <w:tcMar>
+              <w:top w:type="dxa" w:w="60"/>
+              <w:left w:type="dxa" w:w="90"/>
+              <w:bottom w:type="dxa" w:w="60"/>
+              <w:right w:type="dxa" w:w="90"/>
+            </w:tcMar>
+            <w:vAlign w:val="top"/>
+          </w:tcPr>
+          <w:p>
+            <w:pPr>
+              <w:spacing w:after="20"/>
+              <w:jc w:val="left"/>
+            </w:pPr>
+            <w:r>
+              <w:rPr>
+                <w:b w:val="false"/>
+                <w:bCs w:val="false"/>
+                <w:color w:val="1A1F1B"/>
+                <w:sz w:val="16"/>
+                <w:szCs w:val="16"/>
+              </w:rPr>
+              <w:t xml:space="preserve">Israel and the United States against Iran, June 2025</w:t>
+            </w:r>
+          </w:p>
+        </w:tc>
+        <w:tc>
+          <w:tcPr>
+            <w:tcW w:type="dxa" w:w="1734"/>
+            <w:tcBorders>
+              <w:top w:val="single" w:color="C9CEC5" w:sz="4"/>
+              <w:left w:val="single" w:color="C9CEC5" w:sz="4"/>
+              <w:bottom w:val="single" w:color="C9CEC5" w:sz="4"/>
+              <w:right w:val="single" w:color="C9CEC5" w:sz="4"/>
+            </w:tcBorders>
+            <w:tcMar>
+              <w:top w:type="dxa" w:w="60"/>
+              <w:left w:type="dxa" w:w="90"/>
+              <w:bottom w:type="dxa" w:w="60"/>
+              <w:right w:type="dxa" w:w="90"/>
+            </w:tcMar>
+            <w:vAlign w:val="top"/>
+          </w:tcPr>
+          <w:p>
+            <w:pPr>
+              <w:spacing w:after="20"/>
+              <w:jc w:val="left"/>
+            </w:pPr>
+            <w:r>
+              <w:rPr>
+                <w:b w:val="false"/>
+                <w:bCs w:val="false"/>
+                <w:color w:val="1A1F1B"/>
+                <w:sz w:val="16"/>
+                <w:szCs w:val="16"/>
+              </w:rPr>
+              <w:t xml:space="preserve">0.53 : 1</w:t>
+            </w:r>
+          </w:p>
+        </w:tc>
+        <w:tc>
+          <w:tcPr>
+            <w:tcW w:type="dxa" w:w="1349"/>
+            <w:tcBorders>
+              <w:top w:val="single" w:color="C9CEC5" w:sz="4"/>
+              <w:left w:val="single" w:color="C9CEC5" w:sz="4"/>
+              <w:bottom w:val="single" w:color="C9CEC5" w:sz="4"/>
+              <w:right w:val="single" w:color="C9CEC5" w:sz="4"/>
+            </w:tcBorders>
+            <w:tcMar>
+              <w:top w:type="dxa" w:w="60"/>
+              <w:left w:type="dxa" w:w="90"/>
+              <w:bottom w:type="dxa" w:w="60"/>
+              <w:right w:type="dxa" w:w="90"/>
+            </w:tcMar>
+            <w:vAlign w:val="top"/>
+          </w:tcPr>
+          <w:p>
+            <w:pPr>
+              <w:spacing w:after="20"/>
+              <w:jc w:val="left"/>
+            </w:pPr>
+            <w:r>
+              <w:rPr>
+                <w:b w:val="false"/>
+                <w:bCs w:val="false"/>
+                <w:color w:val="1A1F1B"/>
+                <w:sz w:val="16"/>
+                <w:szCs w:val="16"/>
+              </w:rPr>
+              <w:t xml:space="preserve">1.13 : 1</w:t>
+            </w:r>
+          </w:p>
+        </w:tc>
+        <w:tc>
+          <w:tcPr>
+            <w:tcW w:type="dxa" w:w="1929"/>
+            <w:tcBorders>
+              <w:top w:val="single" w:color="C9CEC5" w:sz="4"/>
+              <w:left w:val="single" w:color="C9CEC5" w:sz="4"/>
+              <w:bottom w:val="single" w:color="C9CEC5" w:sz="4"/>
+              <w:right w:val="single" w:color="C9CEC5" w:sz="4"/>
+            </w:tcBorders>
+            <w:tcMar>
+              <w:top w:type="dxa" w:w="60"/>
+              <w:left w:type="dxa" w:w="90"/>
+              <w:bottom w:type="dxa" w:w="60"/>
+              <w:right w:type="dxa" w:w="90"/>
+            </w:tcMar>
+            <w:vAlign w:val="top"/>
+          </w:tcPr>
+          <w:p>
+            <w:pPr>
+              <w:spacing w:after="20"/>
+              <w:jc w:val="left"/>
+            </w:pPr>
+            <w:r>
+              <w:rPr>
+                <w:b w:val="false"/>
+                <w:bCs w:val="false"/>
+                <w:color w:val="1A1F1B"/>
+                <w:sz w:val="16"/>
+                <w:szCs w:val="16"/>
+              </w:rPr>
+              <w:t xml:space="preserve">yes, it did</w:t>
+            </w:r>
+          </w:p>
+        </w:tc>
+      </w:tr>
+      <w:tr>
+        <w:trPr>
+          <w:cantSplit/>
+        </w:trPr>
+        <w:tc>
+          <w:tcPr>
+            <w:tcW w:type="dxa" w:w="4626"/>
+            <w:tcBorders>
+              <w:top w:val="single" w:color="C9CEC5" w:sz="4"/>
+              <w:left w:val="single" w:color="C9CEC5" w:sz="4"/>
+              <w:bottom w:val="single" w:color="C9CEC5" w:sz="4"/>
+              <w:right w:val="single" w:color="C9CEC5" w:sz="4"/>
+            </w:tcBorders>
+            <w:shd w:fill="F1F3EF" w:color="auto" w:val="clear"/>
+            <w:tcMar>
+              <w:top w:type="dxa" w:w="60"/>
+              <w:left w:type="dxa" w:w="90"/>
+              <w:bottom w:type="dxa" w:w="60"/>
+              <w:right w:type="dxa" w:w="90"/>
+            </w:tcMar>
+            <w:vAlign w:val="top"/>
+          </w:tcPr>
+          <w:p>
+            <w:pPr>
+              <w:spacing w:after="20"/>
+              <w:jc w:val="left"/>
+            </w:pPr>
+            <w:r>
+              <w:rPr>
+                <w:b w:val="false"/>
+                <w:bCs w:val="false"/>
+                <w:color w:val="1A1F1B"/>
+                <w:sz w:val="16"/>
+                <w:szCs w:val="16"/>
+              </w:rPr>
+              <w:t xml:space="preserve">Rwanda (via M23) against DR Congo, 2025</w:t>
+            </w:r>
+          </w:p>
+        </w:tc>
+        <w:tc>
+          <w:tcPr>
+            <w:tcW w:type="dxa" w:w="1734"/>
+            <w:tcBorders>
+              <w:top w:val="single" w:color="C9CEC5" w:sz="4"/>
+              <w:left w:val="single" w:color="C9CEC5" w:sz="4"/>
+              <w:bottom w:val="single" w:color="C9CEC5" w:sz="4"/>
+              <w:right w:val="single" w:color="C9CEC5" w:sz="4"/>
+            </w:tcBorders>
+            <w:shd w:fill="F1F3EF" w:color="auto" w:val="clear"/>
+            <w:tcMar>
+              <w:top w:type="dxa" w:w="60"/>
+              <w:left w:type="dxa" w:w="90"/>
+              <w:bottom w:type="dxa" w:w="60"/>
+              <w:right w:type="dxa" w:w="90"/>
+            </w:tcMar>
+            <w:vAlign w:val="top"/>
+          </w:tcPr>
+          <w:p>
+            <w:pPr>
+              <w:spacing w:after="20"/>
+              <w:jc w:val="left"/>
+            </w:pPr>
+            <w:r>
+              <w:rPr>
+                <w:b w:val="false"/>
+                <w:bCs w:val="false"/>
+                <w:color w:val="1A1F1B"/>
+                <w:sz w:val="16"/>
+                <w:szCs w:val="16"/>
+              </w:rPr>
+              <w:t xml:space="preserve">1.07 : 1</w:t>
+            </w:r>
+          </w:p>
+        </w:tc>
+        <w:tc>
+          <w:tcPr>
+            <w:tcW w:type="dxa" w:w="1349"/>
+            <w:tcBorders>
+              <w:top w:val="single" w:color="C9CEC5" w:sz="4"/>
+              <w:left w:val="single" w:color="C9CEC5" w:sz="4"/>
+              <w:bottom w:val="single" w:color="C9CEC5" w:sz="4"/>
+              <w:right w:val="single" w:color="C9CEC5" w:sz="4"/>
+            </w:tcBorders>
+            <w:shd w:fill="F1F3EF" w:color="auto" w:val="clear"/>
+            <w:tcMar>
+              <w:top w:type="dxa" w:w="60"/>
+              <w:left w:type="dxa" w:w="90"/>
+              <w:bottom w:type="dxa" w:w="60"/>
+              <w:right w:type="dxa" w:w="90"/>
+            </w:tcMar>
+            <w:vAlign w:val="top"/>
+          </w:tcPr>
+          <w:p>
+            <w:pPr>
+              <w:spacing w:after="20"/>
+              <w:jc w:val="left"/>
+            </w:pPr>
+            <w:r>
+              <w:rPr>
+                <w:b w:val="false"/>
+                <w:bCs w:val="false"/>
+                <w:color w:val="1A1F1B"/>
+                <w:sz w:val="16"/>
+                <w:szCs w:val="16"/>
+              </w:rPr>
+              <w:t xml:space="preserve">1.00 : 1</w:t>
+            </w:r>
+          </w:p>
+        </w:tc>
+        <w:tc>
+          <w:tcPr>
+            <w:tcW w:type="dxa" w:w="1929"/>
+            <w:tcBorders>
+              <w:top w:val="single" w:color="C9CEC5" w:sz="4"/>
+              <w:left w:val="single" w:color="C9CEC5" w:sz="4"/>
+              <w:bottom w:val="single" w:color="C9CEC5" w:sz="4"/>
+              <w:right w:val="single" w:color="C9CEC5" w:sz="4"/>
+            </w:tcBorders>
+            <w:shd w:fill="F1F3EF" w:color="auto" w:val="clear"/>
+            <w:tcMar>
+              <w:top w:type="dxa" w:w="60"/>
+              <w:left w:type="dxa" w:w="90"/>
+              <w:bottom w:type="dxa" w:w="60"/>
+              <w:right w:type="dxa" w:w="90"/>
+            </w:tcMar>
+            <w:vAlign w:val="top"/>
+          </w:tcPr>
+          <w:p>
+            <w:pPr>
+              <w:spacing w:after="20"/>
+              <w:jc w:val="left"/>
+            </w:pPr>
+            <w:r>
+              <w:rPr>
+                <w:b w:val="false"/>
+                <w:bCs w:val="false"/>
+                <w:color w:val="1A1F1B"/>
+                <w:sz w:val="16"/>
+                <w:szCs w:val="16"/>
+              </w:rPr>
+              <w:t xml:space="preserve">yes, it did</w:t>
+            </w:r>
+          </w:p>
+        </w:tc>
+      </w:tr>
+      <w:tr>
+        <w:trPr>
+          <w:cantSplit/>
+        </w:trPr>
+        <w:tc>
+          <w:tcPr>
+            <w:tcW w:type="dxa" w:w="4626"/>
+            <w:tcBorders>
+              <w:top w:val="single" w:color="C9CEC5" w:sz="4"/>
+              <w:left w:val="single" w:color="C9CEC5" w:sz="4"/>
+              <w:bottom w:val="single" w:color="C9CEC5" w:sz="4"/>
+              <w:right w:val="single" w:color="C9CEC5" w:sz="4"/>
+            </w:tcBorders>
+            <w:tcMar>
+              <w:top w:type="dxa" w:w="60"/>
+              <w:left w:type="dxa" w:w="90"/>
+              <w:bottom w:type="dxa" w:w="60"/>
+              <w:right w:type="dxa" w:w="90"/>
+            </w:tcMar>
+            <w:vAlign w:val="top"/>
+          </w:tcPr>
+          <w:p>
+            <w:pPr>
+              <w:spacing w:after="20"/>
+              <w:jc w:val="left"/>
+            </w:pPr>
+            <w:r>
+              <w:rPr>
+                <w:b w:val="false"/>
+                <w:bCs w:val="false"/>
+                <w:color w:val="1A1F1B"/>
+                <w:sz w:val="16"/>
+                <w:szCs w:val="16"/>
+              </w:rPr>
+              <w:t xml:space="preserve">Israel against Iran in Syria, 2018</w:t>
+            </w:r>
+          </w:p>
+        </w:tc>
+        <w:tc>
+          <w:tcPr>
+            <w:tcW w:type="dxa" w:w="1734"/>
+            <w:tcBorders>
+              <w:top w:val="single" w:color="C9CEC5" w:sz="4"/>
+              <w:left w:val="single" w:color="C9CEC5" w:sz="4"/>
+              <w:bottom w:val="single" w:color="C9CEC5" w:sz="4"/>
+              <w:right w:val="single" w:color="C9CEC5" w:sz="4"/>
+            </w:tcBorders>
+            <w:tcMar>
+              <w:top w:type="dxa" w:w="60"/>
+              <w:left w:type="dxa" w:w="90"/>
+              <w:bottom w:type="dxa" w:w="60"/>
+              <w:right w:type="dxa" w:w="90"/>
+            </w:tcMar>
+            <w:vAlign w:val="top"/>
+          </w:tcPr>
+          <w:p>
+            <w:pPr>
+              <w:spacing w:after="20"/>
+              <w:jc w:val="left"/>
+            </w:pPr>
+            <w:r>
+              <w:rPr>
+                <w:b w:val="false"/>
+                <w:bCs w:val="false"/>
+                <w:color w:val="1A1F1B"/>
+                <w:sz w:val="16"/>
+                <w:szCs w:val="16"/>
+              </w:rPr>
+              <w:t xml:space="preserve">1.14 : 1</w:t>
+            </w:r>
+          </w:p>
+        </w:tc>
+        <w:tc>
+          <w:tcPr>
+            <w:tcW w:type="dxa" w:w="1349"/>
+            <w:tcBorders>
+              <w:top w:val="single" w:color="C9CEC5" w:sz="4"/>
+              <w:left w:val="single" w:color="C9CEC5" w:sz="4"/>
+              <w:bottom w:val="single" w:color="C9CEC5" w:sz="4"/>
+              <w:right w:val="single" w:color="C9CEC5" w:sz="4"/>
+            </w:tcBorders>
+            <w:tcMar>
+              <w:top w:type="dxa" w:w="60"/>
+              <w:left w:type="dxa" w:w="90"/>
+              <w:bottom w:type="dxa" w:w="60"/>
+              <w:right w:type="dxa" w:w="90"/>
+            </w:tcMar>
+            <w:vAlign w:val="top"/>
+          </w:tcPr>
+          <w:p>
+            <w:pPr>
+              <w:spacing w:after="20"/>
+              <w:jc w:val="left"/>
+            </w:pPr>
+            <w:r>
+              <w:rPr>
+                <w:b w:val="false"/>
+                <w:bCs w:val="false"/>
+                <w:color w:val="1A1F1B"/>
+                <w:sz w:val="16"/>
+                <w:szCs w:val="16"/>
+              </w:rPr>
+              <w:t xml:space="preserve">1.30 : 1</w:t>
+            </w:r>
+          </w:p>
+        </w:tc>
+        <w:tc>
+          <w:tcPr>
+            <w:tcW w:type="dxa" w:w="1929"/>
+            <w:tcBorders>
+              <w:top w:val="single" w:color="C9CEC5" w:sz="4"/>
+              <w:left w:val="single" w:color="C9CEC5" w:sz="4"/>
+              <w:bottom w:val="single" w:color="C9CEC5" w:sz="4"/>
+              <w:right w:val="single" w:color="C9CEC5" w:sz="4"/>
+            </w:tcBorders>
+            <w:tcMar>
+              <w:top w:type="dxa" w:w="60"/>
+              <w:left w:type="dxa" w:w="90"/>
+              <w:bottom w:type="dxa" w:w="60"/>
+              <w:right w:type="dxa" w:w="90"/>
+            </w:tcMar>
+            <w:vAlign w:val="top"/>
+          </w:tcPr>
+          <w:p>
+            <w:pPr>
+              <w:spacing w:after="20"/>
+              <w:jc w:val="left"/>
+            </w:pPr>
+            <w:r>
+              <w:rPr>
+                <w:b w:val="false"/>
+                <w:bCs w:val="false"/>
+                <w:color w:val="1A1F1B"/>
+                <w:sz w:val="16"/>
+                <w:szCs w:val="16"/>
+              </w:rPr>
+              <w:t xml:space="preserve">yes, it did</w:t>
+            </w:r>
+          </w:p>
+        </w:tc>
+      </w:tr>
+      <w:tr>
+        <w:trPr>
+          <w:cantSplit/>
+        </w:trPr>
+        <w:tc>
+          <w:tcPr>
+            <w:tcW w:type="dxa" w:w="4626"/>
+            <w:tcBorders>
+              <w:top w:val="single" w:color="C9CEC5" w:sz="4"/>
+              <w:left w:val="single" w:color="C9CEC5" w:sz="4"/>
+              <w:bottom w:val="single" w:color="C9CEC5" w:sz="4"/>
+              <w:right w:val="single" w:color="C9CEC5" w:sz="4"/>
+            </w:tcBorders>
+            <w:shd w:fill="F1F3EF" w:color="auto" w:val="clear"/>
+            <w:tcMar>
+              <w:top w:type="dxa" w:w="60"/>
+              <w:left w:type="dxa" w:w="90"/>
+              <w:bottom w:type="dxa" w:w="60"/>
+              <w:right w:type="dxa" w:w="90"/>
+            </w:tcMar>
+            <w:vAlign w:val="top"/>
+          </w:tcPr>
+          <w:p>
+            <w:pPr>
+              <w:spacing w:after="20"/>
+              <w:jc w:val="left"/>
+            </w:pPr>
+            <w:r>
+              <w:rPr>
+                <w:b w:val="false"/>
+                <w:bCs w:val="false"/>
+                <w:color w:val="1A1F1B"/>
+                <w:sz w:val="16"/>
+                <w:szCs w:val="16"/>
+              </w:rPr>
+              <w:t xml:space="preserve">Rwanda (via M23) against DR Congo, 2021–2022</w:t>
+            </w:r>
+          </w:p>
+        </w:tc>
+        <w:tc>
+          <w:tcPr>
+            <w:tcW w:type="dxa" w:w="1734"/>
+            <w:tcBorders>
+              <w:top w:val="single" w:color="C9CEC5" w:sz="4"/>
+              <w:left w:val="single" w:color="C9CEC5" w:sz="4"/>
+              <w:bottom w:val="single" w:color="C9CEC5" w:sz="4"/>
+              <w:right w:val="single" w:color="C9CEC5" w:sz="4"/>
+            </w:tcBorders>
+            <w:shd w:fill="F1F3EF" w:color="auto" w:val="clear"/>
+            <w:tcMar>
+              <w:top w:type="dxa" w:w="60"/>
+              <w:left w:type="dxa" w:w="90"/>
+              <w:bottom w:type="dxa" w:w="60"/>
+              <w:right w:type="dxa" w:w="90"/>
+            </w:tcMar>
+            <w:vAlign w:val="top"/>
+          </w:tcPr>
+          <w:p>
+            <w:pPr>
+              <w:spacing w:after="20"/>
+              <w:jc w:val="left"/>
+            </w:pPr>
+            <w:r>
+              <w:rPr>
+                <w:b w:val="false"/>
+                <w:bCs w:val="false"/>
+                <w:color w:val="1A1F1B"/>
+                <w:sz w:val="16"/>
+                <w:szCs w:val="16"/>
+              </w:rPr>
+              <w:t xml:space="preserve">1.19 : 1</w:t>
+            </w:r>
+          </w:p>
+        </w:tc>
+        <w:tc>
+          <w:tcPr>
+            <w:tcW w:type="dxa" w:w="1349"/>
+            <w:tcBorders>
+              <w:top w:val="single" w:color="C9CEC5" w:sz="4"/>
+              <w:left w:val="single" w:color="C9CEC5" w:sz="4"/>
+              <w:bottom w:val="single" w:color="C9CEC5" w:sz="4"/>
+              <w:right w:val="single" w:color="C9CEC5" w:sz="4"/>
+            </w:tcBorders>
+            <w:shd w:fill="F1F3EF" w:color="auto" w:val="clear"/>
+            <w:tcMar>
+              <w:top w:type="dxa" w:w="60"/>
+              <w:left w:type="dxa" w:w="90"/>
+              <w:bottom w:type="dxa" w:w="60"/>
+              <w:right w:type="dxa" w:w="90"/>
+            </w:tcMar>
+            <w:vAlign w:val="top"/>
+          </w:tcPr>
+          <w:p>
+            <w:pPr>
+              <w:spacing w:after="20"/>
+              <w:jc w:val="left"/>
+            </w:pPr>
+            <w:r>
+              <w:rPr>
+                <w:b w:val="false"/>
+                <w:bCs w:val="false"/>
+                <w:color w:val="1A1F1B"/>
+                <w:sz w:val="16"/>
+                <w:szCs w:val="16"/>
+              </w:rPr>
+              <w:t xml:space="preserve">1.00 : 1</w:t>
+            </w:r>
+          </w:p>
+        </w:tc>
+        <w:tc>
+          <w:tcPr>
+            <w:tcW w:type="dxa" w:w="1929"/>
+            <w:tcBorders>
+              <w:top w:val="single" w:color="C9CEC5" w:sz="4"/>
+              <w:left w:val="single" w:color="C9CEC5" w:sz="4"/>
+              <w:bottom w:val="single" w:color="C9CEC5" w:sz="4"/>
+              <w:right w:val="single" w:color="C9CEC5" w:sz="4"/>
+            </w:tcBorders>
+            <w:shd w:fill="F1F3EF" w:color="auto" w:val="clear"/>
+            <w:tcMar>
+              <w:top w:type="dxa" w:w="60"/>
+              <w:left w:type="dxa" w:w="90"/>
+              <w:bottom w:type="dxa" w:w="60"/>
+              <w:right w:type="dxa" w:w="90"/>
+            </w:tcMar>
+            <w:vAlign w:val="top"/>
+          </w:tcPr>
+          <w:p>
+            <w:pPr>
+              <w:spacing w:after="20"/>
+              <w:jc w:val="left"/>
+            </w:pPr>
+            <w:r>
+              <w:rPr>
+                <w:b w:val="false"/>
+                <w:bCs w:val="false"/>
+                <w:color w:val="1A1F1B"/>
+                <w:sz w:val="16"/>
+                <w:szCs w:val="16"/>
+              </w:rPr>
+              <w:t xml:space="preserve">no, it did not</w:t>
+            </w:r>
+          </w:p>
+        </w:tc>
+      </w:tr>
+      <w:tr>
+        <w:trPr>
+          <w:cantSplit/>
+        </w:trPr>
+        <w:tc>
+          <w:tcPr>
+            <w:tcW w:type="dxa" w:w="4626"/>
+            <w:tcBorders>
+              <w:top w:val="single" w:color="C9CEC5" w:sz="4"/>
+              <w:left w:val="single" w:color="C9CEC5" w:sz="4"/>
+              <w:bottom w:val="single" w:color="C9CEC5" w:sz="4"/>
+              <w:right w:val="single" w:color="C9CEC5" w:sz="4"/>
+            </w:tcBorders>
+            <w:tcMar>
+              <w:top w:type="dxa" w:w="60"/>
+              <w:left w:type="dxa" w:w="90"/>
+              <w:bottom w:type="dxa" w:w="60"/>
+              <w:right w:type="dxa" w:w="90"/>
+            </w:tcMar>
+            <w:vAlign w:val="top"/>
+          </w:tcPr>
+          <w:p>
+            <w:pPr>
+              <w:spacing w:after="20"/>
+              <w:jc w:val="left"/>
+            </w:pPr>
+            <w:r>
+              <w:rPr>
+                <w:b w:val="false"/>
+                <w:bCs w:val="false"/>
+                <w:color w:val="1A1F1B"/>
+                <w:sz w:val="16"/>
+                <w:szCs w:val="16"/>
+              </w:rPr>
+              <w:t xml:space="preserve">China versus India, Ladakh, 2020</w:t>
+            </w:r>
+          </w:p>
+        </w:tc>
+        <w:tc>
+          <w:tcPr>
+            <w:tcW w:type="dxa" w:w="1734"/>
+            <w:tcBorders>
+              <w:top w:val="single" w:color="C9CEC5" w:sz="4"/>
+              <w:left w:val="single" w:color="C9CEC5" w:sz="4"/>
+              <w:bottom w:val="single" w:color="C9CEC5" w:sz="4"/>
+              <w:right w:val="single" w:color="C9CEC5" w:sz="4"/>
+            </w:tcBorders>
+            <w:tcMar>
+              <w:top w:type="dxa" w:w="60"/>
+              <w:left w:type="dxa" w:w="90"/>
+              <w:bottom w:type="dxa" w:w="60"/>
+              <w:right w:type="dxa" w:w="90"/>
+            </w:tcMar>
+            <w:vAlign w:val="top"/>
+          </w:tcPr>
+          <w:p>
+            <w:pPr>
+              <w:spacing w:after="20"/>
+              <w:jc w:val="left"/>
+            </w:pPr>
+            <w:r>
+              <w:rPr>
+                <w:b w:val="false"/>
+                <w:bCs w:val="false"/>
+                <w:color w:val="1A1F1B"/>
+                <w:sz w:val="16"/>
+                <w:szCs w:val="16"/>
+              </w:rPr>
+              <w:t xml:space="preserve">1.49 : 1</w:t>
+            </w:r>
+          </w:p>
+        </w:tc>
+        <w:tc>
+          <w:tcPr>
+            <w:tcW w:type="dxa" w:w="1349"/>
+            <w:tcBorders>
+              <w:top w:val="single" w:color="C9CEC5" w:sz="4"/>
+              <w:left w:val="single" w:color="C9CEC5" w:sz="4"/>
+              <w:bottom w:val="single" w:color="C9CEC5" w:sz="4"/>
+              <w:right w:val="single" w:color="C9CEC5" w:sz="4"/>
+            </w:tcBorders>
+            <w:tcMar>
+              <w:top w:type="dxa" w:w="60"/>
+              <w:left w:type="dxa" w:w="90"/>
+              <w:bottom w:type="dxa" w:w="60"/>
+              <w:right w:type="dxa" w:w="90"/>
+            </w:tcMar>
+            <w:vAlign w:val="top"/>
+          </w:tcPr>
+          <w:p>
+            <w:pPr>
+              <w:spacing w:after="20"/>
+              <w:jc w:val="left"/>
+            </w:pPr>
+            <w:r>
+              <w:rPr>
+                <w:b w:val="false"/>
+                <w:bCs w:val="false"/>
+                <w:color w:val="1A1F1B"/>
+                <w:sz w:val="16"/>
+                <w:szCs w:val="16"/>
+              </w:rPr>
+              <w:t xml:space="preserve">1.00 : 1</w:t>
+            </w:r>
+          </w:p>
+        </w:tc>
+        <w:tc>
+          <w:tcPr>
+            <w:tcW w:type="dxa" w:w="1929"/>
+            <w:tcBorders>
+              <w:top w:val="single" w:color="C9CEC5" w:sz="4"/>
+              <w:left w:val="single" w:color="C9CEC5" w:sz="4"/>
+              <w:bottom w:val="single" w:color="C9CEC5" w:sz="4"/>
+              <w:right w:val="single" w:color="C9CEC5" w:sz="4"/>
+            </w:tcBorders>
+            <w:tcMar>
+              <w:top w:type="dxa" w:w="60"/>
+              <w:left w:type="dxa" w:w="90"/>
+              <w:bottom w:type="dxa" w:w="60"/>
+              <w:right w:type="dxa" w:w="90"/>
+            </w:tcMar>
+            <w:vAlign w:val="top"/>
+          </w:tcPr>
+          <w:p>
+            <w:pPr>
+              <w:spacing w:after="20"/>
+              <w:jc w:val="left"/>
+            </w:pPr>
+            <w:r>
+              <w:rPr>
+                <w:b w:val="false"/>
+                <w:bCs w:val="false"/>
+                <w:color w:val="1A1F1B"/>
+                <w:sz w:val="16"/>
+                <w:szCs w:val="16"/>
+              </w:rPr>
+              <w:t xml:space="preserve">no, it did not</w:t>
+            </w:r>
+          </w:p>
+        </w:tc>
+      </w:tr>
+      <w:tr>
+        <w:trPr>
+          <w:cantSplit/>
+        </w:trPr>
+        <w:tc>
+          <w:tcPr>
+            <w:tcW w:type="dxa" w:w="4626"/>
+            <w:tcBorders>
+              <w:top w:val="single" w:color="C9CEC5" w:sz="4"/>
+              <w:left w:val="single" w:color="C9CEC5" w:sz="4"/>
+              <w:bottom w:val="single" w:color="C9CEC5" w:sz="4"/>
+              <w:right w:val="single" w:color="C9CEC5" w:sz="4"/>
+            </w:tcBorders>
+            <w:shd w:fill="F1F3EF" w:color="auto" w:val="clear"/>
+            <w:tcMar>
+              <w:top w:type="dxa" w:w="60"/>
+              <w:left w:type="dxa" w:w="90"/>
+              <w:bottom w:type="dxa" w:w="60"/>
+              <w:right w:type="dxa" w:w="90"/>
+            </w:tcMar>
+            <w:vAlign w:val="top"/>
+          </w:tcPr>
+          <w:p>
+            <w:pPr>
+              <w:spacing w:after="20"/>
+              <w:jc w:val="left"/>
+            </w:pPr>
+            <w:r>
+              <w:rPr>
+                <w:b w:val="false"/>
+                <w:bCs w:val="false"/>
+                <w:color w:val="1A1F1B"/>
+                <w:sz w:val="16"/>
+                <w:szCs w:val="16"/>
+              </w:rPr>
+              <w:t xml:space="preserve">Russia versus Ukraine, 2022 invasion</w:t>
+            </w:r>
+          </w:p>
+        </w:tc>
+        <w:tc>
+          <w:tcPr>
+            <w:tcW w:type="dxa" w:w="1734"/>
+            <w:tcBorders>
+              <w:top w:val="single" w:color="C9CEC5" w:sz="4"/>
+              <w:left w:val="single" w:color="C9CEC5" w:sz="4"/>
+              <w:bottom w:val="single" w:color="C9CEC5" w:sz="4"/>
+              <w:right w:val="single" w:color="C9CEC5" w:sz="4"/>
+            </w:tcBorders>
+            <w:shd w:fill="F1F3EF" w:color="auto" w:val="clear"/>
+            <w:tcMar>
+              <w:top w:type="dxa" w:w="60"/>
+              <w:left w:type="dxa" w:w="90"/>
+              <w:bottom w:type="dxa" w:w="60"/>
+              <w:right w:type="dxa" w:w="90"/>
+            </w:tcMar>
+            <w:vAlign w:val="top"/>
+          </w:tcPr>
+          <w:p>
+            <w:pPr>
+              <w:spacing w:after="20"/>
+              <w:jc w:val="left"/>
+            </w:pPr>
+            <w:r>
+              <w:rPr>
+                <w:b w:val="false"/>
+                <w:bCs w:val="false"/>
+                <w:color w:val="1A1F1B"/>
+                <w:sz w:val="16"/>
+                <w:szCs w:val="16"/>
+              </w:rPr>
+              <w:t xml:space="preserve">1.77 : 1</w:t>
+            </w:r>
+          </w:p>
+        </w:tc>
+        <w:tc>
+          <w:tcPr>
+            <w:tcW w:type="dxa" w:w="1349"/>
+            <w:tcBorders>
+              <w:top w:val="single" w:color="C9CEC5" w:sz="4"/>
+              <w:left w:val="single" w:color="C9CEC5" w:sz="4"/>
+              <w:bottom w:val="single" w:color="C9CEC5" w:sz="4"/>
+              <w:right w:val="single" w:color="C9CEC5" w:sz="4"/>
+            </w:tcBorders>
+            <w:shd w:fill="F1F3EF" w:color="auto" w:val="clear"/>
+            <w:tcMar>
+              <w:top w:type="dxa" w:w="60"/>
+              <w:left w:type="dxa" w:w="90"/>
+              <w:bottom w:type="dxa" w:w="60"/>
+              <w:right w:type="dxa" w:w="90"/>
+            </w:tcMar>
+            <w:vAlign w:val="top"/>
+          </w:tcPr>
+          <w:p>
+            <w:pPr>
+              <w:spacing w:after="20"/>
+              <w:jc w:val="left"/>
+            </w:pPr>
+            <w:r>
+              <w:rPr>
+                <w:b w:val="false"/>
+                <w:bCs w:val="false"/>
+                <w:color w:val="1A1F1B"/>
+                <w:sz w:val="16"/>
+                <w:szCs w:val="16"/>
+              </w:rPr>
+              <w:t xml:space="preserve">1.49 : 1</w:t>
+            </w:r>
+          </w:p>
+        </w:tc>
+        <w:tc>
+          <w:tcPr>
+            <w:tcW w:type="dxa" w:w="1929"/>
+            <w:tcBorders>
+              <w:top w:val="single" w:color="C9CEC5" w:sz="4"/>
+              <w:left w:val="single" w:color="C9CEC5" w:sz="4"/>
+              <w:bottom w:val="single" w:color="C9CEC5" w:sz="4"/>
+              <w:right w:val="single" w:color="C9CEC5" w:sz="4"/>
+            </w:tcBorders>
+            <w:shd w:fill="F1F3EF" w:color="auto" w:val="clear"/>
+            <w:tcMar>
+              <w:top w:type="dxa" w:w="60"/>
+              <w:left w:type="dxa" w:w="90"/>
+              <w:bottom w:type="dxa" w:w="60"/>
+              <w:right w:type="dxa" w:w="90"/>
+            </w:tcMar>
+            <w:vAlign w:val="top"/>
+          </w:tcPr>
+          <w:p>
+            <w:pPr>
+              <w:spacing w:after="20"/>
+              <w:jc w:val="left"/>
+            </w:pPr>
+            <w:r>
+              <w:rPr>
+                <w:b w:val="false"/>
+                <w:bCs w:val="false"/>
+                <w:color w:val="1A1F1B"/>
+                <w:sz w:val="16"/>
+                <w:szCs w:val="16"/>
+              </w:rPr>
+              <w:t xml:space="preserve">no, it did not</w:t>
+            </w:r>
+          </w:p>
+        </w:tc>
+      </w:tr>
+      <w:tr>
+        <w:trPr>
+          <w:cantSplit/>
+        </w:trPr>
+        <w:tc>
+          <w:tcPr>
+            <w:tcW w:type="dxa" w:w="4626"/>
+            <w:tcBorders>
+              <w:top w:val="single" w:color="C9CEC5" w:sz="4"/>
+              <w:left w:val="single" w:color="C9CEC5" w:sz="4"/>
+              <w:bottom w:val="single" w:color="C9CEC5" w:sz="4"/>
+              <w:right w:val="single" w:color="C9CEC5" w:sz="4"/>
+            </w:tcBorders>
+            <w:tcMar>
+              <w:top w:type="dxa" w:w="60"/>
+              <w:left w:type="dxa" w:w="90"/>
+              <w:bottom w:type="dxa" w:w="60"/>
+              <w:right w:type="dxa" w:w="90"/>
+            </w:tcMar>
+            <w:vAlign w:val="top"/>
+          </w:tcPr>
+          <w:p>
+            <w:pPr>
+              <w:spacing w:after="20"/>
+              <w:jc w:val="left"/>
+            </w:pPr>
+            <w:r>
+              <w:rPr>
+                <w:b w:val="false"/>
+                <w:bCs w:val="false"/>
+                <w:color w:val="1A1F1B"/>
+                <w:sz w:val="16"/>
+                <w:szCs w:val="16"/>
+              </w:rPr>
+              <w:t xml:space="preserve">Azerbaijan against Armenia, Karabakh, 2020</w:t>
+            </w:r>
+          </w:p>
+        </w:tc>
+        <w:tc>
+          <w:tcPr>
+            <w:tcW w:type="dxa" w:w="1734"/>
+            <w:tcBorders>
+              <w:top w:val="single" w:color="C9CEC5" w:sz="4"/>
+              <w:left w:val="single" w:color="C9CEC5" w:sz="4"/>
+              <w:bottom w:val="single" w:color="C9CEC5" w:sz="4"/>
+              <w:right w:val="single" w:color="C9CEC5" w:sz="4"/>
+            </w:tcBorders>
+            <w:tcMar>
+              <w:top w:type="dxa" w:w="60"/>
+              <w:left w:type="dxa" w:w="90"/>
+              <w:bottom w:type="dxa" w:w="60"/>
+              <w:right w:type="dxa" w:w="90"/>
+            </w:tcMar>
+            <w:vAlign w:val="top"/>
+          </w:tcPr>
+          <w:p>
+            <w:pPr>
+              <w:spacing w:after="20"/>
+              <w:jc w:val="left"/>
+            </w:pPr>
+            <w:r>
+              <w:rPr>
+                <w:b w:val="false"/>
+                <w:bCs w:val="false"/>
+                <w:color w:val="1A1F1B"/>
+                <w:sz w:val="16"/>
+                <w:szCs w:val="16"/>
+              </w:rPr>
+              <w:t xml:space="preserve">1.84 : 1</w:t>
+            </w:r>
+          </w:p>
+        </w:tc>
+        <w:tc>
+          <w:tcPr>
+            <w:tcW w:type="dxa" w:w="1349"/>
+            <w:tcBorders>
+              <w:top w:val="single" w:color="C9CEC5" w:sz="4"/>
+              <w:left w:val="single" w:color="C9CEC5" w:sz="4"/>
+              <w:bottom w:val="single" w:color="C9CEC5" w:sz="4"/>
+              <w:right w:val="single" w:color="C9CEC5" w:sz="4"/>
+            </w:tcBorders>
+            <w:tcMar>
+              <w:top w:type="dxa" w:w="60"/>
+              <w:left w:type="dxa" w:w="90"/>
+              <w:bottom w:type="dxa" w:w="60"/>
+              <w:right w:type="dxa" w:w="90"/>
+            </w:tcMar>
+            <w:vAlign w:val="top"/>
+          </w:tcPr>
+          <w:p>
+            <w:pPr>
+              <w:spacing w:after="20"/>
+              <w:jc w:val="left"/>
+            </w:pPr>
+            <w:r>
+              <w:rPr>
+                <w:b w:val="false"/>
+                <w:bCs w:val="false"/>
+                <w:color w:val="1A1F1B"/>
+                <w:sz w:val="16"/>
+                <w:szCs w:val="16"/>
+              </w:rPr>
+              <w:t xml:space="preserve">0.87 : 1</w:t>
+            </w:r>
+          </w:p>
+        </w:tc>
+        <w:tc>
+          <w:tcPr>
+            <w:tcW w:type="dxa" w:w="1929"/>
+            <w:tcBorders>
+              <w:top w:val="single" w:color="C9CEC5" w:sz="4"/>
+              <w:left w:val="single" w:color="C9CEC5" w:sz="4"/>
+              <w:bottom w:val="single" w:color="C9CEC5" w:sz="4"/>
+              <w:right w:val="single" w:color="C9CEC5" w:sz="4"/>
+            </w:tcBorders>
+            <w:tcMar>
+              <w:top w:type="dxa" w:w="60"/>
+              <w:left w:type="dxa" w:w="90"/>
+              <w:bottom w:type="dxa" w:w="60"/>
+              <w:right w:type="dxa" w:w="90"/>
+            </w:tcMar>
+            <w:vAlign w:val="top"/>
+          </w:tcPr>
+          <w:p>
+            <w:pPr>
+              <w:spacing w:after="20"/>
+              <w:jc w:val="left"/>
+            </w:pPr>
+            <w:r>
+              <w:rPr>
+                <w:b w:val="false"/>
+                <w:bCs w:val="false"/>
+                <w:color w:val="1A1F1B"/>
+                <w:sz w:val="16"/>
+                <w:szCs w:val="16"/>
+              </w:rPr>
+              <w:t xml:space="preserve">yes, it did</w:t>
+            </w:r>
+          </w:p>
+        </w:tc>
+      </w:tr>
+      <w:tr>
+        <w:trPr>
+          <w:cantSplit/>
+        </w:trPr>
+        <w:tc>
+          <w:tcPr>
+            <w:tcW w:type="dxa" w:w="4626"/>
+            <w:tcBorders>
+              <w:top w:val="single" w:color="C9CEC5" w:sz="4"/>
+              <w:left w:val="single" w:color="C9CEC5" w:sz="4"/>
+              <w:bottom w:val="single" w:color="C9CEC5" w:sz="4"/>
+              <w:right w:val="single" w:color="C9CEC5" w:sz="4"/>
+            </w:tcBorders>
+            <w:shd w:fill="F1F3EF" w:color="auto" w:val="clear"/>
+            <w:tcMar>
+              <w:top w:type="dxa" w:w="60"/>
+              <w:left w:type="dxa" w:w="90"/>
+              <w:bottom w:type="dxa" w:w="60"/>
+              <w:right w:type="dxa" w:w="90"/>
+            </w:tcMar>
+            <w:vAlign w:val="top"/>
+          </w:tcPr>
+          <w:p>
+            <w:pPr>
+              <w:spacing w:after="20"/>
+              <w:jc w:val="left"/>
+            </w:pPr>
+            <w:r>
+              <w:rPr>
+                <w:b w:val="false"/>
+                <w:bCs w:val="false"/>
+                <w:color w:val="1A1F1B"/>
+                <w:sz w:val="16"/>
+                <w:szCs w:val="16"/>
+              </w:rPr>
+              <w:t xml:space="preserve">India against Pakistan, May 2025</w:t>
+            </w:r>
+          </w:p>
+        </w:tc>
+        <w:tc>
+          <w:tcPr>
+            <w:tcW w:type="dxa" w:w="1734"/>
+            <w:tcBorders>
+              <w:top w:val="single" w:color="C9CEC5" w:sz="4"/>
+              <w:left w:val="single" w:color="C9CEC5" w:sz="4"/>
+              <w:bottom w:val="single" w:color="C9CEC5" w:sz="4"/>
+              <w:right w:val="single" w:color="C9CEC5" w:sz="4"/>
+            </w:tcBorders>
+            <w:shd w:fill="F1F3EF" w:color="auto" w:val="clear"/>
+            <w:tcMar>
+              <w:top w:type="dxa" w:w="60"/>
+              <w:left w:type="dxa" w:w="90"/>
+              <w:bottom w:type="dxa" w:w="60"/>
+              <w:right w:type="dxa" w:w="90"/>
+            </w:tcMar>
+            <w:vAlign w:val="top"/>
+          </w:tcPr>
+          <w:p>
+            <w:pPr>
+              <w:spacing w:after="20"/>
+              <w:jc w:val="left"/>
+            </w:pPr>
+            <w:r>
+              <w:rPr>
+                <w:b w:val="false"/>
+                <w:bCs w:val="false"/>
+                <w:color w:val="1A1F1B"/>
+                <w:sz w:val="16"/>
+                <w:szCs w:val="16"/>
+              </w:rPr>
+              <w:t xml:space="preserve">3.94 : 1</w:t>
+            </w:r>
+          </w:p>
+        </w:tc>
+        <w:tc>
+          <w:tcPr>
+            <w:tcW w:type="dxa" w:w="1349"/>
+            <w:tcBorders>
+              <w:top w:val="single" w:color="C9CEC5" w:sz="4"/>
+              <w:left w:val="single" w:color="C9CEC5" w:sz="4"/>
+              <w:bottom w:val="single" w:color="C9CEC5" w:sz="4"/>
+              <w:right w:val="single" w:color="C9CEC5" w:sz="4"/>
+            </w:tcBorders>
+            <w:shd w:fill="F1F3EF" w:color="auto" w:val="clear"/>
+            <w:tcMar>
+              <w:top w:type="dxa" w:w="60"/>
+              <w:left w:type="dxa" w:w="90"/>
+              <w:bottom w:type="dxa" w:w="60"/>
+              <w:right w:type="dxa" w:w="90"/>
+            </w:tcMar>
+            <w:vAlign w:val="top"/>
+          </w:tcPr>
+          <w:p>
+            <w:pPr>
+              <w:spacing w:after="20"/>
+              <w:jc w:val="left"/>
+            </w:pPr>
+            <w:r>
+              <w:rPr>
+                <w:b w:val="false"/>
+                <w:bCs w:val="false"/>
+                <w:color w:val="1A1F1B"/>
+                <w:sz w:val="16"/>
+                <w:szCs w:val="16"/>
+              </w:rPr>
+              <w:t xml:space="preserve">1.30 : 1</w:t>
+            </w:r>
+          </w:p>
+        </w:tc>
+        <w:tc>
+          <w:tcPr>
+            <w:tcW w:type="dxa" w:w="1929"/>
+            <w:tcBorders>
+              <w:top w:val="single" w:color="C9CEC5" w:sz="4"/>
+              <w:left w:val="single" w:color="C9CEC5" w:sz="4"/>
+              <w:bottom w:val="single" w:color="C9CEC5" w:sz="4"/>
+              <w:right w:val="single" w:color="C9CEC5" w:sz="4"/>
+            </w:tcBorders>
+            <w:shd w:fill="F1F3EF" w:color="auto" w:val="clear"/>
+            <w:tcMar>
+              <w:top w:type="dxa" w:w="60"/>
+              <w:left w:type="dxa" w:w="90"/>
+              <w:bottom w:type="dxa" w:w="60"/>
+              <w:right w:type="dxa" w:w="90"/>
+            </w:tcMar>
+            <w:vAlign w:val="top"/>
+          </w:tcPr>
+          <w:p>
+            <w:pPr>
+              <w:spacing w:after="20"/>
+              <w:jc w:val="left"/>
+            </w:pPr>
+            <w:r>
+              <w:rPr>
+                <w:b w:val="false"/>
+                <w:bCs w:val="false"/>
+                <w:color w:val="1A1F1B"/>
+                <w:sz w:val="16"/>
+                <w:szCs w:val="16"/>
+              </w:rPr>
+              <w:t xml:space="preserve">no, it did not</w:t>
+            </w:r>
+          </w:p>
+        </w:tc>
+      </w:tr>
+      <w:tr>
+        <w:trPr>
+          <w:cantSplit/>
+        </w:trPr>
+        <w:tc>
+          <w:tcPr>
+            <w:tcW w:type="dxa" w:w="4626"/>
+            <w:tcBorders>
+              <w:top w:val="single" w:color="C9CEC5" w:sz="4"/>
+              <w:left w:val="single" w:color="C9CEC5" w:sz="4"/>
+              <w:bottom w:val="single" w:color="C9CEC5" w:sz="4"/>
+              <w:right w:val="single" w:color="C9CEC5" w:sz="4"/>
+            </w:tcBorders>
+            <w:tcMar>
+              <w:top w:type="dxa" w:w="60"/>
+              <w:left w:type="dxa" w:w="90"/>
+              <w:bottom w:type="dxa" w:w="60"/>
+              <w:right w:type="dxa" w:w="90"/>
+            </w:tcMar>
+            <w:vAlign w:val="top"/>
+          </w:tcPr>
+          <w:p>
+            <w:pPr>
+              <w:spacing w:after="20"/>
+              <w:jc w:val="left"/>
+            </w:pPr>
+            <w:r>
+              <w:rPr>
+                <w:b w:val="false"/>
+                <w:bCs w:val="false"/>
+                <w:color w:val="1A1F1B"/>
+                <w:sz w:val="16"/>
+                <w:szCs w:val="16"/>
+              </w:rPr>
+              <w:t xml:space="preserve">Pakistan versus Afghanistan, 2024</w:t>
+            </w:r>
+          </w:p>
+        </w:tc>
+        <w:tc>
+          <w:tcPr>
+            <w:tcW w:type="dxa" w:w="1734"/>
+            <w:tcBorders>
+              <w:top w:val="single" w:color="C9CEC5" w:sz="4"/>
+              <w:left w:val="single" w:color="C9CEC5" w:sz="4"/>
+              <w:bottom w:val="single" w:color="C9CEC5" w:sz="4"/>
+              <w:right w:val="single" w:color="C9CEC5" w:sz="4"/>
+            </w:tcBorders>
+            <w:tcMar>
+              <w:top w:type="dxa" w:w="60"/>
+              <w:left w:type="dxa" w:w="90"/>
+              <w:bottom w:type="dxa" w:w="60"/>
+              <w:right w:type="dxa" w:w="90"/>
+            </w:tcMar>
+            <w:vAlign w:val="top"/>
+          </w:tcPr>
+          <w:p>
+            <w:pPr>
+              <w:spacing w:after="20"/>
+              <w:jc w:val="left"/>
+            </w:pPr>
+            <w:r>
+              <w:rPr>
+                <w:b w:val="false"/>
+                <w:bCs w:val="false"/>
+                <w:color w:val="1A1F1B"/>
+                <w:sz w:val="16"/>
+                <w:szCs w:val="16"/>
+              </w:rPr>
+              <w:t xml:space="preserve">6.84 : 1</w:t>
+            </w:r>
+          </w:p>
+        </w:tc>
+        <w:tc>
+          <w:tcPr>
+            <w:tcW w:type="dxa" w:w="1349"/>
+            <w:tcBorders>
+              <w:top w:val="single" w:color="C9CEC5" w:sz="4"/>
+              <w:left w:val="single" w:color="C9CEC5" w:sz="4"/>
+              <w:bottom w:val="single" w:color="C9CEC5" w:sz="4"/>
+              <w:right w:val="single" w:color="C9CEC5" w:sz="4"/>
+            </w:tcBorders>
+            <w:tcMar>
+              <w:top w:type="dxa" w:w="60"/>
+              <w:left w:type="dxa" w:w="90"/>
+              <w:bottom w:type="dxa" w:w="60"/>
+              <w:right w:type="dxa" w:w="90"/>
+            </w:tcMar>
+            <w:vAlign w:val="top"/>
+          </w:tcPr>
+          <w:p>
+            <w:pPr>
+              <w:spacing w:after="20"/>
+              <w:jc w:val="left"/>
+            </w:pPr>
+            <w:r>
+              <w:rPr>
+                <w:b w:val="false"/>
+                <w:bCs w:val="false"/>
+                <w:color w:val="1A1F1B"/>
+                <w:sz w:val="16"/>
+                <w:szCs w:val="16"/>
+              </w:rPr>
+              <w:t xml:space="preserve">1.30 : 1</w:t>
+            </w:r>
+          </w:p>
+        </w:tc>
+        <w:tc>
+          <w:tcPr>
+            <w:tcW w:type="dxa" w:w="1929"/>
+            <w:tcBorders>
+              <w:top w:val="single" w:color="C9CEC5" w:sz="4"/>
+              <w:left w:val="single" w:color="C9CEC5" w:sz="4"/>
+              <w:bottom w:val="single" w:color="C9CEC5" w:sz="4"/>
+              <w:right w:val="single" w:color="C9CEC5" w:sz="4"/>
+            </w:tcBorders>
+            <w:tcMar>
+              <w:top w:type="dxa" w:w="60"/>
+              <w:left w:type="dxa" w:w="90"/>
+              <w:bottom w:type="dxa" w:w="60"/>
+              <w:right w:type="dxa" w:w="90"/>
+            </w:tcMar>
+            <w:vAlign w:val="top"/>
+          </w:tcPr>
+          <w:p>
+            <w:pPr>
+              <w:spacing w:after="20"/>
+              <w:jc w:val="left"/>
+            </w:pPr>
+            <w:r>
+              <w:rPr>
+                <w:b w:val="false"/>
+                <w:bCs w:val="false"/>
+                <w:color w:val="1A1F1B"/>
+                <w:sz w:val="16"/>
+                <w:szCs w:val="16"/>
+              </w:rPr>
+              <w:t xml:space="preserve">no, it did not</w:t>
+            </w:r>
+          </w:p>
+        </w:tc>
+      </w:tr>
+      <w:tr>
+        <w:trPr>
+          <w:cantSplit/>
+        </w:trPr>
+        <w:tc>
+          <w:tcPr>
+            <w:tcW w:type="dxa" w:w="4626"/>
+            <w:tcBorders>
+              <w:top w:val="single" w:color="C9CEC5" w:sz="4"/>
+              <w:left w:val="single" w:color="C9CEC5" w:sz="4"/>
+              <w:bottom w:val="single" w:color="C9CEC5" w:sz="4"/>
+              <w:right w:val="single" w:color="C9CEC5" w:sz="4"/>
+            </w:tcBorders>
+            <w:shd w:fill="F1F3EF" w:color="auto" w:val="clear"/>
+            <w:tcMar>
+              <w:top w:type="dxa" w:w="60"/>
+              <w:left w:type="dxa" w:w="90"/>
+              <w:bottom w:type="dxa" w:w="60"/>
+              <w:right w:type="dxa" w:w="90"/>
+            </w:tcMar>
+            <w:vAlign w:val="top"/>
+          </w:tcPr>
+          <w:p>
+            <w:pPr>
+              <w:spacing w:after="20"/>
+              <w:jc w:val="left"/>
+            </w:pPr>
+            <w:r>
+              <w:rPr>
+                <w:b w:val="false"/>
+                <w:bCs w:val="false"/>
+                <w:color w:val="1A1F1B"/>
+                <w:sz w:val="16"/>
+                <w:szCs w:val="16"/>
+              </w:rPr>
+              <w:t xml:space="preserve">Russia versus Ukraine, 2023 offensive</w:t>
+            </w:r>
+          </w:p>
+        </w:tc>
+        <w:tc>
+          <w:tcPr>
+            <w:tcW w:type="dxa" w:w="1734"/>
+            <w:tcBorders>
+              <w:top w:val="single" w:color="C9CEC5" w:sz="4"/>
+              <w:left w:val="single" w:color="C9CEC5" w:sz="4"/>
+              <w:bottom w:val="single" w:color="C9CEC5" w:sz="4"/>
+              <w:right w:val="single" w:color="C9CEC5" w:sz="4"/>
+            </w:tcBorders>
+            <w:shd w:fill="F1F3EF" w:color="auto" w:val="clear"/>
+            <w:tcMar>
+              <w:top w:type="dxa" w:w="60"/>
+              <w:left w:type="dxa" w:w="90"/>
+              <w:bottom w:type="dxa" w:w="60"/>
+              <w:right w:type="dxa" w:w="90"/>
+            </w:tcMar>
+            <w:vAlign w:val="top"/>
+          </w:tcPr>
+          <w:p>
+            <w:pPr>
+              <w:spacing w:after="20"/>
+              <w:jc w:val="left"/>
+            </w:pPr>
+            <w:r>
+              <w:rPr>
+                <w:b w:val="false"/>
+                <w:bCs w:val="false"/>
+                <w:color w:val="1A1F1B"/>
+                <w:sz w:val="16"/>
+                <w:szCs w:val="16"/>
+              </w:rPr>
+              <w:t xml:space="preserve">8.83 : 1</w:t>
+            </w:r>
+          </w:p>
+        </w:tc>
+        <w:tc>
+          <w:tcPr>
+            <w:tcW w:type="dxa" w:w="1349"/>
+            <w:tcBorders>
+              <w:top w:val="single" w:color="C9CEC5" w:sz="4"/>
+              <w:left w:val="single" w:color="C9CEC5" w:sz="4"/>
+              <w:bottom w:val="single" w:color="C9CEC5" w:sz="4"/>
+              <w:right w:val="single" w:color="C9CEC5" w:sz="4"/>
+            </w:tcBorders>
+            <w:shd w:fill="F1F3EF" w:color="auto" w:val="clear"/>
+            <w:tcMar>
+              <w:top w:type="dxa" w:w="60"/>
+              <w:left w:type="dxa" w:w="90"/>
+              <w:bottom w:type="dxa" w:w="60"/>
+              <w:right w:type="dxa" w:w="90"/>
+            </w:tcMar>
+            <w:vAlign w:val="top"/>
+          </w:tcPr>
+          <w:p>
+            <w:pPr>
+              <w:spacing w:after="20"/>
+              <w:jc w:val="left"/>
+            </w:pPr>
+            <w:r>
+              <w:rPr>
+                <w:b w:val="false"/>
+                <w:bCs w:val="false"/>
+                <w:color w:val="1A1F1B"/>
+                <w:sz w:val="16"/>
+                <w:szCs w:val="16"/>
+              </w:rPr>
+              <w:t xml:space="preserve">1.15 : 1</w:t>
+            </w:r>
+          </w:p>
+        </w:tc>
+        <w:tc>
+          <w:tcPr>
+            <w:tcW w:type="dxa" w:w="1929"/>
+            <w:tcBorders>
+              <w:top w:val="single" w:color="C9CEC5" w:sz="4"/>
+              <w:left w:val="single" w:color="C9CEC5" w:sz="4"/>
+              <w:bottom w:val="single" w:color="C9CEC5" w:sz="4"/>
+              <w:right w:val="single" w:color="C9CEC5" w:sz="4"/>
+            </w:tcBorders>
+            <w:shd w:fill="F1F3EF" w:color="auto" w:val="clear"/>
+            <w:tcMar>
+              <w:top w:type="dxa" w:w="60"/>
+              <w:left w:type="dxa" w:w="90"/>
+              <w:bottom w:type="dxa" w:w="60"/>
+              <w:right w:type="dxa" w:w="90"/>
+            </w:tcMar>
+            <w:vAlign w:val="top"/>
+          </w:tcPr>
+          <w:p>
+            <w:pPr>
+              <w:spacing w:after="20"/>
+              <w:jc w:val="left"/>
+            </w:pPr>
+            <w:r>
+              <w:rPr>
+                <w:b w:val="false"/>
+                <w:bCs w:val="false"/>
+                <w:color w:val="1A1F1B"/>
+                <w:sz w:val="16"/>
+                <w:szCs w:val="16"/>
+              </w:rPr>
+              <w:t xml:space="preserve">no, it did not</w:t>
+            </w:r>
+          </w:p>
+        </w:tc>
+      </w:tr>
+    </w:tbl>
+    <w:p>
+      <w:pPr>
+        <w:spacing w:after="120"/>
+      </w:pPr>
+    </w:p>
+    <w:p>
+      <w:pPr>
+        <w:spacing w:after="120" w:line="288"/>
+        <w:jc w:val="both"/>
+      </w:pPr>
+      <w:r>
+        <w:t xml:space="preserve">AUC = 0.13 (the protocol expected at least 0.70), permutation probability in favour of superiority 0.98: the rule “the order of the index is informative” is not met. Yet the value is not “about 0.5” but substantially lower — the order of the index is </w:t>
+      </w:r>
+      <w:r>
+        <w:rPr>
+          <w:b/>
+          <w:bCs/>
+        </w:rPr>
+        <w:t xml:space="preserve">opposite</w:t>
+      </w:r>
+      <w:r>
+        <w:t xml:space="preserve"> to the outcome. Outside the protocol (after the calculation, hence exploratory): the exact permutation p for the inverse relationship is 0.033 (one-sided) and 0.067 (two-sided). The five attackers with the largest advantage by the index (India 2025, Pakistan 2024, Russia 2023 and 2022, China against India 2020) did not achieve their aims; Israel, whose index is weaker or equal, did.</w:t>
+      </w:r>
+    </w:p>
+    <w:p>
+      <w:pPr>
+        <w:pBdr>
+          <w:left w:val="single" w:color="9F2F27" w:sz="18" w:space="8"/>
+        </w:pBdr>
+        <w:shd w:fill="F4EEE9" w:color="auto" w:val="clear"/>
+        <w:spacing w:after="160" w:before="120" w:line="276"/>
+        <w:ind w:left="200" w:right="120"/>
+      </w:pPr>
+      <w:r>
+        <w:rPr>
+          <w:b/>
+          <w:bCs/>
+          <w:color w:val="9F2F27"/>
+        </w:rPr>
+        <w:t xml:space="preserve">Caveat. </w:t>
+      </w:r>
+      <w:r>
+        <w:t xml:space="preserve">Ten cases are few and not independent (Russia 2022 and 2023 are one war; the two Rwanda cases are one theme); the inverse order is not a hypothesis of the protocol but an observation after the calculation. The conclusion is cautious: the order of an index of resources does not predict the success of an offensive, because the index measures size, not effectiveness (section 4.4). For forecasting wars the index should be presented as an ordinal estimate of resources, without conversion into “strength” and without the promise that a larger advantage means a better chance.</w:t>
+      </w:r>
+    </w:p>
+    <w:p>
+      <w:pPr>
         <w:pStyle w:val="Heading1"/>
         <w:pageBreakBefore/>
       </w:pPr>
-      <w:bookmarkStart w:name="_Toc203" w:id="203"/>
+      <w:bookmarkStart w:name="_Toc205" w:id="205"/>
       <w:r>
         <w:t xml:space="preserve">5. Analysis of common claims</w:t>
       </w:r>
-      <w:bookmarkEnd w:id="203"/>
+      <w:bookmarkEnd w:id="205"/>
     </w:p>
     <w:p>
       <w:pPr>
@@ -8564,21 +11083,21 @@
         <w:pStyle w:val="Heading1"/>
         <w:pageBreakBefore/>
       </w:pPr>
-      <w:bookmarkStart w:name="_Toc204" w:id="204"/>
+      <w:bookmarkStart w:name="_Toc206" w:id="206"/>
       <w:r>
         <w:t xml:space="preserve">6. Scientific novelty</w:t>
       </w:r>
-      <w:bookmarkEnd w:id="204"/>
+      <w:bookmarkEnd w:id="206"/>
     </w:p>
     <w:p>
       <w:pPr>
         <w:pStyle w:val="Heading2"/>
       </w:pPr>
-      <w:bookmarkStart w:name="_Toc205" w:id="205"/>
+      <w:bookmarkStart w:name="_Toc207" w:id="207"/>
       <w:r>
         <w:t xml:space="preserve">6.1. Not new</w:t>
       </w:r>
-      <w:bookmarkEnd w:id="205"/>
+      <w:bookmarkEnd w:id="207"/>
     </w:p>
     <w:p>
       <w:pPr>
@@ -8636,11 +11155,11 @@
       <w:pPr>
         <w:pStyle w:val="Heading2"/>
       </w:pPr>
-      <w:bookmarkStart w:name="_Toc206" w:id="206"/>
+      <w:bookmarkStart w:name="_Toc208" w:id="208"/>
       <w:r>
         <w:t xml:space="preserve">6.2. Possibly new (priority must be confirmed by a literature review)</w:t>
       </w:r>
-      <w:bookmarkEnd w:id="206"/>
+      <w:bookmarkEnd w:id="208"/>
     </w:p>
     <w:p>
       <w:pPr>
@@ -8751,13 +11270,43 @@
     </w:p>
     <w:p>
       <w:pPr>
+        <w:pStyle w:val="ListParagraph"/>
+        <w:numPr>
+          <w:ilvl w:val="0"/>
+          <w:numId w:val="3"/>
+        </w:numPr>
+        <w:spacing w:after="60" w:line="276"/>
+      </w:pPr>
+      <w:r>
+        <w:rPr>
+          <w:b/>
+          <w:bCs/>
+        </w:rPr>
+        <w:t xml:space="preserve">Decomposition of the predictability of the outcome into potential and effectiveness out of sample</w:t>
+      </w:r>
+      <w:r>
+        <w:t xml:space="preserve"> (almost all of it is effectiveness) and </w:t>
+      </w:r>
+      <w:r>
+        <w:rPr>
+          <w:b/>
+          <w:bCs/>
+        </w:rPr>
+        <w:t xml:space="preserve">the inverse order of an index of resources relative to the success of an offensive</w:t>
+      </w:r>
+      <w:r>
+        <w:t xml:space="preserve"> across 10 wars (an exploratory result, p ≈ 0.03–0.07).</w:t>
+      </w:r>
+    </w:p>
+    <w:p>
+      <w:pPr>
         <w:pStyle w:val="Heading2"/>
       </w:pPr>
-      <w:bookmarkStart w:name="_Toc207" w:id="207"/>
+      <w:bookmarkStart w:name="_Toc209" w:id="209"/>
       <w:r>
         <w:t xml:space="preserve">6.3. Where the gap is</w:t>
       </w:r>
-      <w:bookmarkEnd w:id="207"/>
+      <w:bookmarkEnd w:id="209"/>
     </w:p>
     <w:p>
       <w:pPr>
@@ -8783,11 +11332,11 @@
         <w:pStyle w:val="Heading1"/>
         <w:pageBreakBefore/>
       </w:pPr>
-      <w:bookmarkStart w:name="_Toc208" w:id="208"/>
+      <w:bookmarkStart w:name="_Toc210" w:id="210"/>
       <w:r>
         <w:t xml:space="preserve">7. Competitor: TENET Intelligence MCI</w:t>
       </w:r>
-      <w:bookmarkEnd w:id="208"/>
+      <w:bookmarkEnd w:id="210"/>
     </w:p>
     <w:p>
       <w:pPr>
@@ -11567,11 +14116,11 @@
         <w:pStyle w:val="Heading1"/>
         <w:pageBreakBefore/>
       </w:pPr>
-      <w:bookmarkStart w:name="_Toc209" w:id="209"/>
+      <w:bookmarkStart w:name="_Toc211" w:id="211"/>
       <w:r>
         <w:t xml:space="preserve">8. Plan</w:t>
       </w:r>
-      <w:bookmarkEnd w:id="209"/>
+      <w:bookmarkEnd w:id="211"/>
     </w:p>
     <w:p>
       <w:pPr>
@@ -11630,11 +14179,11 @@
         <w:pStyle w:val="Heading1"/>
         <w:pageBreakBefore/>
       </w:pPr>
-      <w:bookmarkStart w:name="_Toc210" w:id="210"/>
+      <w:bookmarkStart w:name="_Toc212" w:id="212"/>
       <w:r>
         <w:t xml:space="preserve">References</w:t>
       </w:r>
-      <w:bookmarkEnd w:id="210"/>
+      <w:bookmarkEnd w:id="212"/>
     </w:p>
     <w:p>
       <w:pPr>

</xml_diff>

<commit_message>
Публикация прототипа из Flumos1/MLO@acfba05b59a1f5c0c68adcefef4225c3bc08e0d4
</commit_message>
<xml_diff>
--- a/docs/08_Combat_models_and_novelty_EN.docx
+++ b/docs/08_Combat_models_and_novelty_EN.docx
@@ -307,37 +307,37 @@
         </w:p>
         <w:p>
           <w:pPr>
-            <w:pStyle w:val="TOC1"/>
-            <w:tabs>
-              <w:tab w:val="right" w:pos="9638" w:leader="dot"/>
-            </w:tabs>
-          </w:pPr>
-          <w:hyperlink w:history="1" w:anchor="_Toc196">
-            <w:r>
-              <w:t xml:space="preserve">3. How models account for intelligence and psychology</w:t>
-            </w:r>
-            <w:r>
-              <w:tab/>
-            </w:r>
-            <w:r>
-              <w:fldChar w:fldCharType="begin" w:dirty="true"/>
-              <w:instrText xml:space="preserve">PAGEREF _Toc196 \h</w:instrText>
-              <w:fldChar w:fldCharType="separate"/>
-              <w:fldChar w:fldCharType="end"/>
-            </w:r>
-          </w:hyperlink>
-        </w:p>
-        <w:p>
-          <w:pPr>
             <w:pStyle w:val="TOC2"/>
             <w:tabs>
               <w:tab w:val="right" w:pos="9638" w:leader="dot"/>
             </w:tabs>
             <w:ind w:left="220"/>
           </w:pPr>
+          <w:hyperlink w:history="1" w:anchor="_Toc196">
+            <w:r>
+              <w:t xml:space="preserve">2.4. Why the hypothesis did not work: yield per drone and the composition of losses (branch B)</w:t>
+            </w:r>
+            <w:r>
+              <w:tab/>
+            </w:r>
+            <w:r>
+              <w:fldChar w:fldCharType="begin" w:dirty="true"/>
+              <w:instrText xml:space="preserve">PAGEREF _Toc196 \h</w:instrText>
+              <w:fldChar w:fldCharType="separate"/>
+              <w:fldChar w:fldCharType="end"/>
+            </w:r>
+          </w:hyperlink>
+        </w:p>
+        <w:p>
+          <w:pPr>
+            <w:pStyle w:val="TOC1"/>
+            <w:tabs>
+              <w:tab w:val="right" w:pos="9638" w:leader="dot"/>
+            </w:tabs>
+          </w:pPr>
           <w:hyperlink w:history="1" w:anchor="_Toc197">
             <w:r>
-              <w:t xml:space="preserve">3.1. Intelligence — transition between laws</w:t>
+              <w:t xml:space="preserve">3. How models account for intelligence and psychology</w:t>
             </w:r>
             <w:r>
               <w:tab/>
@@ -360,7 +360,7 @@
           </w:pPr>
           <w:hyperlink w:history="1" w:anchor="_Toc198">
             <w:r>
-              <w:t xml:space="preserve">3.2. Psychology — will as a state variable</w:t>
+              <w:t xml:space="preserve">3.1. Intelligence — transition between laws</w:t>
             </w:r>
             <w:r>
               <w:tab/>
@@ -368,28 +368,6 @@
             <w:r>
               <w:fldChar w:fldCharType="begin" w:dirty="true"/>
               <w:instrText xml:space="preserve">PAGEREF _Toc198 \h</w:instrText>
-              <w:fldChar w:fldCharType="separate"/>
-              <w:fldChar w:fldCharType="end"/>
-            </w:r>
-          </w:hyperlink>
-        </w:p>
-        <w:p>
-          <w:pPr>
-            <w:pStyle w:val="TOC1"/>
-            <w:tabs>
-              <w:tab w:val="right" w:pos="9638" w:leader="dot"/>
-            </w:tabs>
-          </w:pPr>
-          <w:hyperlink w:history="1" w:anchor="_Toc199">
-            <w:r>
-              <w:t xml:space="preserve">4. Measurements on CDB90 battles</w:t>
-            </w:r>
-            <w:r>
-              <w:tab/>
-            </w:r>
-            <w:r>
-              <w:fldChar w:fldCharType="begin" w:dirty="true"/>
-              <w:instrText xml:space="preserve">PAGEREF _Toc199 \h</w:instrText>
               <w:fldChar w:fldCharType="separate"/>
               <w:fldChar w:fldCharType="end"/>
             </w:r>
@@ -403,9 +381,31 @@
             </w:tabs>
             <w:ind w:left="220"/>
           </w:pPr>
+          <w:hyperlink w:history="1" w:anchor="_Toc199">
+            <w:r>
+              <w:t xml:space="preserve">3.2. Psychology — will as a state variable</w:t>
+            </w:r>
+            <w:r>
+              <w:tab/>
+            </w:r>
+            <w:r>
+              <w:fldChar w:fldCharType="begin" w:dirty="true"/>
+              <w:instrText xml:space="preserve">PAGEREF _Toc199 \h</w:instrText>
+              <w:fldChar w:fldCharType="separate"/>
+              <w:fldChar w:fldCharType="end"/>
+            </w:r>
+          </w:hyperlink>
+        </w:p>
+        <w:p>
+          <w:pPr>
+            <w:pStyle w:val="TOC1"/>
+            <w:tabs>
+              <w:tab w:val="right" w:pos="9638" w:leader="dot"/>
+            </w:tabs>
+          </w:pPr>
           <w:hyperlink w:history="1" w:anchor="_Toc200">
             <w:r>
-              <w:t xml:space="preserve">4.1. The fire law: what daily losses depend on</w:t>
+              <w:t xml:space="preserve">4. Measurements on CDB90 battles</w:t>
             </w:r>
             <w:r>
               <w:tab/>
@@ -428,7 +428,7 @@
           </w:pPr>
           <w:hyperlink w:history="1" w:anchor="_Toc201">
             <w:r>
-              <w:t xml:space="preserve">4.2. Intelligence and psychology in numerical advantage</w:t>
+              <w:t xml:space="preserve">4.1. The fire law: what daily losses depend on</w:t>
             </w:r>
             <w:r>
               <w:tab/>
@@ -451,7 +451,7 @@
           </w:pPr>
           <w:hyperlink w:history="1" w:anchor="_Toc202">
             <w:r>
-              <w:t xml:space="preserve">4.3. Will threshold</w:t>
+              <w:t xml:space="preserve">4.2. Intelligence and psychology in numerical advantage</w:t>
             </w:r>
             <w:r>
               <w:tab/>
@@ -474,7 +474,7 @@
           </w:pPr>
           <w:hyperlink w:history="1" w:anchor="_Toc203">
             <w:r>
-              <w:t xml:space="preserve">4.4. Potential × effectiveness: what explains the outcome (branch A)</w:t>
+              <w:t xml:space="preserve">4.3. Will threshold</w:t>
             </w:r>
             <w:r>
               <w:tab/>
@@ -497,7 +497,7 @@
           </w:pPr>
           <w:hyperlink w:history="1" w:anchor="_Toc204">
             <w:r>
-              <w:t xml:space="preserve">4.5. Order of the index and the balance of forces (branch G)</w:t>
+              <w:t xml:space="preserve">4.4. Potential × effectiveness: what explains the outcome (branch A)</w:t>
             </w:r>
             <w:r>
               <w:tab/>
@@ -512,14 +512,15 @@
         </w:p>
         <w:p>
           <w:pPr>
-            <w:pStyle w:val="TOC1"/>
+            <w:pStyle w:val="TOC2"/>
             <w:tabs>
               <w:tab w:val="right" w:pos="9638" w:leader="dot"/>
             </w:tabs>
+            <w:ind w:left="220"/>
           </w:pPr>
           <w:hyperlink w:history="1" w:anchor="_Toc205">
             <w:r>
-              <w:t xml:space="preserve">5. Analysis of common claims</w:t>
+              <w:t xml:space="preserve">4.5. Order of the index and the balance of forces (branch G)</w:t>
             </w:r>
             <w:r>
               <w:tab/>
@@ -541,7 +542,7 @@
           </w:pPr>
           <w:hyperlink w:history="1" w:anchor="_Toc206">
             <w:r>
-              <w:t xml:space="preserve">6. Scientific novelty</w:t>
+              <w:t xml:space="preserve">5. Analysis of common claims</w:t>
             </w:r>
             <w:r>
               <w:tab/>
@@ -556,15 +557,14 @@
         </w:p>
         <w:p>
           <w:pPr>
-            <w:pStyle w:val="TOC2"/>
+            <w:pStyle w:val="TOC1"/>
             <w:tabs>
               <w:tab w:val="right" w:pos="9638" w:leader="dot"/>
             </w:tabs>
-            <w:ind w:left="220"/>
           </w:pPr>
           <w:hyperlink w:history="1" w:anchor="_Toc207">
             <w:r>
-              <w:t xml:space="preserve">6.1. Not new</w:t>
+              <w:t xml:space="preserve">6. Scientific novelty</w:t>
             </w:r>
             <w:r>
               <w:tab/>
@@ -587,7 +587,7 @@
           </w:pPr>
           <w:hyperlink w:history="1" w:anchor="_Toc208">
             <w:r>
-              <w:t xml:space="preserve">6.2. Possibly new (priority must be confirmed by a literature review)</w:t>
+              <w:t xml:space="preserve">6.1. Not new</w:t>
             </w:r>
             <w:r>
               <w:tab/>
@@ -610,7 +610,7 @@
           </w:pPr>
           <w:hyperlink w:history="1" w:anchor="_Toc209">
             <w:r>
-              <w:t xml:space="preserve">6.3. Where the gap is</w:t>
+              <w:t xml:space="preserve">6.2. Possibly new (priority must be confirmed by a literature review)</w:t>
             </w:r>
             <w:r>
               <w:tab/>
@@ -625,14 +625,15 @@
         </w:p>
         <w:p>
           <w:pPr>
-            <w:pStyle w:val="TOC1"/>
+            <w:pStyle w:val="TOC2"/>
             <w:tabs>
               <w:tab w:val="right" w:pos="9638" w:leader="dot"/>
             </w:tabs>
+            <w:ind w:left="220"/>
           </w:pPr>
           <w:hyperlink w:history="1" w:anchor="_Toc210">
             <w:r>
-              <w:t xml:space="preserve">7. Competitor: TENET Intelligence MCI</w:t>
+              <w:t xml:space="preserve">6.3. Where the gap is</w:t>
             </w:r>
             <w:r>
               <w:tab/>
@@ -654,7 +655,7 @@
           </w:pPr>
           <w:hyperlink w:history="1" w:anchor="_Toc211">
             <w:r>
-              <w:t xml:space="preserve">8. Plan</w:t>
+              <w:t xml:space="preserve">7. Competitor: TENET Intelligence MCI</w:t>
             </w:r>
             <w:r>
               <w:tab/>
@@ -676,7 +677,7 @@
           </w:pPr>
           <w:hyperlink w:history="1" w:anchor="_Toc212">
             <w:r>
-              <w:t xml:space="preserve">References</w:t>
+              <w:t xml:space="preserve">8. Plan</w:t>
             </w:r>
             <w:r>
               <w:tab/>
@@ -684,6 +685,28 @@
             <w:r>
               <w:fldChar w:fldCharType="begin" w:dirty="true"/>
               <w:instrText xml:space="preserve">PAGEREF _Toc212 \h</w:instrText>
+              <w:fldChar w:fldCharType="separate"/>
+              <w:fldChar w:fldCharType="end"/>
+            </w:r>
+          </w:hyperlink>
+        </w:p>
+        <w:p>
+          <w:pPr>
+            <w:pStyle w:val="TOC1"/>
+            <w:tabs>
+              <w:tab w:val="right" w:pos="9638" w:leader="dot"/>
+            </w:tabs>
+          </w:pPr>
+          <w:hyperlink w:history="1" w:anchor="_Toc213">
+            <w:r>
+              <w:t xml:space="preserve">References</w:t>
+            </w:r>
+            <w:r>
+              <w:tab/>
+            </w:r>
+            <w:r>
+              <w:fldChar w:fldCharType="begin" w:dirty="true"/>
+              <w:instrText xml:space="preserve">PAGEREF _Toc213 \h</w:instrText>
               <w:fldChar w:fldCharType="separate"/>
               <w:fldChar w:fldCharType="end"/>
             </w:r>
@@ -4594,24 +4617,13 @@
     </w:p>
     <w:p>
       <w:pPr>
-        <w:pStyle w:val="Heading1"/>
-        <w:pageBreakBefore/>
+        <w:pStyle w:val="Heading2"/>
       </w:pPr>
       <w:bookmarkStart w:name="_Toc196" w:id="196"/>
       <w:r>
-        <w:t xml:space="preserve">3. How models account for intelligence and psychology</w:t>
+        <w:t xml:space="preserve">2.4. Why the hypothesis did not work: yield per drone and the composition of losses (branch B)</w:t>
       </w:r>
       <w:bookmarkEnd w:id="196"/>
-    </w:p>
-    <w:p>
-      <w:pPr>
-        <w:pStyle w:val="Heading2"/>
-      </w:pPr>
-      <w:bookmarkStart w:name="_Toc197" w:id="197"/>
-      <w:r>
-        <w:t xml:space="preserve">3.1. Intelligence — transition between laws</w:t>
-      </w:r>
-      <w:bookmarkEnd w:id="197"/>
     </w:p>
     <w:p>
       <w:pPr>
@@ -4619,59 +4631,1170 @@
         <w:jc w:val="both"/>
       </w:pPr>
       <w:r>
-        <w:t xml:space="preserve">Let i be the share of fire at reconnoitred targets (0…1). Then losses are a mixture of aimed and area fire:</w:t>
+        <w:t xml:space="preserve">The next step is to understand the cause rather than look for another fit. Status of the analysis: </w:t>
+      </w:r>
+      <w:r>
+        <w:rPr>
+          <w:b/>
+          <w:bCs/>
+        </w:rPr>
+        <w:t xml:space="preserve">exploratory, outside the protocol</w:t>
+      </w:r>
+      <w:r>
+        <w:t xml:space="preserve"> (the loss ratio for 2025 was already known from the test in 2.3). Russia's losses are compared with the claimed drone output of Ukraine in two independent sources — Oryx and WarSpotting (records by date of loss).</w:t>
       </w:r>
     </w:p>
+    <w:tbl>
+      <w:tblPr>
+        <w:tblW w:type="dxa" w:w="9638"/>
+        <w:tblBorders>
+          <w:top w:val="single" w:color="auto" w:sz="4"/>
+          <w:left w:val="single" w:color="auto" w:sz="4"/>
+          <w:bottom w:val="single" w:color="auto" w:sz="4"/>
+          <w:right w:val="single" w:color="auto" w:sz="4"/>
+          <w:insideH w:val="single" w:color="auto" w:sz="4"/>
+          <w:insideV w:val="single" w:color="auto" w:sz="4"/>
+        </w:tblBorders>
+      </w:tblPr>
+      <w:tblGrid>
+        <w:gridCol w:w="771"/>
+        <w:gridCol w:w="1445"/>
+        <w:gridCol w:w="1252"/>
+        <w:gridCol w:w="1349"/>
+        <w:gridCol w:w="1252"/>
+        <w:gridCol w:w="1349"/>
+        <w:gridCol w:w="1156"/>
+        <w:gridCol w:w="1064"/>
+      </w:tblGrid>
+      <w:tr>
+        <w:trPr>
+          <w:tblHeader/>
+        </w:trPr>
+        <w:tc>
+          <w:tcPr>
+            <w:tcW w:type="dxa" w:w="771"/>
+            <w:tcBorders>
+              <w:top w:val="single" w:color="C9CEC5" w:sz="4"/>
+              <w:left w:val="single" w:color="C9CEC5" w:sz="4"/>
+              <w:bottom w:val="single" w:color="C9CEC5" w:sz="4"/>
+              <w:right w:val="single" w:color="C9CEC5" w:sz="4"/>
+            </w:tcBorders>
+            <w:shd w:fill="1F2A24" w:color="auto" w:val="clear"/>
+            <w:tcMar>
+              <w:top w:type="dxa" w:w="60"/>
+              <w:left w:type="dxa" w:w="90"/>
+              <w:bottom w:type="dxa" w:w="60"/>
+              <w:right w:type="dxa" w:w="90"/>
+            </w:tcMar>
+            <w:vAlign w:val="top"/>
+          </w:tcPr>
+          <w:p>
+            <w:pPr>
+              <w:spacing w:after="20"/>
+              <w:jc w:val="left"/>
+            </w:pPr>
+            <w:r>
+              <w:rPr>
+                <w:b/>
+                <w:bCs/>
+                <w:color w:val="FFFFFF"/>
+                <w:sz w:val="14"/>
+                <w:szCs w:val="14"/>
+              </w:rPr>
+              <w:t xml:space="preserve">Year</w:t>
+            </w:r>
+          </w:p>
+        </w:tc>
+        <w:tc>
+          <w:tcPr>
+            <w:tcW w:type="dxa" w:w="1445"/>
+            <w:tcBorders>
+              <w:top w:val="single" w:color="C9CEC5" w:sz="4"/>
+              <w:left w:val="single" w:color="C9CEC5" w:sz="4"/>
+              <w:bottom w:val="single" w:color="C9CEC5" w:sz="4"/>
+              <w:right w:val="single" w:color="C9CEC5" w:sz="4"/>
+            </w:tcBorders>
+            <w:shd w:fill="1F2A24" w:color="auto" w:val="clear"/>
+            <w:tcMar>
+              <w:top w:type="dxa" w:w="60"/>
+              <w:left w:type="dxa" w:w="90"/>
+              <w:bottom w:type="dxa" w:w="60"/>
+              <w:right w:type="dxa" w:w="90"/>
+            </w:tcMar>
+            <w:vAlign w:val="top"/>
+          </w:tcPr>
+          <w:p>
+            <w:pPr>
+              <w:spacing w:after="20"/>
+              <w:jc w:val="left"/>
+            </w:pPr>
+            <w:r>
+              <w:rPr>
+                <w:b/>
+                <w:bCs/>
+                <w:color w:val="FFFFFF"/>
+                <w:sz w:val="14"/>
+                <w:szCs w:val="14"/>
+              </w:rPr>
+              <w:t xml:space="preserve">Ukrainian drone output, million (claimed)</w:t>
+            </w:r>
+          </w:p>
+        </w:tc>
+        <w:tc>
+          <w:tcPr>
+            <w:tcW w:type="dxa" w:w="1252"/>
+            <w:tcBorders>
+              <w:top w:val="single" w:color="C9CEC5" w:sz="4"/>
+              <w:left w:val="single" w:color="C9CEC5" w:sz="4"/>
+              <w:bottom w:val="single" w:color="C9CEC5" w:sz="4"/>
+              <w:right w:val="single" w:color="C9CEC5" w:sz="4"/>
+            </w:tcBorders>
+            <w:shd w:fill="1F2A24" w:color="auto" w:val="clear"/>
+            <w:tcMar>
+              <w:top w:type="dxa" w:w="60"/>
+              <w:left w:type="dxa" w:w="90"/>
+              <w:bottom w:type="dxa" w:w="60"/>
+              <w:right w:type="dxa" w:w="90"/>
+            </w:tcMar>
+            <w:vAlign w:val="top"/>
+          </w:tcPr>
+          <w:p>
+            <w:pPr>
+              <w:spacing w:after="20"/>
+              <w:jc w:val="left"/>
+            </w:pPr>
+            <w:r>
+              <w:rPr>
+                <w:b/>
+                <w:bCs/>
+                <w:color w:val="FFFFFF"/>
+                <w:sz w:val="14"/>
+                <w:szCs w:val="14"/>
+              </w:rPr>
+              <w:t xml:space="preserve">Russian losses, Oryx</w:t>
+            </w:r>
+          </w:p>
+        </w:tc>
+        <w:tc>
+          <w:tcPr>
+            <w:tcW w:type="dxa" w:w="1349"/>
+            <w:tcBorders>
+              <w:top w:val="single" w:color="C9CEC5" w:sz="4"/>
+              <w:left w:val="single" w:color="C9CEC5" w:sz="4"/>
+              <w:bottom w:val="single" w:color="C9CEC5" w:sz="4"/>
+              <w:right w:val="single" w:color="C9CEC5" w:sz="4"/>
+            </w:tcBorders>
+            <w:shd w:fill="1F2A24" w:color="auto" w:val="clear"/>
+            <w:tcMar>
+              <w:top w:type="dxa" w:w="60"/>
+              <w:left w:type="dxa" w:w="90"/>
+              <w:bottom w:type="dxa" w:w="60"/>
+              <w:right w:type="dxa" w:w="90"/>
+            </w:tcMar>
+            <w:vAlign w:val="top"/>
+          </w:tcPr>
+          <w:p>
+            <w:pPr>
+              <w:spacing w:after="20"/>
+              <w:jc w:val="left"/>
+            </w:pPr>
+            <w:r>
+              <w:rPr>
+                <w:b/>
+                <w:bCs/>
+                <w:color w:val="FFFFFF"/>
+                <w:sz w:val="14"/>
+                <w:szCs w:val="14"/>
+              </w:rPr>
+              <w:t xml:space="preserve">Russian losses, WarSpotting</w:t>
+            </w:r>
+          </w:p>
+        </w:tc>
+        <w:tc>
+          <w:tcPr>
+            <w:tcW w:type="dxa" w:w="1252"/>
+            <w:tcBorders>
+              <w:top w:val="single" w:color="C9CEC5" w:sz="4"/>
+              <w:left w:val="single" w:color="C9CEC5" w:sz="4"/>
+              <w:bottom w:val="single" w:color="C9CEC5" w:sz="4"/>
+              <w:right w:val="single" w:color="C9CEC5" w:sz="4"/>
+            </w:tcBorders>
+            <w:shd w:fill="1F2A24" w:color="auto" w:val="clear"/>
+            <w:tcMar>
+              <w:top w:type="dxa" w:w="60"/>
+              <w:left w:type="dxa" w:w="90"/>
+              <w:bottom w:type="dxa" w:w="60"/>
+              <w:right w:type="dxa" w:w="90"/>
+            </w:tcMar>
+            <w:vAlign w:val="top"/>
+          </w:tcPr>
+          <w:p>
+            <w:pPr>
+              <w:spacing w:after="20"/>
+              <w:jc w:val="left"/>
+            </w:pPr>
+            <w:r>
+              <w:rPr>
+                <w:b/>
+                <w:bCs/>
+                <w:color w:val="FFFFFF"/>
+                <w:sz w:val="14"/>
+                <w:szCs w:val="14"/>
+              </w:rPr>
+              <w:t xml:space="preserve">Oryx per million drones</w:t>
+            </w:r>
+          </w:p>
+        </w:tc>
+        <w:tc>
+          <w:tcPr>
+            <w:tcW w:type="dxa" w:w="1349"/>
+            <w:tcBorders>
+              <w:top w:val="single" w:color="C9CEC5" w:sz="4"/>
+              <w:left w:val="single" w:color="C9CEC5" w:sz="4"/>
+              <w:bottom w:val="single" w:color="C9CEC5" w:sz="4"/>
+              <w:right w:val="single" w:color="C9CEC5" w:sz="4"/>
+            </w:tcBorders>
+            <w:shd w:fill="1F2A24" w:color="auto" w:val="clear"/>
+            <w:tcMar>
+              <w:top w:type="dxa" w:w="60"/>
+              <w:left w:type="dxa" w:w="90"/>
+              <w:bottom w:type="dxa" w:w="60"/>
+              <w:right w:type="dxa" w:w="90"/>
+            </w:tcMar>
+            <w:vAlign w:val="top"/>
+          </w:tcPr>
+          <w:p>
+            <w:pPr>
+              <w:spacing w:after="20"/>
+              <w:jc w:val="left"/>
+            </w:pPr>
+            <w:r>
+              <w:rPr>
+                <w:b/>
+                <w:bCs/>
+                <w:color w:val="FFFFFF"/>
+                <w:sz w:val="14"/>
+                <w:szCs w:val="14"/>
+              </w:rPr>
+              <w:t xml:space="preserve">WarSpotting per million drones</w:t>
+            </w:r>
+          </w:p>
+        </w:tc>
+        <w:tc>
+          <w:tcPr>
+            <w:tcW w:type="dxa" w:w="1156"/>
+            <w:tcBorders>
+              <w:top w:val="single" w:color="C9CEC5" w:sz="4"/>
+              <w:left w:val="single" w:color="C9CEC5" w:sz="4"/>
+              <w:bottom w:val="single" w:color="C9CEC5" w:sz="4"/>
+              <w:right w:val="single" w:color="C9CEC5" w:sz="4"/>
+            </w:tcBorders>
+            <w:shd w:fill="1F2A24" w:color="auto" w:val="clear"/>
+            <w:tcMar>
+              <w:top w:type="dxa" w:w="60"/>
+              <w:left w:type="dxa" w:w="90"/>
+              <w:bottom w:type="dxa" w:w="60"/>
+              <w:right w:type="dxa" w:w="90"/>
+            </w:tcMar>
+            <w:vAlign w:val="top"/>
+          </w:tcPr>
+          <w:p>
+            <w:pPr>
+              <w:spacing w:after="20"/>
+              <w:jc w:val="left"/>
+            </w:pPr>
+            <w:r>
+              <w:rPr>
+                <w:b/>
+                <w:bCs/>
+                <w:color w:val="FFFFFF"/>
+                <w:sz w:val="14"/>
+                <w:szCs w:val="14"/>
+              </w:rPr>
+              <w:t xml:space="preserve">Share of heavy equipment</w:t>
+            </w:r>
+          </w:p>
+        </w:tc>
+        <w:tc>
+          <w:tcPr>
+            <w:tcW w:type="dxa" w:w="1064"/>
+            <w:tcBorders>
+              <w:top w:val="single" w:color="C9CEC5" w:sz="4"/>
+              <w:left w:val="single" w:color="C9CEC5" w:sz="4"/>
+              <w:bottom w:val="single" w:color="C9CEC5" w:sz="4"/>
+              <w:right w:val="single" w:color="C9CEC5" w:sz="4"/>
+            </w:tcBorders>
+            <w:shd w:fill="1F2A24" w:color="auto" w:val="clear"/>
+            <w:tcMar>
+              <w:top w:type="dxa" w:w="60"/>
+              <w:left w:type="dxa" w:w="90"/>
+              <w:bottom w:type="dxa" w:w="60"/>
+              <w:right w:type="dxa" w:w="90"/>
+            </w:tcMar>
+            <w:vAlign w:val="top"/>
+          </w:tcPr>
+          <w:p>
+            <w:pPr>
+              <w:spacing w:after="20"/>
+              <w:jc w:val="left"/>
+            </w:pPr>
+            <w:r>
+              <w:rPr>
+                <w:b/>
+                <w:bCs/>
+                <w:color w:val="FFFFFF"/>
+                <w:sz w:val="14"/>
+                <w:szCs w:val="14"/>
+              </w:rPr>
+              <w:t xml:space="preserve">Share of light vehicles</w:t>
+            </w:r>
+          </w:p>
+        </w:tc>
+      </w:tr>
+      <w:tr>
+        <w:trPr>
+          <w:cantSplit/>
+        </w:trPr>
+        <w:tc>
+          <w:tcPr>
+            <w:tcW w:type="dxa" w:w="771"/>
+            <w:tcBorders>
+              <w:top w:val="single" w:color="C9CEC5" w:sz="4"/>
+              <w:left w:val="single" w:color="C9CEC5" w:sz="4"/>
+              <w:bottom w:val="single" w:color="C9CEC5" w:sz="4"/>
+              <w:right w:val="single" w:color="C9CEC5" w:sz="4"/>
+            </w:tcBorders>
+            <w:tcMar>
+              <w:top w:type="dxa" w:w="60"/>
+              <w:left w:type="dxa" w:w="90"/>
+              <w:bottom w:type="dxa" w:w="60"/>
+              <w:right w:type="dxa" w:w="90"/>
+            </w:tcMar>
+            <w:vAlign w:val="top"/>
+          </w:tcPr>
+          <w:p>
+            <w:pPr>
+              <w:spacing w:after="20"/>
+              <w:jc w:val="left"/>
+            </w:pPr>
+            <w:r>
+              <w:rPr>
+                <w:b w:val="false"/>
+                <w:bCs w:val="false"/>
+                <w:color w:val="1A1F1B"/>
+                <w:sz w:val="14"/>
+                <w:szCs w:val="14"/>
+              </w:rPr>
+              <w:t xml:space="preserve">2023</w:t>
+            </w:r>
+          </w:p>
+        </w:tc>
+        <w:tc>
+          <w:tcPr>
+            <w:tcW w:type="dxa" w:w="1445"/>
+            <w:tcBorders>
+              <w:top w:val="single" w:color="C9CEC5" w:sz="4"/>
+              <w:left w:val="single" w:color="C9CEC5" w:sz="4"/>
+              <w:bottom w:val="single" w:color="C9CEC5" w:sz="4"/>
+              <w:right w:val="single" w:color="C9CEC5" w:sz="4"/>
+            </w:tcBorders>
+            <w:tcMar>
+              <w:top w:type="dxa" w:w="60"/>
+              <w:left w:type="dxa" w:w="90"/>
+              <w:bottom w:type="dxa" w:w="60"/>
+              <w:right w:type="dxa" w:w="90"/>
+            </w:tcMar>
+            <w:vAlign w:val="top"/>
+          </w:tcPr>
+          <w:p>
+            <w:pPr>
+              <w:spacing w:after="20"/>
+              <w:jc w:val="right"/>
+            </w:pPr>
+            <w:r>
+              <w:rPr>
+                <w:b w:val="false"/>
+                <w:bCs w:val="false"/>
+                <w:color w:val="1A1F1B"/>
+                <w:sz w:val="14"/>
+                <w:szCs w:val="14"/>
+              </w:rPr>
+              <w:t xml:space="preserve">0.80</w:t>
+            </w:r>
+          </w:p>
+        </w:tc>
+        <w:tc>
+          <w:tcPr>
+            <w:tcW w:type="dxa" w:w="1252"/>
+            <w:tcBorders>
+              <w:top w:val="single" w:color="C9CEC5" w:sz="4"/>
+              <w:left w:val="single" w:color="C9CEC5" w:sz="4"/>
+              <w:bottom w:val="single" w:color="C9CEC5" w:sz="4"/>
+              <w:right w:val="single" w:color="C9CEC5" w:sz="4"/>
+            </w:tcBorders>
+            <w:tcMar>
+              <w:top w:type="dxa" w:w="60"/>
+              <w:left w:type="dxa" w:w="90"/>
+              <w:bottom w:type="dxa" w:w="60"/>
+              <w:right w:type="dxa" w:w="90"/>
+            </w:tcMar>
+            <w:vAlign w:val="top"/>
+          </w:tcPr>
+          <w:p>
+            <w:pPr>
+              <w:spacing w:after="20"/>
+              <w:jc w:val="right"/>
+            </w:pPr>
+            <w:r>
+              <w:rPr>
+                <w:b w:val="false"/>
+                <w:bCs w:val="false"/>
+                <w:color w:val="1A1F1B"/>
+                <w:sz w:val="14"/>
+                <w:szCs w:val="14"/>
+              </w:rPr>
+              <w:t xml:space="preserve">5168</w:t>
+            </w:r>
+          </w:p>
+        </w:tc>
+        <w:tc>
+          <w:tcPr>
+            <w:tcW w:type="dxa" w:w="1349"/>
+            <w:tcBorders>
+              <w:top w:val="single" w:color="C9CEC5" w:sz="4"/>
+              <w:left w:val="single" w:color="C9CEC5" w:sz="4"/>
+              <w:bottom w:val="single" w:color="C9CEC5" w:sz="4"/>
+              <w:right w:val="single" w:color="C9CEC5" w:sz="4"/>
+            </w:tcBorders>
+            <w:tcMar>
+              <w:top w:type="dxa" w:w="60"/>
+              <w:left w:type="dxa" w:w="90"/>
+              <w:bottom w:type="dxa" w:w="60"/>
+              <w:right w:type="dxa" w:w="90"/>
+            </w:tcMar>
+            <w:vAlign w:val="top"/>
+          </w:tcPr>
+          <w:p>
+            <w:pPr>
+              <w:spacing w:after="20"/>
+              <w:jc w:val="right"/>
+            </w:pPr>
+            <w:r>
+              <w:rPr>
+                <w:b w:val="false"/>
+                <w:bCs w:val="false"/>
+                <w:color w:val="1A1F1B"/>
+                <w:sz w:val="14"/>
+                <w:szCs w:val="14"/>
+              </w:rPr>
+              <w:t xml:space="preserve">4315</w:t>
+            </w:r>
+          </w:p>
+        </w:tc>
+        <w:tc>
+          <w:tcPr>
+            <w:tcW w:type="dxa" w:w="1252"/>
+            <w:tcBorders>
+              <w:top w:val="single" w:color="C9CEC5" w:sz="4"/>
+              <w:left w:val="single" w:color="C9CEC5" w:sz="4"/>
+              <w:bottom w:val="single" w:color="C9CEC5" w:sz="4"/>
+              <w:right w:val="single" w:color="C9CEC5" w:sz="4"/>
+            </w:tcBorders>
+            <w:tcMar>
+              <w:top w:type="dxa" w:w="60"/>
+              <w:left w:type="dxa" w:w="90"/>
+              <w:bottom w:type="dxa" w:w="60"/>
+              <w:right w:type="dxa" w:w="90"/>
+            </w:tcMar>
+            <w:vAlign w:val="top"/>
+          </w:tcPr>
+          <w:p>
+            <w:pPr>
+              <w:spacing w:after="20"/>
+              <w:jc w:val="right"/>
+            </w:pPr>
+            <w:r>
+              <w:rPr>
+                <w:b w:val="false"/>
+                <w:bCs w:val="false"/>
+                <w:color w:val="1A1F1B"/>
+                <w:sz w:val="14"/>
+                <w:szCs w:val="14"/>
+              </w:rPr>
+              <w:t xml:space="preserve">6460</w:t>
+            </w:r>
+          </w:p>
+        </w:tc>
+        <w:tc>
+          <w:tcPr>
+            <w:tcW w:type="dxa" w:w="1349"/>
+            <w:tcBorders>
+              <w:top w:val="single" w:color="C9CEC5" w:sz="4"/>
+              <w:left w:val="single" w:color="C9CEC5" w:sz="4"/>
+              <w:bottom w:val="single" w:color="C9CEC5" w:sz="4"/>
+              <w:right w:val="single" w:color="C9CEC5" w:sz="4"/>
+            </w:tcBorders>
+            <w:tcMar>
+              <w:top w:type="dxa" w:w="60"/>
+              <w:left w:type="dxa" w:w="90"/>
+              <w:bottom w:type="dxa" w:w="60"/>
+              <w:right w:type="dxa" w:w="90"/>
+            </w:tcMar>
+            <w:vAlign w:val="top"/>
+          </w:tcPr>
+          <w:p>
+            <w:pPr>
+              <w:spacing w:after="20"/>
+              <w:jc w:val="right"/>
+            </w:pPr>
+            <w:r>
+              <w:rPr>
+                <w:b w:val="false"/>
+                <w:bCs w:val="false"/>
+                <w:color w:val="1A1F1B"/>
+                <w:sz w:val="14"/>
+                <w:szCs w:val="14"/>
+              </w:rPr>
+              <w:t xml:space="preserve">5394</w:t>
+            </w:r>
+          </w:p>
+        </w:tc>
+        <w:tc>
+          <w:tcPr>
+            <w:tcW w:type="dxa" w:w="1156"/>
+            <w:tcBorders>
+              <w:top w:val="single" w:color="C9CEC5" w:sz="4"/>
+              <w:left w:val="single" w:color="C9CEC5" w:sz="4"/>
+              <w:bottom w:val="single" w:color="C9CEC5" w:sz="4"/>
+              <w:right w:val="single" w:color="C9CEC5" w:sz="4"/>
+            </w:tcBorders>
+            <w:tcMar>
+              <w:top w:type="dxa" w:w="60"/>
+              <w:left w:type="dxa" w:w="90"/>
+              <w:bottom w:type="dxa" w:w="60"/>
+              <w:right w:type="dxa" w:w="90"/>
+            </w:tcMar>
+            <w:vAlign w:val="top"/>
+          </w:tcPr>
+          <w:p>
+            <w:pPr>
+              <w:spacing w:after="20"/>
+              <w:jc w:val="right"/>
+            </w:pPr>
+            <w:r>
+              <w:rPr>
+                <w:b w:val="false"/>
+                <w:bCs w:val="false"/>
+                <w:color w:val="1A1F1B"/>
+                <w:sz w:val="14"/>
+                <w:szCs w:val="14"/>
+              </w:rPr>
+              <w:t xml:space="preserve">64%</w:t>
+            </w:r>
+          </w:p>
+        </w:tc>
+        <w:tc>
+          <w:tcPr>
+            <w:tcW w:type="dxa" w:w="1064"/>
+            <w:tcBorders>
+              <w:top w:val="single" w:color="C9CEC5" w:sz="4"/>
+              <w:left w:val="single" w:color="C9CEC5" w:sz="4"/>
+              <w:bottom w:val="single" w:color="C9CEC5" w:sz="4"/>
+              <w:right w:val="single" w:color="C9CEC5" w:sz="4"/>
+            </w:tcBorders>
+            <w:tcMar>
+              <w:top w:type="dxa" w:w="60"/>
+              <w:left w:type="dxa" w:w="90"/>
+              <w:bottom w:type="dxa" w:w="60"/>
+              <w:right w:type="dxa" w:w="90"/>
+            </w:tcMar>
+            <w:vAlign w:val="top"/>
+          </w:tcPr>
+          <w:p>
+            <w:pPr>
+              <w:spacing w:after="20"/>
+              <w:jc w:val="right"/>
+            </w:pPr>
+            <w:r>
+              <w:rPr>
+                <w:b w:val="false"/>
+                <w:bCs w:val="false"/>
+                <w:color w:val="1A1F1B"/>
+                <w:sz w:val="14"/>
+                <w:szCs w:val="14"/>
+              </w:rPr>
+              <w:t xml:space="preserve">19%</w:t>
+            </w:r>
+          </w:p>
+        </w:tc>
+      </w:tr>
+      <w:tr>
+        <w:trPr>
+          <w:cantSplit/>
+        </w:trPr>
+        <w:tc>
+          <w:tcPr>
+            <w:tcW w:type="dxa" w:w="771"/>
+            <w:tcBorders>
+              <w:top w:val="single" w:color="C9CEC5" w:sz="4"/>
+              <w:left w:val="single" w:color="C9CEC5" w:sz="4"/>
+              <w:bottom w:val="single" w:color="C9CEC5" w:sz="4"/>
+              <w:right w:val="single" w:color="C9CEC5" w:sz="4"/>
+            </w:tcBorders>
+            <w:shd w:fill="F1F3EF" w:color="auto" w:val="clear"/>
+            <w:tcMar>
+              <w:top w:type="dxa" w:w="60"/>
+              <w:left w:type="dxa" w:w="90"/>
+              <w:bottom w:type="dxa" w:w="60"/>
+              <w:right w:type="dxa" w:w="90"/>
+            </w:tcMar>
+            <w:vAlign w:val="top"/>
+          </w:tcPr>
+          <w:p>
+            <w:pPr>
+              <w:spacing w:after="20"/>
+              <w:jc w:val="left"/>
+            </w:pPr>
+            <w:r>
+              <w:rPr>
+                <w:b w:val="false"/>
+                <w:bCs w:val="false"/>
+                <w:color w:val="1A1F1B"/>
+                <w:sz w:val="14"/>
+                <w:szCs w:val="14"/>
+              </w:rPr>
+              <w:t xml:space="preserve">2024</w:t>
+            </w:r>
+          </w:p>
+        </w:tc>
+        <w:tc>
+          <w:tcPr>
+            <w:tcW w:type="dxa" w:w="1445"/>
+            <w:tcBorders>
+              <w:top w:val="single" w:color="C9CEC5" w:sz="4"/>
+              <w:left w:val="single" w:color="C9CEC5" w:sz="4"/>
+              <w:bottom w:val="single" w:color="C9CEC5" w:sz="4"/>
+              <w:right w:val="single" w:color="C9CEC5" w:sz="4"/>
+            </w:tcBorders>
+            <w:shd w:fill="F1F3EF" w:color="auto" w:val="clear"/>
+            <w:tcMar>
+              <w:top w:type="dxa" w:w="60"/>
+              <w:left w:type="dxa" w:w="90"/>
+              <w:bottom w:type="dxa" w:w="60"/>
+              <w:right w:type="dxa" w:w="90"/>
+            </w:tcMar>
+            <w:vAlign w:val="top"/>
+          </w:tcPr>
+          <w:p>
+            <w:pPr>
+              <w:spacing w:after="20"/>
+              <w:jc w:val="right"/>
+            </w:pPr>
+            <w:r>
+              <w:rPr>
+                <w:b w:val="false"/>
+                <w:bCs w:val="false"/>
+                <w:color w:val="1A1F1B"/>
+                <w:sz w:val="14"/>
+                <w:szCs w:val="14"/>
+              </w:rPr>
+              <w:t xml:space="preserve">2.20</w:t>
+            </w:r>
+          </w:p>
+        </w:tc>
+        <w:tc>
+          <w:tcPr>
+            <w:tcW w:type="dxa" w:w="1252"/>
+            <w:tcBorders>
+              <w:top w:val="single" w:color="C9CEC5" w:sz="4"/>
+              <w:left w:val="single" w:color="C9CEC5" w:sz="4"/>
+              <w:bottom w:val="single" w:color="C9CEC5" w:sz="4"/>
+              <w:right w:val="single" w:color="C9CEC5" w:sz="4"/>
+            </w:tcBorders>
+            <w:shd w:fill="F1F3EF" w:color="auto" w:val="clear"/>
+            <w:tcMar>
+              <w:top w:type="dxa" w:w="60"/>
+              <w:left w:type="dxa" w:w="90"/>
+              <w:bottom w:type="dxa" w:w="60"/>
+              <w:right w:type="dxa" w:w="90"/>
+            </w:tcMar>
+            <w:vAlign w:val="top"/>
+          </w:tcPr>
+          <w:p>
+            <w:pPr>
+              <w:spacing w:after="20"/>
+              <w:jc w:val="right"/>
+            </w:pPr>
+            <w:r>
+              <w:rPr>
+                <w:b w:val="false"/>
+                <w:bCs w:val="false"/>
+                <w:color w:val="1A1F1B"/>
+                <w:sz w:val="14"/>
+                <w:szCs w:val="14"/>
+              </w:rPr>
+              <w:t xml:space="preserve">5984</w:t>
+            </w:r>
+          </w:p>
+        </w:tc>
+        <w:tc>
+          <w:tcPr>
+            <w:tcW w:type="dxa" w:w="1349"/>
+            <w:tcBorders>
+              <w:top w:val="single" w:color="C9CEC5" w:sz="4"/>
+              <w:left w:val="single" w:color="C9CEC5" w:sz="4"/>
+              <w:bottom w:val="single" w:color="C9CEC5" w:sz="4"/>
+              <w:right w:val="single" w:color="C9CEC5" w:sz="4"/>
+            </w:tcBorders>
+            <w:shd w:fill="F1F3EF" w:color="auto" w:val="clear"/>
+            <w:tcMar>
+              <w:top w:type="dxa" w:w="60"/>
+              <w:left w:type="dxa" w:w="90"/>
+              <w:bottom w:type="dxa" w:w="60"/>
+              <w:right w:type="dxa" w:w="90"/>
+            </w:tcMar>
+            <w:vAlign w:val="top"/>
+          </w:tcPr>
+          <w:p>
+            <w:pPr>
+              <w:spacing w:after="20"/>
+              <w:jc w:val="right"/>
+            </w:pPr>
+            <w:r>
+              <w:rPr>
+                <w:b w:val="false"/>
+                <w:bCs w:val="false"/>
+                <w:color w:val="1A1F1B"/>
+                <w:sz w:val="14"/>
+                <w:szCs w:val="14"/>
+              </w:rPr>
+              <w:t xml:space="preserve">6296</w:t>
+            </w:r>
+          </w:p>
+        </w:tc>
+        <w:tc>
+          <w:tcPr>
+            <w:tcW w:type="dxa" w:w="1252"/>
+            <w:tcBorders>
+              <w:top w:val="single" w:color="C9CEC5" w:sz="4"/>
+              <w:left w:val="single" w:color="C9CEC5" w:sz="4"/>
+              <w:bottom w:val="single" w:color="C9CEC5" w:sz="4"/>
+              <w:right w:val="single" w:color="C9CEC5" w:sz="4"/>
+            </w:tcBorders>
+            <w:shd w:fill="F1F3EF" w:color="auto" w:val="clear"/>
+            <w:tcMar>
+              <w:top w:type="dxa" w:w="60"/>
+              <w:left w:type="dxa" w:w="90"/>
+              <w:bottom w:type="dxa" w:w="60"/>
+              <w:right w:type="dxa" w:w="90"/>
+            </w:tcMar>
+            <w:vAlign w:val="top"/>
+          </w:tcPr>
+          <w:p>
+            <w:pPr>
+              <w:spacing w:after="20"/>
+              <w:jc w:val="right"/>
+            </w:pPr>
+            <w:r>
+              <w:rPr>
+                <w:b w:val="false"/>
+                <w:bCs w:val="false"/>
+                <w:color w:val="1A1F1B"/>
+                <w:sz w:val="14"/>
+                <w:szCs w:val="14"/>
+              </w:rPr>
+              <w:t xml:space="preserve">2720</w:t>
+            </w:r>
+          </w:p>
+        </w:tc>
+        <w:tc>
+          <w:tcPr>
+            <w:tcW w:type="dxa" w:w="1349"/>
+            <w:tcBorders>
+              <w:top w:val="single" w:color="C9CEC5" w:sz="4"/>
+              <w:left w:val="single" w:color="C9CEC5" w:sz="4"/>
+              <w:bottom w:val="single" w:color="C9CEC5" w:sz="4"/>
+              <w:right w:val="single" w:color="C9CEC5" w:sz="4"/>
+            </w:tcBorders>
+            <w:shd w:fill="F1F3EF" w:color="auto" w:val="clear"/>
+            <w:tcMar>
+              <w:top w:type="dxa" w:w="60"/>
+              <w:left w:type="dxa" w:w="90"/>
+              <w:bottom w:type="dxa" w:w="60"/>
+              <w:right w:type="dxa" w:w="90"/>
+            </w:tcMar>
+            <w:vAlign w:val="top"/>
+          </w:tcPr>
+          <w:p>
+            <w:pPr>
+              <w:spacing w:after="20"/>
+              <w:jc w:val="right"/>
+            </w:pPr>
+            <w:r>
+              <w:rPr>
+                <w:b w:val="false"/>
+                <w:bCs w:val="false"/>
+                <w:color w:val="1A1F1B"/>
+                <w:sz w:val="14"/>
+                <w:szCs w:val="14"/>
+              </w:rPr>
+              <w:t xml:space="preserve">2862</w:t>
+            </w:r>
+          </w:p>
+        </w:tc>
+        <w:tc>
+          <w:tcPr>
+            <w:tcW w:type="dxa" w:w="1156"/>
+            <w:tcBorders>
+              <w:top w:val="single" w:color="C9CEC5" w:sz="4"/>
+              <w:left w:val="single" w:color="C9CEC5" w:sz="4"/>
+              <w:bottom w:val="single" w:color="C9CEC5" w:sz="4"/>
+              <w:right w:val="single" w:color="C9CEC5" w:sz="4"/>
+            </w:tcBorders>
+            <w:shd w:fill="F1F3EF" w:color="auto" w:val="clear"/>
+            <w:tcMar>
+              <w:top w:type="dxa" w:w="60"/>
+              <w:left w:type="dxa" w:w="90"/>
+              <w:bottom w:type="dxa" w:w="60"/>
+              <w:right w:type="dxa" w:w="90"/>
+            </w:tcMar>
+            <w:vAlign w:val="top"/>
+          </w:tcPr>
+          <w:p>
+            <w:pPr>
+              <w:spacing w:after="20"/>
+              <w:jc w:val="right"/>
+            </w:pPr>
+            <w:r>
+              <w:rPr>
+                <w:b w:val="false"/>
+                <w:bCs w:val="false"/>
+                <w:color w:val="1A1F1B"/>
+                <w:sz w:val="14"/>
+                <w:szCs w:val="14"/>
+              </w:rPr>
+              <w:t xml:space="preserve">72%</w:t>
+            </w:r>
+          </w:p>
+        </w:tc>
+        <w:tc>
+          <w:tcPr>
+            <w:tcW w:type="dxa" w:w="1064"/>
+            <w:tcBorders>
+              <w:top w:val="single" w:color="C9CEC5" w:sz="4"/>
+              <w:left w:val="single" w:color="C9CEC5" w:sz="4"/>
+              <w:bottom w:val="single" w:color="C9CEC5" w:sz="4"/>
+              <w:right w:val="single" w:color="C9CEC5" w:sz="4"/>
+            </w:tcBorders>
+            <w:shd w:fill="F1F3EF" w:color="auto" w:val="clear"/>
+            <w:tcMar>
+              <w:top w:type="dxa" w:w="60"/>
+              <w:left w:type="dxa" w:w="90"/>
+              <w:bottom w:type="dxa" w:w="60"/>
+              <w:right w:type="dxa" w:w="90"/>
+            </w:tcMar>
+            <w:vAlign w:val="top"/>
+          </w:tcPr>
+          <w:p>
+            <w:pPr>
+              <w:spacing w:after="20"/>
+              <w:jc w:val="right"/>
+            </w:pPr>
+            <w:r>
+              <w:rPr>
+                <w:b w:val="false"/>
+                <w:bCs w:val="false"/>
+                <w:color w:val="1A1F1B"/>
+                <w:sz w:val="14"/>
+                <w:szCs w:val="14"/>
+              </w:rPr>
+              <w:t xml:space="preserve">17%</w:t>
+            </w:r>
+          </w:p>
+        </w:tc>
+      </w:tr>
+      <w:tr>
+        <w:trPr>
+          <w:cantSplit/>
+        </w:trPr>
+        <w:tc>
+          <w:tcPr>
+            <w:tcW w:type="dxa" w:w="771"/>
+            <w:tcBorders>
+              <w:top w:val="single" w:color="C9CEC5" w:sz="4"/>
+              <w:left w:val="single" w:color="C9CEC5" w:sz="4"/>
+              <w:bottom w:val="single" w:color="C9CEC5" w:sz="4"/>
+              <w:right w:val="single" w:color="C9CEC5" w:sz="4"/>
+            </w:tcBorders>
+            <w:tcMar>
+              <w:top w:type="dxa" w:w="60"/>
+              <w:left w:type="dxa" w:w="90"/>
+              <w:bottom w:type="dxa" w:w="60"/>
+              <w:right w:type="dxa" w:w="90"/>
+            </w:tcMar>
+            <w:vAlign w:val="top"/>
+          </w:tcPr>
+          <w:p>
+            <w:pPr>
+              <w:spacing w:after="20"/>
+              <w:jc w:val="left"/>
+            </w:pPr>
+            <w:r>
+              <w:rPr>
+                <w:b w:val="false"/>
+                <w:bCs w:val="false"/>
+                <w:color w:val="1A1F1B"/>
+                <w:sz w:val="14"/>
+                <w:szCs w:val="14"/>
+              </w:rPr>
+              <w:t xml:space="preserve">2025</w:t>
+            </w:r>
+          </w:p>
+        </w:tc>
+        <w:tc>
+          <w:tcPr>
+            <w:tcW w:type="dxa" w:w="1445"/>
+            <w:tcBorders>
+              <w:top w:val="single" w:color="C9CEC5" w:sz="4"/>
+              <w:left w:val="single" w:color="C9CEC5" w:sz="4"/>
+              <w:bottom w:val="single" w:color="C9CEC5" w:sz="4"/>
+              <w:right w:val="single" w:color="C9CEC5" w:sz="4"/>
+            </w:tcBorders>
+            <w:tcMar>
+              <w:top w:type="dxa" w:w="60"/>
+              <w:left w:type="dxa" w:w="90"/>
+              <w:bottom w:type="dxa" w:w="60"/>
+              <w:right w:type="dxa" w:w="90"/>
+            </w:tcMar>
+            <w:vAlign w:val="top"/>
+          </w:tcPr>
+          <w:p>
+            <w:pPr>
+              <w:spacing w:after="20"/>
+              <w:jc w:val="right"/>
+            </w:pPr>
+            <w:r>
+              <w:rPr>
+                <w:b w:val="false"/>
+                <w:bCs w:val="false"/>
+                <w:color w:val="1A1F1B"/>
+                <w:sz w:val="14"/>
+                <w:szCs w:val="14"/>
+              </w:rPr>
+              <w:t xml:space="preserve">4.00</w:t>
+            </w:r>
+          </w:p>
+        </w:tc>
+        <w:tc>
+          <w:tcPr>
+            <w:tcW w:type="dxa" w:w="1252"/>
+            <w:tcBorders>
+              <w:top w:val="single" w:color="C9CEC5" w:sz="4"/>
+              <w:left w:val="single" w:color="C9CEC5" w:sz="4"/>
+              <w:bottom w:val="single" w:color="C9CEC5" w:sz="4"/>
+              <w:right w:val="single" w:color="C9CEC5" w:sz="4"/>
+            </w:tcBorders>
+            <w:tcMar>
+              <w:top w:type="dxa" w:w="60"/>
+              <w:left w:type="dxa" w:w="90"/>
+              <w:bottom w:type="dxa" w:w="60"/>
+              <w:right w:type="dxa" w:w="90"/>
+            </w:tcMar>
+            <w:vAlign w:val="top"/>
+          </w:tcPr>
+          <w:p>
+            <w:pPr>
+              <w:spacing w:after="20"/>
+              <w:jc w:val="right"/>
+            </w:pPr>
+            <w:r>
+              <w:rPr>
+                <w:b w:val="false"/>
+                <w:bCs w:val="false"/>
+                <w:color w:val="1A1F1B"/>
+                <w:sz w:val="14"/>
+                <w:szCs w:val="14"/>
+              </w:rPr>
+              <w:t xml:space="preserve">4100</w:t>
+            </w:r>
+          </w:p>
+        </w:tc>
+        <w:tc>
+          <w:tcPr>
+            <w:tcW w:type="dxa" w:w="1349"/>
+            <w:tcBorders>
+              <w:top w:val="single" w:color="C9CEC5" w:sz="4"/>
+              <w:left w:val="single" w:color="C9CEC5" w:sz="4"/>
+              <w:bottom w:val="single" w:color="C9CEC5" w:sz="4"/>
+              <w:right w:val="single" w:color="C9CEC5" w:sz="4"/>
+            </w:tcBorders>
+            <w:tcMar>
+              <w:top w:type="dxa" w:w="60"/>
+              <w:left w:type="dxa" w:w="90"/>
+              <w:bottom w:type="dxa" w:w="60"/>
+              <w:right w:type="dxa" w:w="90"/>
+            </w:tcMar>
+            <w:vAlign w:val="top"/>
+          </w:tcPr>
+          <w:p>
+            <w:pPr>
+              <w:spacing w:after="20"/>
+              <w:jc w:val="right"/>
+            </w:pPr>
+            <w:r>
+              <w:rPr>
+                <w:b w:val="false"/>
+                <w:bCs w:val="false"/>
+                <w:color w:val="1A1F1B"/>
+                <w:sz w:val="14"/>
+                <w:szCs w:val="14"/>
+              </w:rPr>
+              <w:t xml:space="preserve">3464</w:t>
+            </w:r>
+          </w:p>
+        </w:tc>
+        <w:tc>
+          <w:tcPr>
+            <w:tcW w:type="dxa" w:w="1252"/>
+            <w:tcBorders>
+              <w:top w:val="single" w:color="C9CEC5" w:sz="4"/>
+              <w:left w:val="single" w:color="C9CEC5" w:sz="4"/>
+              <w:bottom w:val="single" w:color="C9CEC5" w:sz="4"/>
+              <w:right w:val="single" w:color="C9CEC5" w:sz="4"/>
+            </w:tcBorders>
+            <w:tcMar>
+              <w:top w:type="dxa" w:w="60"/>
+              <w:left w:type="dxa" w:w="90"/>
+              <w:bottom w:type="dxa" w:w="60"/>
+              <w:right w:type="dxa" w:w="90"/>
+            </w:tcMar>
+            <w:vAlign w:val="top"/>
+          </w:tcPr>
+          <w:p>
+            <w:pPr>
+              <w:spacing w:after="20"/>
+              <w:jc w:val="right"/>
+            </w:pPr>
+            <w:r>
+              <w:rPr>
+                <w:b w:val="false"/>
+                <w:bCs w:val="false"/>
+                <w:color w:val="1A1F1B"/>
+                <w:sz w:val="14"/>
+                <w:szCs w:val="14"/>
+              </w:rPr>
+              <w:t xml:space="preserve">1025</w:t>
+            </w:r>
+          </w:p>
+        </w:tc>
+        <w:tc>
+          <w:tcPr>
+            <w:tcW w:type="dxa" w:w="1349"/>
+            <w:tcBorders>
+              <w:top w:val="single" w:color="C9CEC5" w:sz="4"/>
+              <w:left w:val="single" w:color="C9CEC5" w:sz="4"/>
+              <w:bottom w:val="single" w:color="C9CEC5" w:sz="4"/>
+              <w:right w:val="single" w:color="C9CEC5" w:sz="4"/>
+            </w:tcBorders>
+            <w:tcMar>
+              <w:top w:type="dxa" w:w="60"/>
+              <w:left w:type="dxa" w:w="90"/>
+              <w:bottom w:type="dxa" w:w="60"/>
+              <w:right w:type="dxa" w:w="90"/>
+            </w:tcMar>
+            <w:vAlign w:val="top"/>
+          </w:tcPr>
+          <w:p>
+            <w:pPr>
+              <w:spacing w:after="20"/>
+              <w:jc w:val="right"/>
+            </w:pPr>
+            <w:r>
+              <w:rPr>
+                <w:b w:val="false"/>
+                <w:bCs w:val="false"/>
+                <w:color w:val="1A1F1B"/>
+                <w:sz w:val="14"/>
+                <w:szCs w:val="14"/>
+              </w:rPr>
+              <w:t xml:space="preserve">866</w:t>
+            </w:r>
+          </w:p>
+        </w:tc>
+        <w:tc>
+          <w:tcPr>
+            <w:tcW w:type="dxa" w:w="1156"/>
+            <w:tcBorders>
+              <w:top w:val="single" w:color="C9CEC5" w:sz="4"/>
+              <w:left w:val="single" w:color="C9CEC5" w:sz="4"/>
+              <w:bottom w:val="single" w:color="C9CEC5" w:sz="4"/>
+              <w:right w:val="single" w:color="C9CEC5" w:sz="4"/>
+            </w:tcBorders>
+            <w:tcMar>
+              <w:top w:type="dxa" w:w="60"/>
+              <w:left w:type="dxa" w:w="90"/>
+              <w:bottom w:type="dxa" w:w="60"/>
+              <w:right w:type="dxa" w:w="90"/>
+            </w:tcMar>
+            <w:vAlign w:val="top"/>
+          </w:tcPr>
+          <w:p>
+            <w:pPr>
+              <w:spacing w:after="20"/>
+              <w:jc w:val="right"/>
+            </w:pPr>
+            <w:r>
+              <w:rPr>
+                <w:b w:val="false"/>
+                <w:bCs w:val="false"/>
+                <w:color w:val="1A1F1B"/>
+                <w:sz w:val="14"/>
+                <w:szCs w:val="14"/>
+              </w:rPr>
+              <w:t xml:space="preserve">58%</w:t>
+            </w:r>
+          </w:p>
+        </w:tc>
+        <w:tc>
+          <w:tcPr>
+            <w:tcW w:type="dxa" w:w="1064"/>
+            <w:tcBorders>
+              <w:top w:val="single" w:color="C9CEC5" w:sz="4"/>
+              <w:left w:val="single" w:color="C9CEC5" w:sz="4"/>
+              <w:bottom w:val="single" w:color="C9CEC5" w:sz="4"/>
+              <w:right w:val="single" w:color="C9CEC5" w:sz="4"/>
+            </w:tcBorders>
+            <w:tcMar>
+              <w:top w:type="dxa" w:w="60"/>
+              <w:left w:type="dxa" w:w="90"/>
+              <w:bottom w:type="dxa" w:w="60"/>
+              <w:right w:type="dxa" w:w="90"/>
+            </w:tcMar>
+            <w:vAlign w:val="top"/>
+          </w:tcPr>
+          <w:p>
+            <w:pPr>
+              <w:spacing w:after="20"/>
+              <w:jc w:val="right"/>
+            </w:pPr>
+            <w:r>
+              <w:rPr>
+                <w:b w:val="false"/>
+                <w:bCs w:val="false"/>
+                <w:color w:val="1A1F1B"/>
+                <w:sz w:val="14"/>
+                <w:szCs w:val="14"/>
+              </w:rPr>
+              <w:t xml:space="preserve">29%</w:t>
+            </w:r>
+          </w:p>
+        </w:tc>
+      </w:tr>
+    </w:tbl>
     <w:p>
       <w:pPr>
-        <w:shd w:fill="F2F4F0" w:color="auto" w:val="clear"/>
-        <w:spacing w:after="0" w:before="60"/>
-        <w:ind w:left="200" w:right="200"/>
-        <w:jc w:val="left"/>
+        <w:spacing w:after="120"/>
       </w:pPr>
-      <w:r>
-        <w:rPr>
-          <w:rFonts w:ascii="Consolas" w:cs="Consolas" w:eastAsia="Consolas" w:hAnsi="Consolas"/>
-          <w:color w:val="1A1F1B"/>
-          <w:sz w:val="19"/>
-          <w:szCs w:val="19"/>
-        </w:rPr>
-        <w:t xml:space="preserve">dA/dt = −b·B·[ iB + (1 − iB)·A/A₀ ]</w:t>
-      </w:r>
-    </w:p>
-    <w:p>
-      <w:pPr>
-        <w:shd w:fill="F2F4F0" w:color="auto" w:val="clear"/>
-        <w:spacing w:after="0" w:before="0"/>
-        <w:ind w:left="200" w:right="200"/>
-        <w:jc w:val="left"/>
-      </w:pPr>
-      <w:r>
-        <w:rPr>
-          <w:rFonts w:ascii="Consolas" w:cs="Consolas" w:eastAsia="Consolas" w:hAnsi="Consolas"/>
-          <w:color w:val="1A1F1B"/>
-          <w:sz w:val="19"/>
-          <w:szCs w:val="19"/>
-        </w:rPr>
-        <w:t xml:space="preserve">dB/dt = −a·A·[ iA + (1 − iA)·B/B₀ ]</w:t>
-      </w:r>
-    </w:p>
-    <w:p>
-      <w:pPr>
-        <w:shd w:fill="F2F4F0" w:color="auto" w:val="clear"/>
-        <w:spacing w:after="160" w:before="0"/>
-        <w:ind w:left="200" w:right="200"/>
-        <w:jc w:val="left"/>
-      </w:pPr>
-      <w:r>
-        <w:rPr>
-          <w:rFonts w:ascii="Consolas" w:cs="Consolas" w:eastAsia="Consolas" w:hAnsi="Consolas"/>
-          <w:color w:val="1A1F1B"/>
-          <w:sz w:val="19"/>
-          <w:szCs w:val="19"/>
-        </w:rPr>
-        <w:t xml:space="preserve">i = 1 — the square law, i = 0 — the linear law (area fire)</w:t>
-      </w:r>
     </w:p>
     <w:p>
       <w:pPr>
@@ -4679,68 +5802,17 @@
         <w:jc w:val="both"/>
       </w:pPr>
       <w:r>
-        <w:t xml:space="preserve">In this entry, intelligence is not merely a force multiplier but what determines which law governs the battle. Hence Coulson's (2019) well-known result: under the square law, superiority in intelligence compensates for numbers only through the square root. But this is a consequence of the square law itself; under the linear law (as in our data), intelligence compensates for numbers one to one.</w:t>
-      </w:r>
-    </w:p>
-    <w:p>
-      <w:pPr>
-        <w:pStyle w:val="Heading2"/>
-      </w:pPr>
-      <w:bookmarkStart w:name="_Toc198" w:id="198"/>
-      <w:r>
-        <w:t xml:space="preserve">3.2. Psychology — will as a state variable</w:t>
-      </w:r>
-      <w:bookmarkEnd w:id="198"/>
-    </w:p>
-    <w:p>
-      <w:pPr>
-        <w:shd w:fill="F2F4F0" w:color="auto" w:val="clear"/>
-        <w:spacing w:after="0" w:before="60"/>
-        <w:ind w:left="200" w:right="200"/>
-        <w:jc w:val="left"/>
-      </w:pPr>
+        <w:t xml:space="preserve">The yield of losses per unit of claimed output fell by a factor of 6.3 according to Oryx (6460 → 1025 per million) and by a factor of 6.2 according to WarSpotting. The main point: between 2024 and 2025 the claimed Ukrainian output rose from 2.20 to 4.00 million, while the number of recorded Russian losses </w:t>
+      </w:r>
       <w:r>
         <w:rPr>
-          <w:rFonts w:ascii="Consolas" w:cs="Consolas" w:eastAsia="Consolas" w:hAnsi="Consolas"/>
-          <w:color w:val="1A1F1B"/>
-          <w:sz w:val="19"/>
-          <w:szCs w:val="19"/>
+          <w:b/>
+          <w:bCs/>
         </w:rPr>
-        <w:t xml:space="preserve">dm/dt = −μ·(relative loss rate) − ν·(strikes on the rear) + ρ·(1 − m)</w:t>
-      </w:r>
-    </w:p>
-    <w:p>
-      <w:pPr>
-        <w:shd w:fill="F2F4F0" w:color="auto" w:val="clear"/>
-        <w:spacing w:after="0" w:before="0"/>
-        <w:ind w:left="200" w:right="200"/>
-        <w:jc w:val="left"/>
-      </w:pPr>
-      <w:r>
-        <w:rPr>
-          <w:rFonts w:ascii="Consolas" w:cs="Consolas" w:eastAsia="Consolas" w:hAnsi="Consolas"/>
-          <w:color w:val="1A1F1B"/>
-          <w:sz w:val="19"/>
-          <w:szCs w:val="19"/>
-        </w:rPr>
-        <w:t xml:space="preserve">fire is delivered by A·m combatants (Shumov: not incapacitated and not refusing to fight)</w:t>
-      </w:r>
-    </w:p>
-    <w:p>
-      <w:pPr>
-        <w:shd w:fill="F2F4F0" w:color="auto" w:val="clear"/>
-        <w:spacing w:after="160" w:before="0"/>
-        <w:ind w:left="200" w:right="200"/>
-        <w:jc w:val="left"/>
-      </w:pPr>
-      <w:r>
-        <w:rPr>
-          <w:rFonts w:ascii="Consolas" w:cs="Consolas" w:eastAsia="Consolas" w:hAnsi="Consolas"/>
-          <w:color w:val="1A1F1B"/>
-          <w:sz w:val="19"/>
-          <w:szCs w:val="19"/>
-        </w:rPr>
-        <w:t xml:space="preserve">a side ceases combat when m &lt; m*  (will threshold, tolerance to losses)</w:t>
+        <w:t xml:space="preserve">fell</w:t>
+      </w:r>
+      <w:r>
+        <w:t xml:space="preserve"> — by 31% according to Oryx and by 45% according to WarSpotting. Any model of the form “losses are a non-decreasing function of output” with constant parameters (including the saturation model L = T·(1 − e^(−y·D/T))) is rejected by this in both independent sources.</w:t>
       </w:r>
     </w:p>
     <w:p>
@@ -4749,37 +5821,7 @@
         <w:jc w:val="both"/>
       </w:pPr>
       <w:r>
-        <w:t xml:space="preserve">Atkinson, Kress and MacKay (Operations Research, 2021) showed on such a model that more units </w:t>
-      </w:r>
-      <w:r>
-        <w:rPr>
-          <w:b/>
-          <w:bCs/>
-        </w:rPr>
-        <w:t xml:space="preserve">and</w:t>
-      </w:r>
-      <w:r>
-        <w:t xml:space="preserve"> better weapons (a higher kill probability) are more advantageous than improved targeting and the removal of deployment constraints. The widespread retelling that “numbers matter more than new models” does not correspond to this work.</w:t>
-      </w:r>
-    </w:p>
-    <w:p>
-      <w:pPr>
-        <w:pStyle w:val="Heading1"/>
-        <w:pageBreakBefore/>
-      </w:pPr>
-      <w:bookmarkStart w:name="_Toc199" w:id="199"/>
-      <w:r>
-        <w:t xml:space="preserve">4. Measurements on CDB90 battles</w:t>
-      </w:r>
-      <w:bookmarkEnd w:id="199"/>
-    </w:p>
-    <w:p>
-      <w:pPr>
-        <w:spacing w:after="120" w:line="288"/>
-        <w:jc w:val="both"/>
-      </w:pPr>
-      <w:r>
-        <w:t xml:space="preserve">The CDB90 database (Concepts Analysis Agency, 1990) contains numbers, losses, duration and the HERO compilers' assessments — in whose favour were intelligence, morale, leadership, training, equipment, supply and surprise (scale −2…+2). The protocol was fixed by commit 65e1a59 before computation; the main sample is 404 battles of 1900–1973, the checks are all years (643) and battles with reliable numbers (485). The intervals are 95%, bootstrapped over battles.</w:t>
+        <w:t xml:space="preserve">In the WarSpotting records the share of heavy equipment (tanks, infantry fighting vehicles, self-propelled artillery) fell from 72% in 2024 to 24% in 2026 (as of 20.10.2026), while the share of light vehicles (transport, light mobility vehicles) rose from 17% to 48%. This is consistent with the descriptions by RUSI and Defence Studies: drones account for about two thirds of losses, but only 20–40% of them reach the target, and the adversary adapts — it disperses and replaces armour with light vehicles and infantry assaults.</w:t>
       </w:r>
     </w:p>
     <w:p>
@@ -4797,21 +5839,242 @@
           <w:bCs/>
           <w:color w:val="9F2F27"/>
         </w:rPr>
-        <w:t xml:space="preserve">Data trap. </w:t>
-      </w:r>
-      <w:r>
-        <w:t xml:space="preserve">In the widespread “tidy” version of CDB90 all negative codes (assessments in favour of the defence, attacker defeats) are recorded as blanks. The MPI reads them from the source tables; without this the sample loses up to 20% of battles and becomes biased.</w:t>
-      </w:r>
+        <w:t xml:space="preserve">Conclusion. </w:t>
+      </w:r>
+      <w:r>
+        <w:t xml:space="preserve">Claimed output is a poor input parameter: losses are limited not by the number of “shooters” but by the number of vulnerable targets and by the adversary's adaptation. A proper attrition model is of the predator–prey type: losses = output × share arriving × share of hits × </w:t>
+      </w:r>
+      <w:r>
+        <w:rPr>
+          <w:b/>
+          <w:bCs/>
+        </w:rPr>
+        <w:t xml:space="preserve">the share of targets still present at the front</w:t>
+      </w:r>
+      <w:r>
+        <w:t xml:space="preserve">; the last factor itself declines. This is a testable hypothesis for a future period (the share of heavy equipment in the loss records will not return to the 2024 level), but not an accepted model: there are no independent monthly series of the number of targets at the front in open data. Caveats: output is claims by the parties, not comparable in definition; Oryx and WarSpotting record only what is confirmed by photo and video; 2026 is incomplete.</w:t>
+      </w:r>
+    </w:p>
+    <w:p>
+      <w:pPr>
+        <w:pStyle w:val="Heading1"/>
+        <w:pageBreakBefore/>
+      </w:pPr>
+      <w:bookmarkStart w:name="_Toc197" w:id="197"/>
+      <w:r>
+        <w:t xml:space="preserve">3. How models account for intelligence and psychology</w:t>
+      </w:r>
+      <w:bookmarkEnd w:id="197"/>
     </w:p>
     <w:p>
       <w:pPr>
         <w:pStyle w:val="Heading2"/>
       </w:pPr>
+      <w:bookmarkStart w:name="_Toc198" w:id="198"/>
+      <w:r>
+        <w:t xml:space="preserve">3.1. Intelligence — transition between laws</w:t>
+      </w:r>
+      <w:bookmarkEnd w:id="198"/>
+    </w:p>
+    <w:p>
+      <w:pPr>
+        <w:spacing w:after="120" w:line="288"/>
+        <w:jc w:val="both"/>
+      </w:pPr>
+      <w:r>
+        <w:t xml:space="preserve">Let i be the share of fire at reconnoitred targets (0…1). Then losses are a mixture of aimed and area fire:</w:t>
+      </w:r>
+    </w:p>
+    <w:p>
+      <w:pPr>
+        <w:shd w:fill="F2F4F0" w:color="auto" w:val="clear"/>
+        <w:spacing w:after="0" w:before="60"/>
+        <w:ind w:left="200" w:right="200"/>
+        <w:jc w:val="left"/>
+      </w:pPr>
+      <w:r>
+        <w:rPr>
+          <w:rFonts w:ascii="Consolas" w:cs="Consolas" w:eastAsia="Consolas" w:hAnsi="Consolas"/>
+          <w:color w:val="1A1F1B"/>
+          <w:sz w:val="19"/>
+          <w:szCs w:val="19"/>
+        </w:rPr>
+        <w:t xml:space="preserve">dA/dt = −b·B·[ iB + (1 − iB)·A/A₀ ]</w:t>
+      </w:r>
+    </w:p>
+    <w:p>
+      <w:pPr>
+        <w:shd w:fill="F2F4F0" w:color="auto" w:val="clear"/>
+        <w:spacing w:after="0" w:before="0"/>
+        <w:ind w:left="200" w:right="200"/>
+        <w:jc w:val="left"/>
+      </w:pPr>
+      <w:r>
+        <w:rPr>
+          <w:rFonts w:ascii="Consolas" w:cs="Consolas" w:eastAsia="Consolas" w:hAnsi="Consolas"/>
+          <w:color w:val="1A1F1B"/>
+          <w:sz w:val="19"/>
+          <w:szCs w:val="19"/>
+        </w:rPr>
+        <w:t xml:space="preserve">dB/dt = −a·A·[ iA + (1 − iA)·B/B₀ ]</w:t>
+      </w:r>
+    </w:p>
+    <w:p>
+      <w:pPr>
+        <w:shd w:fill="F2F4F0" w:color="auto" w:val="clear"/>
+        <w:spacing w:after="160" w:before="0"/>
+        <w:ind w:left="200" w:right="200"/>
+        <w:jc w:val="left"/>
+      </w:pPr>
+      <w:r>
+        <w:rPr>
+          <w:rFonts w:ascii="Consolas" w:cs="Consolas" w:eastAsia="Consolas" w:hAnsi="Consolas"/>
+          <w:color w:val="1A1F1B"/>
+          <w:sz w:val="19"/>
+          <w:szCs w:val="19"/>
+        </w:rPr>
+        <w:t xml:space="preserve">i = 1 — the square law, i = 0 — the linear law (area fire)</w:t>
+      </w:r>
+    </w:p>
+    <w:p>
+      <w:pPr>
+        <w:spacing w:after="120" w:line="288"/>
+        <w:jc w:val="both"/>
+      </w:pPr>
+      <w:r>
+        <w:t xml:space="preserve">In this entry, intelligence is not merely a force multiplier but what determines which law governs the battle. Hence Coulson's (2019) well-known result: under the square law, superiority in intelligence compensates for numbers only through the square root. But this is a consequence of the square law itself; under the linear law (as in our data), intelligence compensates for numbers one to one.</w:t>
+      </w:r>
+    </w:p>
+    <w:p>
+      <w:pPr>
+        <w:pStyle w:val="Heading2"/>
+      </w:pPr>
+      <w:bookmarkStart w:name="_Toc199" w:id="199"/>
+      <w:r>
+        <w:t xml:space="preserve">3.2. Psychology — will as a state variable</w:t>
+      </w:r>
+      <w:bookmarkEnd w:id="199"/>
+    </w:p>
+    <w:p>
+      <w:pPr>
+        <w:shd w:fill="F2F4F0" w:color="auto" w:val="clear"/>
+        <w:spacing w:after="0" w:before="60"/>
+        <w:ind w:left="200" w:right="200"/>
+        <w:jc w:val="left"/>
+      </w:pPr>
+      <w:r>
+        <w:rPr>
+          <w:rFonts w:ascii="Consolas" w:cs="Consolas" w:eastAsia="Consolas" w:hAnsi="Consolas"/>
+          <w:color w:val="1A1F1B"/>
+          <w:sz w:val="19"/>
+          <w:szCs w:val="19"/>
+        </w:rPr>
+        <w:t xml:space="preserve">dm/dt = −μ·(relative loss rate) − ν·(strikes on the rear) + ρ·(1 − m)</w:t>
+      </w:r>
+    </w:p>
+    <w:p>
+      <w:pPr>
+        <w:shd w:fill="F2F4F0" w:color="auto" w:val="clear"/>
+        <w:spacing w:after="0" w:before="0"/>
+        <w:ind w:left="200" w:right="200"/>
+        <w:jc w:val="left"/>
+      </w:pPr>
+      <w:r>
+        <w:rPr>
+          <w:rFonts w:ascii="Consolas" w:cs="Consolas" w:eastAsia="Consolas" w:hAnsi="Consolas"/>
+          <w:color w:val="1A1F1B"/>
+          <w:sz w:val="19"/>
+          <w:szCs w:val="19"/>
+        </w:rPr>
+        <w:t xml:space="preserve">fire is delivered by A·m combatants (Shumov: not incapacitated and not refusing to fight)</w:t>
+      </w:r>
+    </w:p>
+    <w:p>
+      <w:pPr>
+        <w:shd w:fill="F2F4F0" w:color="auto" w:val="clear"/>
+        <w:spacing w:after="160" w:before="0"/>
+        <w:ind w:left="200" w:right="200"/>
+        <w:jc w:val="left"/>
+      </w:pPr>
+      <w:r>
+        <w:rPr>
+          <w:rFonts w:ascii="Consolas" w:cs="Consolas" w:eastAsia="Consolas" w:hAnsi="Consolas"/>
+          <w:color w:val="1A1F1B"/>
+          <w:sz w:val="19"/>
+          <w:szCs w:val="19"/>
+        </w:rPr>
+        <w:t xml:space="preserve">a side ceases combat when m &lt; m*  (will threshold, tolerance to losses)</w:t>
+      </w:r>
+    </w:p>
+    <w:p>
+      <w:pPr>
+        <w:spacing w:after="120" w:line="288"/>
+        <w:jc w:val="both"/>
+      </w:pPr>
+      <w:r>
+        <w:t xml:space="preserve">Atkinson, Kress and MacKay (Operations Research, 2021) showed on such a model that more units </w:t>
+      </w:r>
+      <w:r>
+        <w:rPr>
+          <w:b/>
+          <w:bCs/>
+        </w:rPr>
+        <w:t xml:space="preserve">and</w:t>
+      </w:r>
+      <w:r>
+        <w:t xml:space="preserve"> better weapons (a higher kill probability) are more advantageous than improved targeting and the removal of deployment constraints. The widespread retelling that “numbers matter more than new models” does not correspond to this work.</w:t>
+      </w:r>
+    </w:p>
+    <w:p>
+      <w:pPr>
+        <w:pStyle w:val="Heading1"/>
+        <w:pageBreakBefore/>
+      </w:pPr>
       <w:bookmarkStart w:name="_Toc200" w:id="200"/>
       <w:r>
+        <w:t xml:space="preserve">4. Measurements on CDB90 battles</w:t>
+      </w:r>
+      <w:bookmarkEnd w:id="200"/>
+    </w:p>
+    <w:p>
+      <w:pPr>
+        <w:spacing w:after="120" w:line="288"/>
+        <w:jc w:val="both"/>
+      </w:pPr>
+      <w:r>
+        <w:t xml:space="preserve">The CDB90 database (Concepts Analysis Agency, 1990) contains numbers, losses, duration and the HERO compilers' assessments — in whose favour were intelligence, morale, leadership, training, equipment, supply and surprise (scale −2…+2). The protocol was fixed by commit 65e1a59 before computation; the main sample is 404 battles of 1900–1973, the checks are all years (643) and battles with reliable numbers (485). The intervals are 95%, bootstrapped over battles.</w:t>
+      </w:r>
+    </w:p>
+    <w:p>
+      <w:pPr>
+        <w:pBdr>
+          <w:left w:val="single" w:color="9F2F27" w:sz="18" w:space="8"/>
+        </w:pBdr>
+        <w:shd w:fill="F4EEE9" w:color="auto" w:val="clear"/>
+        <w:spacing w:after="160" w:before="120" w:line="276"/>
+        <w:ind w:left="200" w:right="120"/>
+      </w:pPr>
+      <w:r>
+        <w:rPr>
+          <w:b/>
+          <w:bCs/>
+          <w:color w:val="9F2F27"/>
+        </w:rPr>
+        <w:t xml:space="preserve">Data trap. </w:t>
+      </w:r>
+      <w:r>
+        <w:t xml:space="preserve">In the widespread “tidy” version of CDB90 all negative codes (assessments in favour of the defence, attacker defeats) are recorded as blanks. The MPI reads them from the source tables; without this the sample loses up to 20% of battles and becomes biased.</w:t>
+      </w:r>
+    </w:p>
+    <w:p>
+      <w:pPr>
+        <w:pStyle w:val="Heading2"/>
+      </w:pPr>
+      <w:bookmarkStart w:name="_Toc201" w:id="201"/>
+      <w:r>
         <w:t xml:space="preserve">4.1. The fire law: what daily losses depend on</w:t>
       </w:r>
-      <w:bookmarkEnd w:id="200"/>
+      <w:bookmarkEnd w:id="201"/>
     </w:p>
     <w:p>
       <w:pPr>
@@ -5738,11 +7001,11 @@
       <w:pPr>
         <w:pStyle w:val="Heading2"/>
       </w:pPr>
-      <w:bookmarkStart w:name="_Toc201" w:id="201"/>
+      <w:bookmarkStart w:name="_Toc202" w:id="202"/>
       <w:r>
         <w:t xml:space="preserve">4.2. Intelligence and psychology in numerical advantage</w:t>
       </w:r>
-      <w:bookmarkEnd w:id="201"/>
+      <w:bookmarkEnd w:id="202"/>
     </w:p>
     <w:p>
       <w:pPr>
@@ -7249,11 +8512,11 @@
       <w:pPr>
         <w:pStyle w:val="Heading2"/>
       </w:pPr>
-      <w:bookmarkStart w:name="_Toc202" w:id="202"/>
+      <w:bookmarkStart w:name="_Toc203" w:id="203"/>
       <w:r>
         <w:t xml:space="preserve">4.3. Will threshold</w:t>
       </w:r>
-      <w:bookmarkEnd w:id="202"/>
+      <w:bookmarkEnd w:id="203"/>
     </w:p>
     <w:p>
       <w:pPr>
@@ -8048,11 +9311,11 @@
       <w:pPr>
         <w:pStyle w:val="Heading2"/>
       </w:pPr>
-      <w:bookmarkStart w:name="_Toc203" w:id="203"/>
+      <w:bookmarkStart w:name="_Toc204" w:id="204"/>
       <w:r>
         <w:t xml:space="preserve">4.4. Potential × effectiveness: what explains the outcome (branch A)</w:t>
       </w:r>
-      <w:bookmarkEnd w:id="203"/>
+      <w:bookmarkEnd w:id="204"/>
     </w:p>
     <w:p>
       <w:pPr>
@@ -8843,11 +10106,11 @@
       <w:pPr>
         <w:pStyle w:val="Heading2"/>
       </w:pPr>
-      <w:bookmarkStart w:name="_Toc204" w:id="204"/>
+      <w:bookmarkStart w:name="_Toc205" w:id="205"/>
       <w:r>
         <w:t xml:space="preserve">4.5. Order of the index and the balance of forces (branch G)</w:t>
       </w:r>
-      <w:bookmarkEnd w:id="204"/>
+      <w:bookmarkEnd w:id="205"/>
     </w:p>
     <w:p>
       <w:pPr>
@@ -10502,11 +11765,11 @@
         <w:pStyle w:val="Heading1"/>
         <w:pageBreakBefore/>
       </w:pPr>
-      <w:bookmarkStart w:name="_Toc205" w:id="205"/>
+      <w:bookmarkStart w:name="_Toc206" w:id="206"/>
       <w:r>
         <w:t xml:space="preserve">5. Analysis of common claims</w:t>
       </w:r>
-      <w:bookmarkEnd w:id="205"/>
+      <w:bookmarkEnd w:id="206"/>
     </w:p>
     <w:p>
       <w:pPr>
@@ -11083,21 +12346,21 @@
         <w:pStyle w:val="Heading1"/>
         <w:pageBreakBefore/>
       </w:pPr>
-      <w:bookmarkStart w:name="_Toc206" w:id="206"/>
+      <w:bookmarkStart w:name="_Toc207" w:id="207"/>
       <w:r>
         <w:t xml:space="preserve">6. Scientific novelty</w:t>
       </w:r>
-      <w:bookmarkEnd w:id="206"/>
+      <w:bookmarkEnd w:id="207"/>
     </w:p>
     <w:p>
       <w:pPr>
         <w:pStyle w:val="Heading2"/>
       </w:pPr>
-      <w:bookmarkStart w:name="_Toc207" w:id="207"/>
+      <w:bookmarkStart w:name="_Toc208" w:id="208"/>
       <w:r>
         <w:t xml:space="preserve">6.1. Not new</w:t>
       </w:r>
-      <w:bookmarkEnd w:id="207"/>
+      <w:bookmarkEnd w:id="208"/>
     </w:p>
     <w:p>
       <w:pPr>
@@ -11155,11 +12418,11 @@
       <w:pPr>
         <w:pStyle w:val="Heading2"/>
       </w:pPr>
-      <w:bookmarkStart w:name="_Toc208" w:id="208"/>
+      <w:bookmarkStart w:name="_Toc209" w:id="209"/>
       <w:r>
         <w:t xml:space="preserve">6.2. Possibly new (priority must be confirmed by a literature review)</w:t>
       </w:r>
-      <w:bookmarkEnd w:id="208"/>
+      <w:bookmarkEnd w:id="209"/>
     </w:p>
     <w:p>
       <w:pPr>
@@ -11302,11 +12565,11 @@
       <w:pPr>
         <w:pStyle w:val="Heading2"/>
       </w:pPr>
-      <w:bookmarkStart w:name="_Toc209" w:id="209"/>
+      <w:bookmarkStart w:name="_Toc210" w:id="210"/>
       <w:r>
         <w:t xml:space="preserve">6.3. Where the gap is</w:t>
       </w:r>
-      <w:bookmarkEnd w:id="209"/>
+      <w:bookmarkEnd w:id="210"/>
     </w:p>
     <w:p>
       <w:pPr>
@@ -11332,11 +12595,11 @@
         <w:pStyle w:val="Heading1"/>
         <w:pageBreakBefore/>
       </w:pPr>
-      <w:bookmarkStart w:name="_Toc210" w:id="210"/>
+      <w:bookmarkStart w:name="_Toc211" w:id="211"/>
       <w:r>
         <w:t xml:space="preserve">7. Competitor: TENET Intelligence MCI</w:t>
       </w:r>
-      <w:bookmarkEnd w:id="210"/>
+      <w:bookmarkEnd w:id="211"/>
     </w:p>
     <w:p>
       <w:pPr>
@@ -14116,11 +15379,11 @@
         <w:pStyle w:val="Heading1"/>
         <w:pageBreakBefore/>
       </w:pPr>
-      <w:bookmarkStart w:name="_Toc211" w:id="211"/>
+      <w:bookmarkStart w:name="_Toc212" w:id="212"/>
       <w:r>
         <w:t xml:space="preserve">8. Plan</w:t>
       </w:r>
-      <w:bookmarkEnd w:id="211"/>
+      <w:bookmarkEnd w:id="212"/>
     </w:p>
     <w:p>
       <w:pPr>
@@ -14179,11 +15442,11 @@
         <w:pStyle w:val="Heading1"/>
         <w:pageBreakBefore/>
       </w:pPr>
-      <w:bookmarkStart w:name="_Toc212" w:id="212"/>
+      <w:bookmarkStart w:name="_Toc213" w:id="213"/>
       <w:r>
         <w:t xml:space="preserve">References</w:t>
       </w:r>
-      <w:bookmarkEnd w:id="212"/>
+      <w:bookmarkEnd w:id="213"/>
     </w:p>
     <w:p>
       <w:pPr>

</xml_diff>

<commit_message>
Публикация прототипа из Flumos1/MLO@b0e5e3103a02e64e3b6a611fa7f6534cbc13f092
</commit_message>
<xml_diff>
--- a/docs/08_Combat_models_and_novelty_EN.docx
+++ b/docs/08_Combat_models_and_novelty_EN.docx
@@ -3601,6 +3601,92 @@
       </w:pPr>
       <w:r>
         <w:t xml:space="preserve">The model is suitable for navies and for the standoff “strike drones and missiles against air defence”: the result is determined by the depth of the interceptors' ammunition load and the cost of a single interception, not by the number of platforms.</w:t>
+      </w:r>
+    </w:p>
+    <w:p>
+      <w:pPr>
+        <w:spacing w:after="120" w:line="288"/>
+        <w:jc w:val="both"/>
+      </w:pPr>
+      <w:r>
+        <w:rPr>
+          <w:b/>
+          <w:bCs/>
+        </w:rPr>
+        <w:t xml:space="preserve">Layered air defence and target speed (implemented in the prototype calculator, `core/lanmil/salvo.py`).</w:t>
+      </w:r>
+      <w:r>
+        <w:t xml:space="preserve"> Targets pass through the layers in order, and each layer spends stock only on the targets that reached it; the effectiveness of an interceptor falls with target speed above its reference speed:</w:t>
+      </w:r>
+    </w:p>
+    <w:p>
+      <w:pPr>
+        <w:shd w:fill="F2F4F0" w:color="auto" w:val="clear"/>
+        <w:spacing w:after="0" w:before="60"/>
+        <w:ind w:left="200" w:right="200"/>
+        <w:jc w:val="left"/>
+      </w:pPr>
+      <w:r>
+        <w:rPr>
+          <w:rFonts w:ascii="Consolas" w:cs="Consolas" w:eastAsia="Consolas" w:hAnsi="Consolas"/>
+          <w:color w:val="1A1F1B"/>
+          <w:sz w:val="19"/>
+          <w:szCs w:val="19"/>
+        </w:rPr>
+        <w:t xml:space="preserve">p_eff = p0 for v ≤ v_ref,  otherwise  p0 · (v_ref / v)^g</w:t>
+      </w:r>
+    </w:p>
+    <w:p>
+      <w:pPr>
+        <w:shd w:fill="F2F4F0" w:color="auto" w:val="clear"/>
+        <w:spacing w:after="0" w:before="0"/>
+        <w:ind w:left="200" w:right="200"/>
+        <w:jc w:val="left"/>
+      </w:pPr>
+      <w:r>
+        <w:rPr>
+          <w:rFonts w:ascii="Consolas" w:cs="Consolas" w:eastAsia="Consolas" w:hAnsi="Consolas"/>
+          <w:color w:val="1A1F1B"/>
+          <w:sz w:val="19"/>
+          <w:szCs w:val="19"/>
+        </w:rPr>
+        <w:t xml:space="preserve">a target passes a layer with probability (1 − p_eff)^n,  n — whole interceptors per target</w:t>
+      </w:r>
+    </w:p>
+    <w:p>
+      <w:pPr>
+        <w:shd w:fill="F2F4F0" w:color="auto" w:val="clear"/>
+        <w:spacing w:after="160" w:before="0"/>
+        <w:ind w:left="200" w:right="200"/>
+        <w:jc w:val="left"/>
+      </w:pPr>
+      <w:r>
+        <w:rPr>
+          <w:rFonts w:ascii="Consolas" w:cs="Consolas" w:eastAsia="Consolas" w:hAnsi="Consolas"/>
+          <w:color w:val="1A1F1B"/>
+          <w:sz w:val="19"/>
+          <w:szCs w:val="19"/>
+        </w:rPr>
+        <w:t xml:space="preserve">stock_j(t+1) = stock_j(t) − k_j · (number of targets reaching layer j) + output_j</w:t>
+      </w:r>
+    </w:p>
+    <w:p>
+      <w:pPr>
+        <w:spacing w:after="120" w:line="288"/>
+        <w:jc w:val="both"/>
+      </w:pPr>
+      <w:r>
+        <w:t xml:space="preserve">The exponent g = 0.5 was chosen roughly from two claimed class D points (piston-engine Shaheds are intercepted in 92–98% of cases, jet-type ones in about 60%; the Ukrainian Air Force, FT, September 2026) and is </w:t>
+      </w:r>
+      <w:r>
+        <w:rPr>
+          <w:b/>
+          <w:bCs/>
+        </w:rPr>
+        <w:t xml:space="preserve">not a calibration</w:t>
+      </w:r>
+      <w:r>
+        <w:t xml:space="preserve">: g and the reference speeds are set by the user. The default scenario is SAM missiles as the outer layer and interceptor drones as the inner one (prices from open estimates: an interceptor of about $1 million and about $5 thousand against a target of $30 thousand). The result is a demonstration: against a fast target (500 km/h instead of 180) the effectiveness of the inner layer falls from 0.70 to 0.49 and day-one leakage rises from 2.9 to 5.7 out of 100; the stock of the expensive outer layer runs out by the end of the month in both variants, while the cheap inner one accumulates, and the cost exchange stays at about 5 : 1 in favour of the offence (the defence spends five times more). The proof that a uniform distribution of interceptors over targets is optimal (arXiv 2608.31143, a preprint) means that the calculation is the best case for the defence.</w:t>
       </w:r>
     </w:p>
     <w:p>

</xml_diff>

<commit_message>
Публикация прототипа из Flumos1/MLO@ac8802011f9d4958b5e676f386464f108931bb9c
</commit_message>
<xml_diff>
--- a/docs/08_Combat_models_and_novelty_EN.docx
+++ b/docs/08_Combat_models_and_novelty_EN.docx
@@ -535,14 +535,15 @@
         </w:p>
         <w:p>
           <w:pPr>
-            <w:pStyle w:val="TOC1"/>
+            <w:pStyle w:val="TOC2"/>
             <w:tabs>
               <w:tab w:val="right" w:pos="9638" w:leader="dot"/>
             </w:tabs>
+            <w:ind w:left="220"/>
           </w:pPr>
           <w:hyperlink w:history="1" w:anchor="_Toc206">
             <w:r>
-              <w:t xml:space="preserve">5. Analysis of common claims</w:t>
+              <w:t xml:space="preserve">4.6. Effectiveness from open country-level features (CDB90 and UCDP GED)</w:t>
             </w:r>
             <w:r>
               <w:tab/>
@@ -564,7 +565,7 @@
           </w:pPr>
           <w:hyperlink w:history="1" w:anchor="_Toc207">
             <w:r>
-              <w:t xml:space="preserve">6. Scientific novelty</w:t>
+              <w:t xml:space="preserve">5. Analysis of common claims</w:t>
             </w:r>
             <w:r>
               <w:tab/>
@@ -579,15 +580,14 @@
         </w:p>
         <w:p>
           <w:pPr>
-            <w:pStyle w:val="TOC2"/>
+            <w:pStyle w:val="TOC1"/>
             <w:tabs>
               <w:tab w:val="right" w:pos="9638" w:leader="dot"/>
             </w:tabs>
-            <w:ind w:left="220"/>
           </w:pPr>
           <w:hyperlink w:history="1" w:anchor="_Toc208">
             <w:r>
-              <w:t xml:space="preserve">6.1. Not new</w:t>
+              <w:t xml:space="preserve">6. Scientific novelty</w:t>
             </w:r>
             <w:r>
               <w:tab/>
@@ -610,7 +610,7 @@
           </w:pPr>
           <w:hyperlink w:history="1" w:anchor="_Toc209">
             <w:r>
-              <w:t xml:space="preserve">6.2. Possibly new (priority must be confirmed by a literature review)</w:t>
+              <w:t xml:space="preserve">6.1. Not new</w:t>
             </w:r>
             <w:r>
               <w:tab/>
@@ -633,7 +633,7 @@
           </w:pPr>
           <w:hyperlink w:history="1" w:anchor="_Toc210">
             <w:r>
-              <w:t xml:space="preserve">6.3. Where the gap is</w:t>
+              <w:t xml:space="preserve">6.2. Possibly new (priority must be confirmed by a literature review)</w:t>
             </w:r>
             <w:r>
               <w:tab/>
@@ -648,14 +648,15 @@
         </w:p>
         <w:p>
           <w:pPr>
-            <w:pStyle w:val="TOC1"/>
+            <w:pStyle w:val="TOC2"/>
             <w:tabs>
               <w:tab w:val="right" w:pos="9638" w:leader="dot"/>
             </w:tabs>
+            <w:ind w:left="220"/>
           </w:pPr>
           <w:hyperlink w:history="1" w:anchor="_Toc211">
             <w:r>
-              <w:t xml:space="preserve">7. Competitor: TENET Intelligence MCI</w:t>
+              <w:t xml:space="preserve">6.3. Where the gap is</w:t>
             </w:r>
             <w:r>
               <w:tab/>
@@ -677,7 +678,7 @@
           </w:pPr>
           <w:hyperlink w:history="1" w:anchor="_Toc212">
             <w:r>
-              <w:t xml:space="preserve">8. Plan</w:t>
+              <w:t xml:space="preserve">7. Competitor: TENET Intelligence MCI</w:t>
             </w:r>
             <w:r>
               <w:tab/>
@@ -699,7 +700,7 @@
           </w:pPr>
           <w:hyperlink w:history="1" w:anchor="_Toc213">
             <w:r>
-              <w:t xml:space="preserve">References</w:t>
+              <w:t xml:space="preserve">8. Plan</w:t>
             </w:r>
             <w:r>
               <w:tab/>
@@ -707,6 +708,28 @@
             <w:r>
               <w:fldChar w:fldCharType="begin" w:dirty="true"/>
               <w:instrText xml:space="preserve">PAGEREF _Toc213 \h</w:instrText>
+              <w:fldChar w:fldCharType="separate"/>
+              <w:fldChar w:fldCharType="end"/>
+            </w:r>
+          </w:hyperlink>
+        </w:p>
+        <w:p>
+          <w:pPr>
+            <w:pStyle w:val="TOC1"/>
+            <w:tabs>
+              <w:tab w:val="right" w:pos="9638" w:leader="dot"/>
+            </w:tabs>
+          </w:pPr>
+          <w:hyperlink w:history="1" w:anchor="_Toc214">
+            <w:r>
+              <w:t xml:space="preserve">References</w:t>
+            </w:r>
+            <w:r>
+              <w:tab/>
+            </w:r>
+            <w:r>
+              <w:fldChar w:fldCharType="begin" w:dirty="true"/>
+              <w:instrText xml:space="preserve">PAGEREF _Toc214 \h</w:instrText>
               <w:fldChar w:fldCharType="separate"/>
               <w:fldChar w:fldCharType="end"/>
             </w:r>
@@ -860,6 +883,26 @@
       </w:r>
       <w:r>
         <w:t xml:space="preserve"> Out of sample, numbers add +0.009 per battle to predicting the outcome of a battle, while the seven effectiveness factors add +0.180 (95% of the total gain). Moreover, across the 10 wars of 2018–2025 the order of the index not only fails to predict whether the advantage will suffice (AUC 0.13) but runs opposite to the outcome: the index measures resources, not effectiveness.</w:t>
+      </w:r>
+    </w:p>
+    <w:p>
+      <w:pPr>
+        <w:pStyle w:val="ListParagraph"/>
+        <w:numPr>
+          <w:ilvl w:val="0"/>
+          <w:numId w:val="2"/>
+        </w:numPr>
+        <w:spacing w:after="60" w:line="276"/>
+      </w:pPr>
+      <w:r>
+        <w:rPr>
+          <w:b/>
+          <w:bCs/>
+        </w:rPr>
+        <w:t xml:space="preserve">Open country-level features capture effectiveness only in part and do not transfer.</w:t>
+      </w:r>
+      <w:r>
+        <w:t xml:space="preserve"> GDP per capita, democracy and mechanisation add +0.022 per battle to the prediction of 1900–1973 battle outcomes on top of numbers (8 times less than the compilers’ factors); on the independent UCDP GED base for 1989–2024 the transfer was not confirmed (Spearman +0.248, n = 24).</w:t>
       </w:r>
     </w:p>
     <w:p>
@@ -11848,14 +11891,837 @@
     </w:p>
     <w:p>
       <w:pPr>
+        <w:pStyle w:val="Heading2"/>
+      </w:pPr>
+      <w:bookmarkStart w:name="_Toc206" w:id="206"/>
+      <w:r>
+        <w:t xml:space="preserve">4.6. Effectiveness from open country-level features (CDB90 and UCDP GED)</w:t>
+      </w:r>
+      <w:bookmarkEnd w:id="206"/>
+    </w:p>
+    <w:p>
+      <w:pPr>
+        <w:spacing w:after="120" w:line="288"/>
+        <w:jc w:val="both"/>
+      </w:pPr>
+      <w:r>
+        <w:t xml:space="preserve">Section 4.4 showed that effectiveness factors explain the outcome, but their codes were assigned by the compilers after the battles. Can they be replaced by features known before the battle? Protocol acd9792 was fixed before the calculation. Side features (attacker minus defender, last value within 5 years before the year of the battle): ln GDP per capita (Maddison), electoral democracy (V-Dem), ln energy consumption per soldier (CoW NMC — a measure of mechanisation), combat experience in the same war. Sample: n = 354 battles of 1900–1973 where both sides are matched to countries; the measure and cross-validation are as in Section 4.4.</w:t>
+      </w:r>
+    </w:p>
+    <w:tbl>
+      <w:tblPr>
+        <w:tblW w:type="dxa" w:w="9638"/>
+        <w:tblBorders>
+          <w:top w:val="single" w:color="auto" w:sz="4"/>
+          <w:left w:val="single" w:color="auto" w:sz="4"/>
+          <w:bottom w:val="single" w:color="auto" w:sz="4"/>
+          <w:right w:val="single" w:color="auto" w:sz="4"/>
+          <w:insideH w:val="single" w:color="auto" w:sz="4"/>
+          <w:insideV w:val="single" w:color="auto" w:sz="4"/>
+        </w:tblBorders>
+      </w:tblPr>
+      <w:tblGrid>
+        <w:gridCol w:w="963"/>
+        <w:gridCol w:w="4433"/>
+        <w:gridCol w:w="1927"/>
+        <w:gridCol w:w="2315"/>
+      </w:tblGrid>
+      <w:tr>
+        <w:trPr>
+          <w:tblHeader/>
+        </w:trPr>
+        <w:tc>
+          <w:tcPr>
+            <w:tcW w:type="dxa" w:w="963"/>
+            <w:tcBorders>
+              <w:top w:val="single" w:color="C9CEC5" w:sz="4"/>
+              <w:left w:val="single" w:color="C9CEC5" w:sz="4"/>
+              <w:bottom w:val="single" w:color="C9CEC5" w:sz="4"/>
+              <w:right w:val="single" w:color="C9CEC5" w:sz="4"/>
+            </w:tcBorders>
+            <w:shd w:fill="1F2A24" w:color="auto" w:val="clear"/>
+            <w:tcMar>
+              <w:top w:type="dxa" w:w="60"/>
+              <w:left w:type="dxa" w:w="90"/>
+              <w:bottom w:type="dxa" w:w="60"/>
+              <w:right w:type="dxa" w:w="90"/>
+            </w:tcMar>
+            <w:vAlign w:val="top"/>
+          </w:tcPr>
+          <w:p>
+            <w:pPr>
+              <w:spacing w:after="20"/>
+              <w:jc w:val="left"/>
+            </w:pPr>
+            <w:r>
+              <w:rPr>
+                <w:b/>
+                <w:bCs/>
+                <w:color w:val="FFFFFF"/>
+                <w:sz w:val="16"/>
+                <w:szCs w:val="16"/>
+              </w:rPr>
+              <w:t xml:space="preserve">Model</w:t>
+            </w:r>
+          </w:p>
+        </w:tc>
+        <w:tc>
+          <w:tcPr>
+            <w:tcW w:type="dxa" w:w="4433"/>
+            <w:tcBorders>
+              <w:top w:val="single" w:color="C9CEC5" w:sz="4"/>
+              <w:left w:val="single" w:color="C9CEC5" w:sz="4"/>
+              <w:bottom w:val="single" w:color="C9CEC5" w:sz="4"/>
+              <w:right w:val="single" w:color="C9CEC5" w:sz="4"/>
+            </w:tcBorders>
+            <w:shd w:fill="1F2A24" w:color="auto" w:val="clear"/>
+            <w:tcMar>
+              <w:top w:type="dxa" w:w="60"/>
+              <w:left w:type="dxa" w:w="90"/>
+              <w:bottom w:type="dxa" w:w="60"/>
+              <w:right w:type="dxa" w:w="90"/>
+            </w:tcMar>
+            <w:vAlign w:val="top"/>
+          </w:tcPr>
+          <w:p>
+            <w:pPr>
+              <w:spacing w:after="20"/>
+              <w:jc w:val="left"/>
+            </w:pPr>
+            <w:r>
+              <w:rPr>
+                <w:b/>
+                <w:bCs/>
+                <w:color w:val="FFFFFF"/>
+                <w:sz w:val="16"/>
+                <w:szCs w:val="16"/>
+              </w:rPr>
+              <w:t xml:space="preserve">Features</w:t>
+            </w:r>
+          </w:p>
+        </w:tc>
+        <w:tc>
+          <w:tcPr>
+            <w:tcW w:type="dxa" w:w="1927"/>
+            <w:tcBorders>
+              <w:top w:val="single" w:color="C9CEC5" w:sz="4"/>
+              <w:left w:val="single" w:color="C9CEC5" w:sz="4"/>
+              <w:bottom w:val="single" w:color="C9CEC5" w:sz="4"/>
+              <w:right w:val="single" w:color="C9CEC5" w:sz="4"/>
+            </w:tcBorders>
+            <w:shd w:fill="1F2A24" w:color="auto" w:val="clear"/>
+            <w:tcMar>
+              <w:top w:type="dxa" w:w="60"/>
+              <w:left w:type="dxa" w:w="90"/>
+              <w:bottom w:type="dxa" w:w="60"/>
+              <w:right w:type="dxa" w:w="90"/>
+            </w:tcMar>
+            <w:vAlign w:val="top"/>
+          </w:tcPr>
+          <w:p>
+            <w:pPr>
+              <w:spacing w:after="20"/>
+              <w:jc w:val="left"/>
+            </w:pPr>
+            <w:r>
+              <w:rPr>
+                <w:b/>
+                <w:bCs/>
+                <w:color w:val="FFFFFF"/>
+                <w:sz w:val="16"/>
+                <w:szCs w:val="16"/>
+              </w:rPr>
+              <w:t xml:space="preserve">Out-of-sample score</w:t>
+            </w:r>
+          </w:p>
+        </w:tc>
+        <w:tc>
+          <w:tcPr>
+            <w:tcW w:type="dxa" w:w="2315"/>
+            <w:tcBorders>
+              <w:top w:val="single" w:color="C9CEC5" w:sz="4"/>
+              <w:left w:val="single" w:color="C9CEC5" w:sz="4"/>
+              <w:bottom w:val="single" w:color="C9CEC5" w:sz="4"/>
+              <w:right w:val="single" w:color="C9CEC5" w:sz="4"/>
+            </w:tcBorders>
+            <w:shd w:fill="1F2A24" w:color="auto" w:val="clear"/>
+            <w:tcMar>
+              <w:top w:type="dxa" w:w="60"/>
+              <w:left w:type="dxa" w:w="90"/>
+              <w:bottom w:type="dxa" w:w="60"/>
+              <w:right w:type="dxa" w:w="90"/>
+            </w:tcMar>
+            <w:vAlign w:val="top"/>
+          </w:tcPr>
+          <w:p>
+            <w:pPr>
+              <w:spacing w:after="20"/>
+              <w:jc w:val="left"/>
+            </w:pPr>
+            <w:r>
+              <w:rPr>
+                <w:b/>
+                <w:bCs/>
+                <w:color w:val="FFFFFF"/>
+                <w:sz w:val="16"/>
+                <w:szCs w:val="16"/>
+              </w:rPr>
+              <w:t xml:space="preserve">Gain over the previous model</w:t>
+            </w:r>
+          </w:p>
+        </w:tc>
+      </w:tr>
+      <w:tr>
+        <w:trPr>
+          <w:cantSplit/>
+        </w:trPr>
+        <w:tc>
+          <w:tcPr>
+            <w:tcW w:type="dxa" w:w="963"/>
+            <w:tcBorders>
+              <w:top w:val="single" w:color="C9CEC5" w:sz="4"/>
+              <w:left w:val="single" w:color="C9CEC5" w:sz="4"/>
+              <w:bottom w:val="single" w:color="C9CEC5" w:sz="4"/>
+              <w:right w:val="single" w:color="C9CEC5" w:sz="4"/>
+            </w:tcBorders>
+            <w:tcMar>
+              <w:top w:type="dxa" w:w="60"/>
+              <w:left w:type="dxa" w:w="90"/>
+              <w:bottom w:type="dxa" w:w="60"/>
+              <w:right w:type="dxa" w:w="90"/>
+            </w:tcMar>
+            <w:vAlign w:val="top"/>
+          </w:tcPr>
+          <w:p>
+            <w:pPr>
+              <w:spacing w:after="20"/>
+              <w:jc w:val="left"/>
+            </w:pPr>
+            <w:r>
+              <w:rPr>
+                <w:b w:val="false"/>
+                <w:bCs w:val="false"/>
+                <w:color w:val="1A1F1B"/>
+                <w:sz w:val="16"/>
+                <w:szCs w:val="16"/>
+              </w:rPr>
+              <w:t xml:space="preserve">E0</w:t>
+            </w:r>
+          </w:p>
+        </w:tc>
+        <w:tc>
+          <w:tcPr>
+            <w:tcW w:type="dxa" w:w="4433"/>
+            <w:tcBorders>
+              <w:top w:val="single" w:color="C9CEC5" w:sz="4"/>
+              <w:left w:val="single" w:color="C9CEC5" w:sz="4"/>
+              <w:bottom w:val="single" w:color="C9CEC5" w:sz="4"/>
+              <w:right w:val="single" w:color="C9CEC5" w:sz="4"/>
+            </w:tcBorders>
+            <w:tcMar>
+              <w:top w:type="dxa" w:w="60"/>
+              <w:left w:type="dxa" w:w="90"/>
+              <w:bottom w:type="dxa" w:w="60"/>
+              <w:right w:type="dxa" w:w="90"/>
+            </w:tcMar>
+            <w:vAlign w:val="top"/>
+          </w:tcPr>
+          <w:p>
+            <w:pPr>
+              <w:spacing w:after="20"/>
+              <w:jc w:val="left"/>
+            </w:pPr>
+            <w:r>
+              <w:rPr>
+                <w:b w:val="false"/>
+                <w:bCs w:val="false"/>
+                <w:color w:val="1A1F1B"/>
+                <w:sz w:val="16"/>
+                <w:szCs w:val="16"/>
+              </w:rPr>
+              <w:t xml:space="preserve">type of defence</w:t>
+            </w:r>
+          </w:p>
+        </w:tc>
+        <w:tc>
+          <w:tcPr>
+            <w:tcW w:type="dxa" w:w="1927"/>
+            <w:tcBorders>
+              <w:top w:val="single" w:color="C9CEC5" w:sz="4"/>
+              <w:left w:val="single" w:color="C9CEC5" w:sz="4"/>
+              <w:bottom w:val="single" w:color="C9CEC5" w:sz="4"/>
+              <w:right w:val="single" w:color="C9CEC5" w:sz="4"/>
+            </w:tcBorders>
+            <w:tcMar>
+              <w:top w:type="dxa" w:w="60"/>
+              <w:left w:type="dxa" w:w="90"/>
+              <w:bottom w:type="dxa" w:w="60"/>
+              <w:right w:type="dxa" w:w="90"/>
+            </w:tcMar>
+            <w:vAlign w:val="top"/>
+          </w:tcPr>
+          <w:p>
+            <w:pPr>
+              <w:spacing w:after="20"/>
+              <w:jc w:val="left"/>
+            </w:pPr>
+            <w:r>
+              <w:rPr>
+                <w:b w:val="false"/>
+                <w:bCs w:val="false"/>
+                <w:color w:val="1A1F1B"/>
+                <w:sz w:val="16"/>
+                <w:szCs w:val="16"/>
+              </w:rPr>
+              <w:t xml:space="preserve">−0.687</w:t>
+            </w:r>
+          </w:p>
+        </w:tc>
+        <w:tc>
+          <w:tcPr>
+            <w:tcW w:type="dxa" w:w="2315"/>
+            <w:tcBorders>
+              <w:top w:val="single" w:color="C9CEC5" w:sz="4"/>
+              <w:left w:val="single" w:color="C9CEC5" w:sz="4"/>
+              <w:bottom w:val="single" w:color="C9CEC5" w:sz="4"/>
+              <w:right w:val="single" w:color="C9CEC5" w:sz="4"/>
+            </w:tcBorders>
+            <w:tcMar>
+              <w:top w:type="dxa" w:w="60"/>
+              <w:left w:type="dxa" w:w="90"/>
+              <w:bottom w:type="dxa" w:w="60"/>
+              <w:right w:type="dxa" w:w="90"/>
+            </w:tcMar>
+            <w:vAlign w:val="top"/>
+          </w:tcPr>
+          <w:p>
+            <w:pPr>
+              <w:spacing w:after="20"/>
+              <w:jc w:val="left"/>
+            </w:pPr>
+            <w:r>
+              <w:rPr>
+                <w:b w:val="false"/>
+                <w:bCs w:val="false"/>
+                <w:color w:val="1A1F1B"/>
+                <w:sz w:val="16"/>
+                <w:szCs w:val="16"/>
+              </w:rPr>
+              <w:t xml:space="preserve">—</w:t>
+            </w:r>
+          </w:p>
+        </w:tc>
+      </w:tr>
+      <w:tr>
+        <w:trPr>
+          <w:cantSplit/>
+        </w:trPr>
+        <w:tc>
+          <w:tcPr>
+            <w:tcW w:type="dxa" w:w="963"/>
+            <w:tcBorders>
+              <w:top w:val="single" w:color="C9CEC5" w:sz="4"/>
+              <w:left w:val="single" w:color="C9CEC5" w:sz="4"/>
+              <w:bottom w:val="single" w:color="C9CEC5" w:sz="4"/>
+              <w:right w:val="single" w:color="C9CEC5" w:sz="4"/>
+            </w:tcBorders>
+            <w:shd w:fill="F1F3EF" w:color="auto" w:val="clear"/>
+            <w:tcMar>
+              <w:top w:type="dxa" w:w="60"/>
+              <w:left w:type="dxa" w:w="90"/>
+              <w:bottom w:type="dxa" w:w="60"/>
+              <w:right w:type="dxa" w:w="90"/>
+            </w:tcMar>
+            <w:vAlign w:val="top"/>
+          </w:tcPr>
+          <w:p>
+            <w:pPr>
+              <w:spacing w:after="20"/>
+              <w:jc w:val="left"/>
+            </w:pPr>
+            <w:r>
+              <w:rPr>
+                <w:b w:val="false"/>
+                <w:bCs w:val="false"/>
+                <w:color w:val="1A1F1B"/>
+                <w:sz w:val="16"/>
+                <w:szCs w:val="16"/>
+              </w:rPr>
+              <w:t xml:space="preserve">E1</w:t>
+            </w:r>
+          </w:p>
+        </w:tc>
+        <w:tc>
+          <w:tcPr>
+            <w:tcW w:type="dxa" w:w="4433"/>
+            <w:tcBorders>
+              <w:top w:val="single" w:color="C9CEC5" w:sz="4"/>
+              <w:left w:val="single" w:color="C9CEC5" w:sz="4"/>
+              <w:bottom w:val="single" w:color="C9CEC5" w:sz="4"/>
+              <w:right w:val="single" w:color="C9CEC5" w:sz="4"/>
+            </w:tcBorders>
+            <w:shd w:fill="F1F3EF" w:color="auto" w:val="clear"/>
+            <w:tcMar>
+              <w:top w:type="dxa" w:w="60"/>
+              <w:left w:type="dxa" w:w="90"/>
+              <w:bottom w:type="dxa" w:w="60"/>
+              <w:right w:type="dxa" w:w="90"/>
+            </w:tcMar>
+            <w:vAlign w:val="top"/>
+          </w:tcPr>
+          <w:p>
+            <w:pPr>
+              <w:spacing w:after="20"/>
+              <w:jc w:val="left"/>
+            </w:pPr>
+            <w:r>
+              <w:rPr>
+                <w:b w:val="false"/>
+                <w:bCs w:val="false"/>
+                <w:color w:val="1A1F1B"/>
+                <w:sz w:val="16"/>
+                <w:szCs w:val="16"/>
+              </w:rPr>
+              <w:t xml:space="preserve">+ numbers</w:t>
+            </w:r>
+          </w:p>
+        </w:tc>
+        <w:tc>
+          <w:tcPr>
+            <w:tcW w:type="dxa" w:w="1927"/>
+            <w:tcBorders>
+              <w:top w:val="single" w:color="C9CEC5" w:sz="4"/>
+              <w:left w:val="single" w:color="C9CEC5" w:sz="4"/>
+              <w:bottom w:val="single" w:color="C9CEC5" w:sz="4"/>
+              <w:right w:val="single" w:color="C9CEC5" w:sz="4"/>
+            </w:tcBorders>
+            <w:shd w:fill="F1F3EF" w:color="auto" w:val="clear"/>
+            <w:tcMar>
+              <w:top w:type="dxa" w:w="60"/>
+              <w:left w:type="dxa" w:w="90"/>
+              <w:bottom w:type="dxa" w:w="60"/>
+              <w:right w:type="dxa" w:w="90"/>
+            </w:tcMar>
+            <w:vAlign w:val="top"/>
+          </w:tcPr>
+          <w:p>
+            <w:pPr>
+              <w:spacing w:after="20"/>
+              <w:jc w:val="left"/>
+            </w:pPr>
+            <w:r>
+              <w:rPr>
+                <w:b w:val="false"/>
+                <w:bCs w:val="false"/>
+                <w:color w:val="1A1F1B"/>
+                <w:sz w:val="16"/>
+                <w:szCs w:val="16"/>
+              </w:rPr>
+              <w:t xml:space="preserve">−0.679</w:t>
+            </w:r>
+          </w:p>
+        </w:tc>
+        <w:tc>
+          <w:tcPr>
+            <w:tcW w:type="dxa" w:w="2315"/>
+            <w:tcBorders>
+              <w:top w:val="single" w:color="C9CEC5" w:sz="4"/>
+              <w:left w:val="single" w:color="C9CEC5" w:sz="4"/>
+              <w:bottom w:val="single" w:color="C9CEC5" w:sz="4"/>
+              <w:right w:val="single" w:color="C9CEC5" w:sz="4"/>
+            </w:tcBorders>
+            <w:shd w:fill="F1F3EF" w:color="auto" w:val="clear"/>
+            <w:tcMar>
+              <w:top w:type="dxa" w:w="60"/>
+              <w:left w:type="dxa" w:w="90"/>
+              <w:bottom w:type="dxa" w:w="60"/>
+              <w:right w:type="dxa" w:w="90"/>
+            </w:tcMar>
+            <w:vAlign w:val="top"/>
+          </w:tcPr>
+          <w:p>
+            <w:pPr>
+              <w:spacing w:after="20"/>
+              <w:jc w:val="left"/>
+            </w:pPr>
+            <w:r>
+              <w:rPr>
+                <w:b w:val="false"/>
+                <w:bCs w:val="false"/>
+                <w:color w:val="1A1F1B"/>
+                <w:sz w:val="16"/>
+                <w:szCs w:val="16"/>
+              </w:rPr>
+              <w:t xml:space="preserve">+0.008 [+0.004; +0.012]</w:t>
+            </w:r>
+          </w:p>
+        </w:tc>
+      </w:tr>
+      <w:tr>
+        <w:trPr>
+          <w:cantSplit/>
+        </w:trPr>
+        <w:tc>
+          <w:tcPr>
+            <w:tcW w:type="dxa" w:w="963"/>
+            <w:tcBorders>
+              <w:top w:val="single" w:color="C9CEC5" w:sz="4"/>
+              <w:left w:val="single" w:color="C9CEC5" w:sz="4"/>
+              <w:bottom w:val="single" w:color="C9CEC5" w:sz="4"/>
+              <w:right w:val="single" w:color="C9CEC5" w:sz="4"/>
+            </w:tcBorders>
+            <w:tcMar>
+              <w:top w:type="dxa" w:w="60"/>
+              <w:left w:type="dxa" w:w="90"/>
+              <w:bottom w:type="dxa" w:w="60"/>
+              <w:right w:type="dxa" w:w="90"/>
+            </w:tcMar>
+            <w:vAlign w:val="top"/>
+          </w:tcPr>
+          <w:p>
+            <w:pPr>
+              <w:spacing w:after="20"/>
+              <w:jc w:val="left"/>
+            </w:pPr>
+            <w:r>
+              <w:rPr>
+                <w:b w:val="false"/>
+                <w:bCs w:val="false"/>
+                <w:color w:val="1A1F1B"/>
+                <w:sz w:val="16"/>
+                <w:szCs w:val="16"/>
+              </w:rPr>
+              <w:t xml:space="preserve">E2</w:t>
+            </w:r>
+          </w:p>
+        </w:tc>
+        <w:tc>
+          <w:tcPr>
+            <w:tcW w:type="dxa" w:w="4433"/>
+            <w:tcBorders>
+              <w:top w:val="single" w:color="C9CEC5" w:sz="4"/>
+              <w:left w:val="single" w:color="C9CEC5" w:sz="4"/>
+              <w:bottom w:val="single" w:color="C9CEC5" w:sz="4"/>
+              <w:right w:val="single" w:color="C9CEC5" w:sz="4"/>
+            </w:tcBorders>
+            <w:tcMar>
+              <w:top w:type="dxa" w:w="60"/>
+              <w:left w:type="dxa" w:w="90"/>
+              <w:bottom w:type="dxa" w:w="60"/>
+              <w:right w:type="dxa" w:w="90"/>
+            </w:tcMar>
+            <w:vAlign w:val="top"/>
+          </w:tcPr>
+          <w:p>
+            <w:pPr>
+              <w:spacing w:after="20"/>
+              <w:jc w:val="left"/>
+            </w:pPr>
+            <w:r>
+              <w:rPr>
+                <w:b w:val="false"/>
+                <w:bCs w:val="false"/>
+                <w:color w:val="1A1F1B"/>
+                <w:sz w:val="16"/>
+                <w:szCs w:val="16"/>
+              </w:rPr>
+              <w:t xml:space="preserve">+ GDP per capita, democracy, mechanisation</w:t>
+            </w:r>
+          </w:p>
+        </w:tc>
+        <w:tc>
+          <w:tcPr>
+            <w:tcW w:type="dxa" w:w="1927"/>
+            <w:tcBorders>
+              <w:top w:val="single" w:color="C9CEC5" w:sz="4"/>
+              <w:left w:val="single" w:color="C9CEC5" w:sz="4"/>
+              <w:bottom w:val="single" w:color="C9CEC5" w:sz="4"/>
+              <w:right w:val="single" w:color="C9CEC5" w:sz="4"/>
+            </w:tcBorders>
+            <w:tcMar>
+              <w:top w:type="dxa" w:w="60"/>
+              <w:left w:type="dxa" w:w="90"/>
+              <w:bottom w:type="dxa" w:w="60"/>
+              <w:right w:type="dxa" w:w="90"/>
+            </w:tcMar>
+            <w:vAlign w:val="top"/>
+          </w:tcPr>
+          <w:p>
+            <w:pPr>
+              <w:spacing w:after="20"/>
+              <w:jc w:val="left"/>
+            </w:pPr>
+            <w:r>
+              <w:rPr>
+                <w:b w:val="false"/>
+                <w:bCs w:val="false"/>
+                <w:color w:val="1A1F1B"/>
+                <w:sz w:val="16"/>
+                <w:szCs w:val="16"/>
+              </w:rPr>
+              <w:t xml:space="preserve">−0.657</w:t>
+            </w:r>
+          </w:p>
+        </w:tc>
+        <w:tc>
+          <w:tcPr>
+            <w:tcW w:type="dxa" w:w="2315"/>
+            <w:tcBorders>
+              <w:top w:val="single" w:color="C9CEC5" w:sz="4"/>
+              <w:left w:val="single" w:color="C9CEC5" w:sz="4"/>
+              <w:bottom w:val="single" w:color="C9CEC5" w:sz="4"/>
+              <w:right w:val="single" w:color="C9CEC5" w:sz="4"/>
+            </w:tcBorders>
+            <w:tcMar>
+              <w:top w:type="dxa" w:w="60"/>
+              <w:left w:type="dxa" w:w="90"/>
+              <w:bottom w:type="dxa" w:w="60"/>
+              <w:right w:type="dxa" w:w="90"/>
+            </w:tcMar>
+            <w:vAlign w:val="top"/>
+          </w:tcPr>
+          <w:p>
+            <w:pPr>
+              <w:spacing w:after="20"/>
+              <w:jc w:val="left"/>
+            </w:pPr>
+            <w:r>
+              <w:rPr>
+                <w:b w:val="false"/>
+                <w:bCs w:val="false"/>
+                <w:color w:val="1A1F1B"/>
+                <w:sz w:val="16"/>
+                <w:szCs w:val="16"/>
+              </w:rPr>
+              <w:t xml:space="preserve">+0.022 [+0.015; +0.027]</w:t>
+            </w:r>
+          </w:p>
+        </w:tc>
+      </w:tr>
+      <w:tr>
+        <w:trPr>
+          <w:cantSplit/>
+        </w:trPr>
+        <w:tc>
+          <w:tcPr>
+            <w:tcW w:type="dxa" w:w="963"/>
+            <w:tcBorders>
+              <w:top w:val="single" w:color="C9CEC5" w:sz="4"/>
+              <w:left w:val="single" w:color="C9CEC5" w:sz="4"/>
+              <w:bottom w:val="single" w:color="C9CEC5" w:sz="4"/>
+              <w:right w:val="single" w:color="C9CEC5" w:sz="4"/>
+            </w:tcBorders>
+            <w:shd w:fill="F1F3EF" w:color="auto" w:val="clear"/>
+            <w:tcMar>
+              <w:top w:type="dxa" w:w="60"/>
+              <w:left w:type="dxa" w:w="90"/>
+              <w:bottom w:type="dxa" w:w="60"/>
+              <w:right w:type="dxa" w:w="90"/>
+            </w:tcMar>
+            <w:vAlign w:val="top"/>
+          </w:tcPr>
+          <w:p>
+            <w:pPr>
+              <w:spacing w:after="20"/>
+              <w:jc w:val="left"/>
+            </w:pPr>
+            <w:r>
+              <w:rPr>
+                <w:b w:val="false"/>
+                <w:bCs w:val="false"/>
+                <w:color w:val="1A1F1B"/>
+                <w:sz w:val="16"/>
+                <w:szCs w:val="16"/>
+              </w:rPr>
+              <w:t xml:space="preserve">E3</w:t>
+            </w:r>
+          </w:p>
+        </w:tc>
+        <w:tc>
+          <w:tcPr>
+            <w:tcW w:type="dxa" w:w="4433"/>
+            <w:tcBorders>
+              <w:top w:val="single" w:color="C9CEC5" w:sz="4"/>
+              <w:left w:val="single" w:color="C9CEC5" w:sz="4"/>
+              <w:bottom w:val="single" w:color="C9CEC5" w:sz="4"/>
+              <w:right w:val="single" w:color="C9CEC5" w:sz="4"/>
+            </w:tcBorders>
+            <w:shd w:fill="F1F3EF" w:color="auto" w:val="clear"/>
+            <w:tcMar>
+              <w:top w:type="dxa" w:w="60"/>
+              <w:left w:type="dxa" w:w="90"/>
+              <w:bottom w:type="dxa" w:w="60"/>
+              <w:right w:type="dxa" w:w="90"/>
+            </w:tcMar>
+            <w:vAlign w:val="top"/>
+          </w:tcPr>
+          <w:p>
+            <w:pPr>
+              <w:spacing w:after="20"/>
+              <w:jc w:val="left"/>
+            </w:pPr>
+            <w:r>
+              <w:rPr>
+                <w:b w:val="false"/>
+                <w:bCs w:val="false"/>
+                <w:color w:val="1A1F1B"/>
+                <w:sz w:val="16"/>
+                <w:szCs w:val="16"/>
+              </w:rPr>
+              <w:t xml:space="preserve">+ combat experience</w:t>
+            </w:r>
+          </w:p>
+        </w:tc>
+        <w:tc>
+          <w:tcPr>
+            <w:tcW w:type="dxa" w:w="1927"/>
+            <w:tcBorders>
+              <w:top w:val="single" w:color="C9CEC5" w:sz="4"/>
+              <w:left w:val="single" w:color="C9CEC5" w:sz="4"/>
+              <w:bottom w:val="single" w:color="C9CEC5" w:sz="4"/>
+              <w:right w:val="single" w:color="C9CEC5" w:sz="4"/>
+            </w:tcBorders>
+            <w:shd w:fill="F1F3EF" w:color="auto" w:val="clear"/>
+            <w:tcMar>
+              <w:top w:type="dxa" w:w="60"/>
+              <w:left w:type="dxa" w:w="90"/>
+              <w:bottom w:type="dxa" w:w="60"/>
+              <w:right w:type="dxa" w:w="90"/>
+            </w:tcMar>
+            <w:vAlign w:val="top"/>
+          </w:tcPr>
+          <w:p>
+            <w:pPr>
+              <w:spacing w:after="20"/>
+              <w:jc w:val="left"/>
+            </w:pPr>
+            <w:r>
+              <w:rPr>
+                <w:b w:val="false"/>
+                <w:bCs w:val="false"/>
+                <w:color w:val="1A1F1B"/>
+                <w:sz w:val="16"/>
+                <w:szCs w:val="16"/>
+              </w:rPr>
+              <w:t xml:space="preserve">−0.656</w:t>
+            </w:r>
+          </w:p>
+        </w:tc>
+        <w:tc>
+          <w:tcPr>
+            <w:tcW w:type="dxa" w:w="2315"/>
+            <w:tcBorders>
+              <w:top w:val="single" w:color="C9CEC5" w:sz="4"/>
+              <w:left w:val="single" w:color="C9CEC5" w:sz="4"/>
+              <w:bottom w:val="single" w:color="C9CEC5" w:sz="4"/>
+              <w:right w:val="single" w:color="C9CEC5" w:sz="4"/>
+            </w:tcBorders>
+            <w:shd w:fill="F1F3EF" w:color="auto" w:val="clear"/>
+            <w:tcMar>
+              <w:top w:type="dxa" w:w="60"/>
+              <w:left w:type="dxa" w:w="90"/>
+              <w:bottom w:type="dxa" w:w="60"/>
+              <w:right w:type="dxa" w:w="90"/>
+            </w:tcMar>
+            <w:vAlign w:val="top"/>
+          </w:tcPr>
+          <w:p>
+            <w:pPr>
+              <w:spacing w:after="20"/>
+              <w:jc w:val="left"/>
+            </w:pPr>
+            <w:r>
+              <w:rPr>
+                <w:b w:val="false"/>
+                <w:bCs w:val="false"/>
+                <w:color w:val="1A1F1B"/>
+                <w:sz w:val="16"/>
+                <w:szCs w:val="16"/>
+              </w:rPr>
+              <w:t xml:space="preserve">+0.001 [−0.004; +0.004]</w:t>
+            </w:r>
+          </w:p>
+        </w:tc>
+      </w:tr>
+    </w:tbl>
+    <w:p>
+      <w:pPr>
+        <w:spacing w:after="120"/>
+      </w:pPr>
+    </w:p>
+    <w:p>
+      <w:pPr>
+        <w:spacing w:after="120" w:line="288"/>
+        <w:jc w:val="both"/>
+      </w:pPr>
+      <w:r>
+        <w:t xml:space="preserve">Rule 1 (country features add at least 0.02 on top of numbers) is </w:t>
+      </w:r>
+      <w:r>
+        <w:rPr>
+          <w:b/>
+          <w:bCs/>
+        </w:rPr>
+        <w:t xml:space="preserve">met</w:t>
+      </w:r>
+      <w:r>
+        <w:t xml:space="preserve">: +0.022. This is the project’s first positive predictive finding on top of numbers, but it is roughly 8 times smaller than the upper bound from the compilers’ factors (+0.180). Rule 2 (combat experience beyond the country) is not met. The out-of-sample share of variance explained in the loss ratio rose from 0.01 (numbers) to 0.20 (country features) — the country explains a fifth of the spread, as in the literature (Biddle, Reiter and Stam): losses are determined by how forces fight, not by how many there are.</w:t>
+      </w:r>
+    </w:p>
+    <w:p>
+      <w:pPr>
+        <w:spacing w:after="120" w:line="288"/>
+        <w:jc w:val="both"/>
+      </w:pPr>
+      <w:r>
+        <w:rPr>
+          <w:b/>
+          <w:bCs/>
+        </w:rPr>
+        <w:t xml:space="preserve">Independent check on UCDP GED v25.1.</w:t>
+      </w:r>
+      <w:r>
+        <w:t xml:space="preserve"> The loss-exchange model (three features, no intercept, trained on CDB90 only, n = 354) was applied to interstate dyad-years of 1989–2024 (losses on both sides, at least 25 deaths): 24 dyad-years in 9 dyads, 12 of them India — Pakistan. The protocol with its rule (rank correlation of at least 0.30 and the lower bound of a dyad bootstrap above zero) was committed before the calculation. Result: Spearman +0.248 [−0.596; +0.627], the sign of the exchange guessed in 50% of cases; on the modern wars of 2018–2025 the models trained on CDB90 gave AUC 0.50 (E1) and 0.38 (E2) against “superiority sufficed”. </w:t>
+      </w:r>
+      <w:r>
+        <w:rPr>
+          <w:b/>
+          <w:bCs/>
+        </w:rPr>
+        <w:t xml:space="preserve">The transfer is not confirmed.</w:t>
+      </w:r>
+    </w:p>
+    <w:p>
+      <w:pPr>
+        <w:pBdr>
+          <w:left w:val="single" w:color="9F2F27" w:sz="18" w:space="8"/>
+        </w:pBdr>
+        <w:shd w:fill="F4EEE9" w:color="auto" w:val="clear"/>
+        <w:spacing w:after="160" w:before="120" w:line="276"/>
+        <w:ind w:left="200" w:right="120"/>
+      </w:pPr>
+      <w:r>
+        <w:rPr>
+          <w:b/>
+          <w:bCs/>
+          <w:color w:val="9F2F27"/>
+        </w:rPr>
+        <w:t xml:space="preserve">Conclusion. </w:t>
+      </w:r>
+      <w:r>
+        <w:t xml:space="preserve">This is not a refutation: 24 cases in 9 dependent dyads give too little power. But there is no confirmation either. Therefore country features (GDP per capita, democracy, mechanisation) are not entered into the index: they capture part of effectiveness in the 1900–1973 era and have not yet shown skill on modern wars. For the effectiveness of modern armies, expert assessments are still needed (Delphi panel, modules M5–M6).</w:t>
+      </w:r>
+    </w:p>
+    <w:p>
+      <w:pPr>
         <w:pStyle w:val="Heading1"/>
         <w:pageBreakBefore/>
       </w:pPr>
-      <w:bookmarkStart w:name="_Toc206" w:id="206"/>
+      <w:bookmarkStart w:name="_Toc207" w:id="207"/>
       <w:r>
         <w:t xml:space="preserve">5. Analysis of common claims</w:t>
       </w:r>
-      <w:bookmarkEnd w:id="206"/>
+      <w:bookmarkEnd w:id="207"/>
     </w:p>
     <w:p>
       <w:pPr>
@@ -12432,21 +13298,21 @@
         <w:pStyle w:val="Heading1"/>
         <w:pageBreakBefore/>
       </w:pPr>
-      <w:bookmarkStart w:name="_Toc207" w:id="207"/>
+      <w:bookmarkStart w:name="_Toc208" w:id="208"/>
       <w:r>
         <w:t xml:space="preserve">6. Scientific novelty</w:t>
       </w:r>
-      <w:bookmarkEnd w:id="207"/>
+      <w:bookmarkEnd w:id="208"/>
     </w:p>
     <w:p>
       <w:pPr>
         <w:pStyle w:val="Heading2"/>
       </w:pPr>
-      <w:bookmarkStart w:name="_Toc208" w:id="208"/>
+      <w:bookmarkStart w:name="_Toc209" w:id="209"/>
       <w:r>
         <w:t xml:space="preserve">6.1. Not new</w:t>
       </w:r>
-      <w:bookmarkEnd w:id="208"/>
+      <w:bookmarkEnd w:id="209"/>
     </w:p>
     <w:p>
       <w:pPr>
@@ -12504,11 +13370,11 @@
       <w:pPr>
         <w:pStyle w:val="Heading2"/>
       </w:pPr>
-      <w:bookmarkStart w:name="_Toc209" w:id="209"/>
+      <w:bookmarkStart w:name="_Toc210" w:id="210"/>
       <w:r>
         <w:t xml:space="preserve">6.2. Possibly new (priority must be confirmed by a literature review)</w:t>
       </w:r>
-      <w:bookmarkEnd w:id="209"/>
+      <w:bookmarkEnd w:id="210"/>
     </w:p>
     <w:p>
       <w:pPr>
@@ -12651,11 +13517,11 @@
       <w:pPr>
         <w:pStyle w:val="Heading2"/>
       </w:pPr>
-      <w:bookmarkStart w:name="_Toc210" w:id="210"/>
+      <w:bookmarkStart w:name="_Toc211" w:id="211"/>
       <w:r>
         <w:t xml:space="preserve">6.3. Where the gap is</w:t>
       </w:r>
-      <w:bookmarkEnd w:id="210"/>
+      <w:bookmarkEnd w:id="211"/>
     </w:p>
     <w:p>
       <w:pPr>
@@ -12681,11 +13547,11 @@
         <w:pStyle w:val="Heading1"/>
         <w:pageBreakBefore/>
       </w:pPr>
-      <w:bookmarkStart w:name="_Toc211" w:id="211"/>
+      <w:bookmarkStart w:name="_Toc212" w:id="212"/>
       <w:r>
         <w:t xml:space="preserve">7. Competitor: TENET Intelligence MCI</w:t>
       </w:r>
-      <w:bookmarkEnd w:id="211"/>
+      <w:bookmarkEnd w:id="212"/>
     </w:p>
     <w:p>
       <w:pPr>
@@ -12927,7 +13793,7 @@
                 <w:sz w:val="16"/>
                 <w:szCs w:val="16"/>
               </w:rPr>
-              <w:t xml:space="preserve">40 (pilot)</w:t>
+              <w:t xml:space="preserve">8 (experts), 40 (pilot), 177 (extended set)</w:t>
             </w:r>
           </w:p>
         </w:tc>
@@ -13213,7 +14079,7 @@
                 <w:sz w:val="16"/>
                 <w:szCs w:val="16"/>
               </w:rPr>
-              <w:t xml:space="preserve">formulas, parameters and code are open</w:t>
+              <w:t xml:space="preserve">formulas, parameters and code are open (MLO-core, MIT)</w:t>
             </w:r>
           </w:p>
         </w:tc>
@@ -14500,7 +15366,7 @@
                 <w:sz w:val="16"/>
                 <w:szCs w:val="16"/>
               </w:rPr>
-              <w:t xml:space="preserve">AUC 0.96 out-of-sample</w:t>
+              <w:t xml:space="preserve">AUC 0.962 out of sample; the simple baseline (border, history, last year) gives 0.958</w:t>
             </w:r>
           </w:p>
         </w:tc>
@@ -14570,7 +15436,7 @@
                 <w:sz w:val="16"/>
                 <w:szCs w:val="16"/>
               </w:rPr>
-              <w:t xml:space="preserve">MPI</w:t>
+              <w:t xml:space="preserve">MPI, for honesty of validation</w:t>
             </w:r>
           </w:p>
         </w:tc>
@@ -15465,11 +16331,11 @@
         <w:pStyle w:val="Heading1"/>
         <w:pageBreakBefore/>
       </w:pPr>
-      <w:bookmarkStart w:name="_Toc212" w:id="212"/>
+      <w:bookmarkStart w:name="_Toc213" w:id="213"/>
       <w:r>
         <w:t xml:space="preserve">8. Plan</w:t>
       </w:r>
-      <w:bookmarkEnd w:id="212"/>
+      <w:bookmarkEnd w:id="213"/>
     </w:p>
     <w:p>
       <w:pPr>
@@ -15525,14 +16391,27 @@
     </w:p>
     <w:p>
       <w:pPr>
+        <w:pStyle w:val="ListParagraph"/>
+        <w:numPr>
+          <w:ilvl w:val="0"/>
+          <w:numId w:val="3"/>
+        </w:numPr>
+        <w:spacing w:after="60" w:line="276"/>
+      </w:pPr>
+      <w:r>
+        <w:t xml:space="preserve">Test effectiveness proxies on a base with many comparable clashes between states (for example, ACLED) — a separate protocol before the calculation.</w:t>
+      </w:r>
+    </w:p>
+    <w:p>
+      <w:pPr>
         <w:pStyle w:val="Heading1"/>
         <w:pageBreakBefore/>
       </w:pPr>
-      <w:bookmarkStart w:name="_Toc213" w:id="213"/>
+      <w:bookmarkStart w:name="_Toc214" w:id="214"/>
       <w:r>
         <w:t xml:space="preserve">References</w:t>
       </w:r>
-      <w:bookmarkEnd w:id="213"/>
+      <w:bookmarkEnd w:id="214"/>
     </w:p>
     <w:p>
       <w:pPr>

</xml_diff>

<commit_message>
Публикация прототипа из Flumos1/MLO@770682ce1795f959339a34de8169d6f15c4401b6
</commit_message>
<xml_diff>
--- a/docs/08_Combat_models_and_novelty_EN.docx
+++ b/docs/08_Combat_models_and_novelty_EN.docx
@@ -12693,6 +12693,32 @@
     </w:p>
     <w:p>
       <w:pPr>
+        <w:spacing w:after="120" w:line="288"/>
+        <w:jc w:val="both"/>
+      </w:pPr>
+      <w:r>
+        <w:rPr>
+          <w:b/>
+          <w:bCs/>
+        </w:rPr>
+        <w:t xml:space="preserve">A second independent base — Correlates of War wars (Inter-State War Data v4.0).</w:t>
+      </w:r>
+      <w:r>
+        <w:t xml:space="preserve"> ACLED is available only with a key, so the COW interstate wars with participants’ losses were used: the unit is a war, features are taken for the lead states of the sides, the model is the same (trained on CDB90), and the protocol was fixed before the calculation. The main sample is wars since 1974, after CDB90 ends (17 wars): Spearman +0.520 [−0.014; +0.837], the sign guessed in 59% of cases. The direction matches CDB90 (the richer and more democratic side bears relatively smaller losses), the lower bound of the interval is slightly below zero, and the rule (at least 0.30 and the bound above zero) is </w:t>
+      </w:r>
+      <w:r>
+        <w:rPr>
+          <w:b/>
+          <w:bCs/>
+        </w:rPr>
+        <w:t xml:space="preserve">not met</w:t>
+      </w:r>
+      <w:r>
+        <w:t xml:space="preserve">. Without the four wars with a coalition of four or more states (the Gulf War, Kosovo, Afghanistan, Iraq) the relationship disappears: +0.152 (n = 14). For the wars of 1946–1973, where the era overlaps with CDB90 and there is no independence, Spearman is +0.679. This agrees with the literature: part of the effect is asymmetric wars of rich states against poor ones.</w:t>
+      </w:r>
+    </w:p>
+    <w:p>
+      <w:pPr>
         <w:pBdr>
           <w:left w:val="single" w:color="9F2F27" w:sz="18" w:space="8"/>
         </w:pBdr>
@@ -12709,7 +12735,7 @@
         <w:t xml:space="preserve">Conclusion. </w:t>
       </w:r>
       <w:r>
-        <w:t xml:space="preserve">This is not a refutation: 24 cases in 9 dependent dyads give too little power. But there is no confirmation either. Therefore country features (GDP per capita, democracy, mechanisation) are not entered into the index: they capture part of effectiveness in the 1900–1973 era and have not yet shown skill on modern wars. For the effectiveness of modern armies, expert assessments are still needed (Delphi panel, modules M5–M6).</w:t>
+        <w:t xml:space="preserve">This is not a refutation: 24 cases in 9 dependent dyads give too little power, while on the COW wars the direction matches but the relationship rests on wars with coalitions. Therefore country features (GDP per capita, democracy, mechanisation) are not entered into the index: they capture part of effectiveness in the 1900–1973 era and have not yet shown skill on modern wars. For the effectiveness of modern armies, expert assessments are still needed (Delphi panel, modules M5–M6).</w:t>
       </w:r>
     </w:p>
     <w:p>

</xml_diff>